<commit_message>
Core ERD Development (#325)
</commit_message>
<xml_diff>
--- a/Database/Database Design.docx
+++ b/Database/Database Design.docx
@@ -47,8 +47,13 @@
       <w:pPr>
         <w:spacing w:line="276" w:lineRule="auto"/>
       </w:pPr>
+      <w:proofErr w:type="spellStart"/>
       <w:r>
-        <w:t>KriGo’s vehicle rental service is built on the basis of a number of core business entities which represent the key objects handled by the system. The mentioned core business entities were selected after carrying out requirements analysis, use-case analysis and designing class diagrams. The core business entities represent the concepts of reality that are important for vehicle renting process and contain all the data needed for the effective work of the application.</w:t>
+        <w:t>KriGo’s</w:t>
+      </w:r>
+      <w:proofErr w:type="spellEnd"/>
+      <w:r>
+        <w:t xml:space="preserve"> vehicle rental service is built on the basis of a number of core business entities which represent the key objects handled by the system. The mentioned core business entities were selected after carrying out requirements analysis, use-case analysis and designing class diagrams. The core business entities represent the concepts of reality that are important for vehicle renting process and contain all the data needed for the effective work of the application.</w:t>
       </w:r>
     </w:p>
     <w:p>
@@ -8127,13 +8132,7 @@
         <w:spacing w:line="278" w:lineRule="auto"/>
       </w:pPr>
       <w:r>
-        <w:t>One-to-many (</w:t>
-      </w:r>
-      <w:r>
-        <w:t>1: N</w:t>
-      </w:r>
-      <w:r>
-        <w:t xml:space="preserve">) relationships prevail in the KriGo database, as they adequately describe business processes like customer reservation creation, agency fleet management, and branch employee management. </w:t>
+        <w:t xml:space="preserve">One-to-many (1: N) relationships prevail in the KriGo database, as they adequately describe business processes like customer reservation creation, agency fleet management, and branch employee management. </w:t>
       </w:r>
     </w:p>
     <w:p>
@@ -15613,7 +15612,6 @@
       <w:pPr>
         <w:spacing w:after="0" w:line="278" w:lineRule="auto"/>
         <w:rPr>
-          <w:rFonts w:hint="cs"/>
           <w:rtl/>
           <w:lang w:bidi="ar-DZ"/>
         </w:rPr>
@@ -15621,8 +15619,2768 @@
     </w:p>
     <w:p>
       <w:pPr>
+        <w:spacing w:line="278" w:lineRule="auto"/>
+        <w:rPr>
+          <w:lang w:bidi="ar-DZ"/>
+        </w:rPr>
+      </w:pPr>
+      <w:r>
+        <w:rPr>
+          <w:lang w:bidi="ar-DZ"/>
+        </w:rPr>
+        <w:br w:type="page"/>
+      </w:r>
+    </w:p>
+    <w:p>
+      <w:pPr>
+        <w:pStyle w:val="Heading2"/>
+        <w:rPr>
+          <w:lang w:bidi="ar-DZ"/>
+        </w:rPr>
+      </w:pPr>
+      <w:r>
+        <w:rPr>
+          <w:lang w:bidi="ar-DZ"/>
+        </w:rPr>
+        <w:lastRenderedPageBreak/>
+        <w:t>5. Core Entity-Relationship Diagram (ERD) Development</w:t>
+      </w:r>
+    </w:p>
+    <w:p>
+      <w:pPr>
+        <w:pStyle w:val="Heading3"/>
+        <w:rPr>
+          <w:lang w:bidi="ar-DZ"/>
+        </w:rPr>
+      </w:pPr>
+      <w:r>
+        <w:rPr>
+          <w:lang w:bidi="ar-DZ"/>
+        </w:rPr>
+        <w:t>5.1 Overview</w:t>
+      </w:r>
+    </w:p>
+    <w:p>
+      <w:pPr>
         <w:spacing w:before="240" w:after="0" w:line="278" w:lineRule="auto"/>
-      </w:pPr>
+        <w:rPr>
+          <w:lang w:bidi="ar-DZ"/>
+        </w:rPr>
+      </w:pPr>
+      <w:r>
+        <w:rPr>
+          <w:b/>
+          <w:bCs/>
+          <w:lang w:bidi="ar-DZ"/>
+        </w:rPr>
+        <w:t xml:space="preserve">The Entity Relationship Diagram (ERD) </w:t>
+      </w:r>
+      <w:r>
+        <w:rPr>
+          <w:lang w:bidi="ar-DZ"/>
+        </w:rPr>
+        <w:t>is the conceptual design of the KriGo database design. This diagram represents the entities that have been recognized during the data modeling stage along with their attributes, primary keys, foreign keys and relationship among them. The ERD helps in designing both the logical and physical design of the database through its visualization of data.</w:t>
+      </w:r>
+    </w:p>
+    <w:p>
+      <w:pPr>
+        <w:spacing w:before="240" w:after="0" w:line="278" w:lineRule="auto"/>
+        <w:rPr>
+          <w:lang w:bidi="ar-DZ"/>
+        </w:rPr>
+      </w:pPr>
+      <w:r>
+        <w:rPr>
+          <w:lang w:bidi="ar-DZ"/>
+        </w:rPr>
+        <w:t>The ERD of the KriGo system has been designed taking into consideration the system requirements, use case analysis, class diagrams and normalization. It includes the basic business entities which would be needed to facilitate vehicle renting process, agency management, payment processing, customer service provision and artificial intelligence capabilities and analysis reporting.</w:t>
+      </w:r>
+    </w:p>
+    <w:p>
+      <w:pPr>
+        <w:spacing w:before="240" w:after="0" w:line="278" w:lineRule="auto"/>
+        <w:rPr>
+          <w:lang w:bidi="ar-DZ"/>
+        </w:rPr>
+      </w:pPr>
+      <w:r>
+        <w:rPr>
+          <w:lang w:bidi="ar-DZ"/>
+        </w:rPr>
+        <w:t>This database design maintains data integrity by means of well defined relationships and referential constraints and avoids redundancy through normalization.</w:t>
+      </w:r>
+    </w:p>
+    <w:p>
+      <w:pPr>
+        <w:pStyle w:val="Heading3"/>
+        <w:rPr>
+          <w:lang w:bidi="ar-DZ"/>
+        </w:rPr>
+      </w:pPr>
+      <w:r>
+        <w:rPr>
+          <w:lang w:bidi="ar-DZ"/>
+        </w:rPr>
+        <w:t>5.2 Core Entities</w:t>
+      </w:r>
+    </w:p>
+    <w:p>
+      <w:pPr>
+        <w:spacing w:before="240" w:line="278" w:lineRule="auto"/>
+        <w:rPr>
+          <w:lang w:bidi="ar-DZ"/>
+        </w:rPr>
+      </w:pPr>
+      <w:r>
+        <w:rPr>
+          <w:lang w:bidi="ar-DZ"/>
+        </w:rPr>
+        <w:t>The Core ERD consists of the following principal entities:</w:t>
+      </w:r>
+    </w:p>
+    <w:tbl>
+      <w:tblPr>
+        <w:tblStyle w:val="PlainTable1"/>
+        <w:tblW w:w="0" w:type="auto"/>
+        <w:tblLook w:val="04A0" w:firstRow="1" w:lastRow="0" w:firstColumn="1" w:lastColumn="0" w:noHBand="0" w:noVBand="1"/>
+      </w:tblPr>
+      <w:tblGrid>
+        <w:gridCol w:w="2515"/>
+        <w:gridCol w:w="6832"/>
+      </w:tblGrid>
+      <w:tr>
+        <w:trPr>
+          <w:cnfStyle w:val="100000000000" w:firstRow="1" w:lastRow="0" w:firstColumn="0" w:lastColumn="0" w:oddVBand="0" w:evenVBand="0" w:oddHBand="0" w:evenHBand="0" w:firstRowFirstColumn="0" w:firstRowLastColumn="0" w:lastRowFirstColumn="0" w:lastRowLastColumn="0"/>
+          <w:trHeight w:val="532"/>
+          <w:tblHeader/>
+        </w:trPr>
+        <w:tc>
+          <w:tcPr>
+            <w:cnfStyle w:val="001000000000" w:firstRow="0" w:lastRow="0" w:firstColumn="1" w:lastColumn="0" w:oddVBand="0" w:evenVBand="0" w:oddHBand="0" w:evenHBand="0" w:firstRowFirstColumn="0" w:firstRowLastColumn="0" w:lastRowFirstColumn="0" w:lastRowLastColumn="0"/>
+            <w:tcW w:w="2515" w:type="dxa"/>
+            <w:vAlign w:val="center"/>
+            <w:hideMark/>
+          </w:tcPr>
+          <w:p>
+            <w:pPr>
+              <w:spacing w:line="278" w:lineRule="auto"/>
+              <w:rPr>
+                <w:lang w:bidi="ar-DZ"/>
+              </w:rPr>
+            </w:pPr>
+            <w:r>
+              <w:rPr>
+                <w:lang w:bidi="ar-DZ"/>
+              </w:rPr>
+              <w:t>Entity</w:t>
+            </w:r>
+          </w:p>
+        </w:tc>
+        <w:tc>
+          <w:tcPr>
+            <w:tcW w:w="6832" w:type="dxa"/>
+            <w:vAlign w:val="center"/>
+            <w:hideMark/>
+          </w:tcPr>
+          <w:p>
+            <w:pPr>
+              <w:spacing w:line="278" w:lineRule="auto"/>
+              <w:cnfStyle w:val="100000000000" w:firstRow="1" w:lastRow="0" w:firstColumn="0" w:lastColumn="0" w:oddVBand="0" w:evenVBand="0" w:oddHBand="0" w:evenHBand="0" w:firstRowFirstColumn="0" w:firstRowLastColumn="0" w:lastRowFirstColumn="0" w:lastRowLastColumn="0"/>
+              <w:rPr>
+                <w:lang w:bidi="ar-DZ"/>
+              </w:rPr>
+            </w:pPr>
+            <w:r>
+              <w:rPr>
+                <w:lang w:bidi="ar-DZ"/>
+              </w:rPr>
+              <w:t>Purpose</w:t>
+            </w:r>
+          </w:p>
+        </w:tc>
+      </w:tr>
+      <w:tr>
+        <w:trPr>
+          <w:cnfStyle w:val="000000100000" w:firstRow="0" w:lastRow="0" w:firstColumn="0" w:lastColumn="0" w:oddVBand="0" w:evenVBand="0" w:oddHBand="1" w:evenHBand="0" w:firstRowFirstColumn="0" w:firstRowLastColumn="0" w:lastRowFirstColumn="0" w:lastRowLastColumn="0"/>
+          <w:trHeight w:val="639"/>
+        </w:trPr>
+        <w:tc>
+          <w:tcPr>
+            <w:cnfStyle w:val="001000000000" w:firstRow="0" w:lastRow="0" w:firstColumn="1" w:lastColumn="0" w:oddVBand="0" w:evenVBand="0" w:oddHBand="0" w:evenHBand="0" w:firstRowFirstColumn="0" w:firstRowLastColumn="0" w:lastRowFirstColumn="0" w:lastRowLastColumn="0"/>
+            <w:tcW w:w="2515" w:type="dxa"/>
+            <w:vAlign w:val="center"/>
+            <w:hideMark/>
+          </w:tcPr>
+          <w:p>
+            <w:pPr>
+              <w:spacing w:line="278" w:lineRule="auto"/>
+              <w:rPr>
+                <w:lang w:bidi="ar-DZ"/>
+              </w:rPr>
+            </w:pPr>
+            <w:r>
+              <w:rPr>
+                <w:lang w:bidi="ar-DZ"/>
+              </w:rPr>
+              <w:t>User</w:t>
+            </w:r>
+          </w:p>
+        </w:tc>
+        <w:tc>
+          <w:tcPr>
+            <w:tcW w:w="6832" w:type="dxa"/>
+            <w:vAlign w:val="center"/>
+            <w:hideMark/>
+          </w:tcPr>
+          <w:p>
+            <w:pPr>
+              <w:spacing w:line="278" w:lineRule="auto"/>
+              <w:cnfStyle w:val="000000100000" w:firstRow="0" w:lastRow="0" w:firstColumn="0" w:lastColumn="0" w:oddVBand="0" w:evenVBand="0" w:oddHBand="1" w:evenHBand="0" w:firstRowFirstColumn="0" w:firstRowLastColumn="0" w:lastRowFirstColumn="0" w:lastRowLastColumn="0"/>
+              <w:rPr>
+                <w:lang w:bidi="ar-DZ"/>
+              </w:rPr>
+            </w:pPr>
+            <w:r>
+              <w:rPr>
+                <w:lang w:bidi="ar-DZ"/>
+              </w:rPr>
+              <w:t>Stores authentication and account information for all users.</w:t>
+            </w:r>
+          </w:p>
+        </w:tc>
+      </w:tr>
+      <w:tr>
+        <w:trPr>
+          <w:trHeight w:val="639"/>
+        </w:trPr>
+        <w:tc>
+          <w:tcPr>
+            <w:cnfStyle w:val="001000000000" w:firstRow="0" w:lastRow="0" w:firstColumn="1" w:lastColumn="0" w:oddVBand="0" w:evenVBand="0" w:oddHBand="0" w:evenHBand="0" w:firstRowFirstColumn="0" w:firstRowLastColumn="0" w:lastRowFirstColumn="0" w:lastRowLastColumn="0"/>
+            <w:tcW w:w="2515" w:type="dxa"/>
+            <w:vAlign w:val="center"/>
+            <w:hideMark/>
+          </w:tcPr>
+          <w:p>
+            <w:pPr>
+              <w:spacing w:line="278" w:lineRule="auto"/>
+              <w:rPr>
+                <w:lang w:bidi="ar-DZ"/>
+              </w:rPr>
+            </w:pPr>
+            <w:r>
+              <w:rPr>
+                <w:lang w:bidi="ar-DZ"/>
+              </w:rPr>
+              <w:t>Customer</w:t>
+            </w:r>
+          </w:p>
+        </w:tc>
+        <w:tc>
+          <w:tcPr>
+            <w:tcW w:w="6832" w:type="dxa"/>
+            <w:vAlign w:val="center"/>
+            <w:hideMark/>
+          </w:tcPr>
+          <w:p>
+            <w:pPr>
+              <w:spacing w:line="278" w:lineRule="auto"/>
+              <w:cnfStyle w:val="000000000000" w:firstRow="0" w:lastRow="0" w:firstColumn="0" w:lastColumn="0" w:oddVBand="0" w:evenVBand="0" w:oddHBand="0" w:evenHBand="0" w:firstRowFirstColumn="0" w:firstRowLastColumn="0" w:lastRowFirstColumn="0" w:lastRowLastColumn="0"/>
+              <w:rPr>
+                <w:lang w:bidi="ar-DZ"/>
+              </w:rPr>
+            </w:pPr>
+            <w:r>
+              <w:rPr>
+                <w:lang w:bidi="ar-DZ"/>
+              </w:rPr>
+              <w:t>Stores customer-specific profile information.</w:t>
+            </w:r>
+          </w:p>
+        </w:tc>
+      </w:tr>
+      <w:tr>
+        <w:trPr>
+          <w:cnfStyle w:val="000000100000" w:firstRow="0" w:lastRow="0" w:firstColumn="0" w:lastColumn="0" w:oddVBand="0" w:evenVBand="0" w:oddHBand="1" w:evenHBand="0" w:firstRowFirstColumn="0" w:firstRowLastColumn="0" w:lastRowFirstColumn="0" w:lastRowLastColumn="0"/>
+          <w:trHeight w:val="639"/>
+        </w:trPr>
+        <w:tc>
+          <w:tcPr>
+            <w:cnfStyle w:val="001000000000" w:firstRow="0" w:lastRow="0" w:firstColumn="1" w:lastColumn="0" w:oddVBand="0" w:evenVBand="0" w:oddHBand="0" w:evenHBand="0" w:firstRowFirstColumn="0" w:firstRowLastColumn="0" w:lastRowFirstColumn="0" w:lastRowLastColumn="0"/>
+            <w:tcW w:w="2515" w:type="dxa"/>
+            <w:vAlign w:val="center"/>
+            <w:hideMark/>
+          </w:tcPr>
+          <w:p>
+            <w:pPr>
+              <w:spacing w:line="278" w:lineRule="auto"/>
+              <w:rPr>
+                <w:lang w:bidi="ar-DZ"/>
+              </w:rPr>
+            </w:pPr>
+            <w:r>
+              <w:rPr>
+                <w:lang w:bidi="ar-DZ"/>
+              </w:rPr>
+              <w:t>Agency</w:t>
+            </w:r>
+          </w:p>
+        </w:tc>
+        <w:tc>
+          <w:tcPr>
+            <w:tcW w:w="6832" w:type="dxa"/>
+            <w:vAlign w:val="center"/>
+            <w:hideMark/>
+          </w:tcPr>
+          <w:p>
+            <w:pPr>
+              <w:spacing w:line="278" w:lineRule="auto"/>
+              <w:cnfStyle w:val="000000100000" w:firstRow="0" w:lastRow="0" w:firstColumn="0" w:lastColumn="0" w:oddVBand="0" w:evenVBand="0" w:oddHBand="1" w:evenHBand="0" w:firstRowFirstColumn="0" w:firstRowLastColumn="0" w:lastRowFirstColumn="0" w:lastRowLastColumn="0"/>
+              <w:rPr>
+                <w:lang w:bidi="ar-DZ"/>
+              </w:rPr>
+            </w:pPr>
+            <w:r>
+              <w:rPr>
+                <w:lang w:bidi="ar-DZ"/>
+              </w:rPr>
+              <w:t>Represents registered rental agencies.</w:t>
+            </w:r>
+          </w:p>
+        </w:tc>
+      </w:tr>
+      <w:tr>
+        <w:trPr>
+          <w:trHeight w:val="639"/>
+        </w:trPr>
+        <w:tc>
+          <w:tcPr>
+            <w:cnfStyle w:val="001000000000" w:firstRow="0" w:lastRow="0" w:firstColumn="1" w:lastColumn="0" w:oddVBand="0" w:evenVBand="0" w:oddHBand="0" w:evenHBand="0" w:firstRowFirstColumn="0" w:firstRowLastColumn="0" w:lastRowFirstColumn="0" w:lastRowLastColumn="0"/>
+            <w:tcW w:w="2515" w:type="dxa"/>
+            <w:vAlign w:val="center"/>
+            <w:hideMark/>
+          </w:tcPr>
+          <w:p>
+            <w:pPr>
+              <w:spacing w:line="278" w:lineRule="auto"/>
+              <w:rPr>
+                <w:lang w:bidi="ar-DZ"/>
+              </w:rPr>
+            </w:pPr>
+            <w:r>
+              <w:rPr>
+                <w:lang w:bidi="ar-DZ"/>
+              </w:rPr>
+              <w:t>Agency Verification</w:t>
+            </w:r>
+          </w:p>
+        </w:tc>
+        <w:tc>
+          <w:tcPr>
+            <w:tcW w:w="6832" w:type="dxa"/>
+            <w:vAlign w:val="center"/>
+            <w:hideMark/>
+          </w:tcPr>
+          <w:p>
+            <w:pPr>
+              <w:spacing w:line="278" w:lineRule="auto"/>
+              <w:cnfStyle w:val="000000000000" w:firstRow="0" w:lastRow="0" w:firstColumn="0" w:lastColumn="0" w:oddVBand="0" w:evenVBand="0" w:oddHBand="0" w:evenHBand="0" w:firstRowFirstColumn="0" w:firstRowLastColumn="0" w:lastRowFirstColumn="0" w:lastRowLastColumn="0"/>
+              <w:rPr>
+                <w:lang w:bidi="ar-DZ"/>
+              </w:rPr>
+            </w:pPr>
+            <w:r>
+              <w:rPr>
+                <w:lang w:bidi="ar-DZ"/>
+              </w:rPr>
+              <w:t>Manages agency verification requests and approval status.</w:t>
+            </w:r>
+          </w:p>
+        </w:tc>
+      </w:tr>
+      <w:tr>
+        <w:trPr>
+          <w:cnfStyle w:val="000000100000" w:firstRow="0" w:lastRow="0" w:firstColumn="0" w:lastColumn="0" w:oddVBand="0" w:evenVBand="0" w:oddHBand="1" w:evenHBand="0" w:firstRowFirstColumn="0" w:firstRowLastColumn="0" w:lastRowFirstColumn="0" w:lastRowLastColumn="0"/>
+          <w:trHeight w:val="639"/>
+        </w:trPr>
+        <w:tc>
+          <w:tcPr>
+            <w:cnfStyle w:val="001000000000" w:firstRow="0" w:lastRow="0" w:firstColumn="1" w:lastColumn="0" w:oddVBand="0" w:evenVBand="0" w:oddHBand="0" w:evenHBand="0" w:firstRowFirstColumn="0" w:firstRowLastColumn="0" w:lastRowFirstColumn="0" w:lastRowLastColumn="0"/>
+            <w:tcW w:w="2515" w:type="dxa"/>
+            <w:vAlign w:val="center"/>
+            <w:hideMark/>
+          </w:tcPr>
+          <w:p>
+            <w:pPr>
+              <w:spacing w:line="278" w:lineRule="auto"/>
+              <w:rPr>
+                <w:lang w:bidi="ar-DZ"/>
+              </w:rPr>
+            </w:pPr>
+            <w:r>
+              <w:rPr>
+                <w:lang w:bidi="ar-DZ"/>
+              </w:rPr>
+              <w:t>Branch</w:t>
+            </w:r>
+          </w:p>
+        </w:tc>
+        <w:tc>
+          <w:tcPr>
+            <w:tcW w:w="6832" w:type="dxa"/>
+            <w:vAlign w:val="center"/>
+            <w:hideMark/>
+          </w:tcPr>
+          <w:p>
+            <w:pPr>
+              <w:spacing w:line="278" w:lineRule="auto"/>
+              <w:cnfStyle w:val="000000100000" w:firstRow="0" w:lastRow="0" w:firstColumn="0" w:lastColumn="0" w:oddVBand="0" w:evenVBand="0" w:oddHBand="1" w:evenHBand="0" w:firstRowFirstColumn="0" w:firstRowLastColumn="0" w:lastRowFirstColumn="0" w:lastRowLastColumn="0"/>
+              <w:rPr>
+                <w:lang w:bidi="ar-DZ"/>
+              </w:rPr>
+            </w:pPr>
+            <w:r>
+              <w:rPr>
+                <w:lang w:bidi="ar-DZ"/>
+              </w:rPr>
+              <w:t>Represents physical rental locations.</w:t>
+            </w:r>
+          </w:p>
+        </w:tc>
+      </w:tr>
+      <w:tr>
+        <w:trPr>
+          <w:trHeight w:val="639"/>
+        </w:trPr>
+        <w:tc>
+          <w:tcPr>
+            <w:cnfStyle w:val="001000000000" w:firstRow="0" w:lastRow="0" w:firstColumn="1" w:lastColumn="0" w:oddVBand="0" w:evenVBand="0" w:oddHBand="0" w:evenHBand="0" w:firstRowFirstColumn="0" w:firstRowLastColumn="0" w:lastRowFirstColumn="0" w:lastRowLastColumn="0"/>
+            <w:tcW w:w="2515" w:type="dxa"/>
+            <w:vAlign w:val="center"/>
+            <w:hideMark/>
+          </w:tcPr>
+          <w:p>
+            <w:pPr>
+              <w:spacing w:line="278" w:lineRule="auto"/>
+              <w:rPr>
+                <w:lang w:bidi="ar-DZ"/>
+              </w:rPr>
+            </w:pPr>
+            <w:r>
+              <w:rPr>
+                <w:lang w:bidi="ar-DZ"/>
+              </w:rPr>
+              <w:t>Employee</w:t>
+            </w:r>
+          </w:p>
+        </w:tc>
+        <w:tc>
+          <w:tcPr>
+            <w:tcW w:w="6832" w:type="dxa"/>
+            <w:vAlign w:val="center"/>
+            <w:hideMark/>
+          </w:tcPr>
+          <w:p>
+            <w:pPr>
+              <w:spacing w:line="278" w:lineRule="auto"/>
+              <w:cnfStyle w:val="000000000000" w:firstRow="0" w:lastRow="0" w:firstColumn="0" w:lastColumn="0" w:oddVBand="0" w:evenVBand="0" w:oddHBand="0" w:evenHBand="0" w:firstRowFirstColumn="0" w:firstRowLastColumn="0" w:lastRowFirstColumn="0" w:lastRowLastColumn="0"/>
+              <w:rPr>
+                <w:lang w:bidi="ar-DZ"/>
+              </w:rPr>
+            </w:pPr>
+            <w:r>
+              <w:rPr>
+                <w:lang w:bidi="ar-DZ"/>
+              </w:rPr>
+              <w:t>Stores branch employee information.</w:t>
+            </w:r>
+          </w:p>
+        </w:tc>
+      </w:tr>
+      <w:tr>
+        <w:trPr>
+          <w:cnfStyle w:val="000000100000" w:firstRow="0" w:lastRow="0" w:firstColumn="0" w:lastColumn="0" w:oddVBand="0" w:evenVBand="0" w:oddHBand="1" w:evenHBand="0" w:firstRowFirstColumn="0" w:firstRowLastColumn="0" w:lastRowFirstColumn="0" w:lastRowLastColumn="0"/>
+          <w:trHeight w:val="639"/>
+        </w:trPr>
+        <w:tc>
+          <w:tcPr>
+            <w:cnfStyle w:val="001000000000" w:firstRow="0" w:lastRow="0" w:firstColumn="1" w:lastColumn="0" w:oddVBand="0" w:evenVBand="0" w:oddHBand="0" w:evenHBand="0" w:firstRowFirstColumn="0" w:firstRowLastColumn="0" w:lastRowFirstColumn="0" w:lastRowLastColumn="0"/>
+            <w:tcW w:w="2515" w:type="dxa"/>
+            <w:vAlign w:val="center"/>
+            <w:hideMark/>
+          </w:tcPr>
+          <w:p>
+            <w:pPr>
+              <w:spacing w:line="278" w:lineRule="auto"/>
+              <w:rPr>
+                <w:lang w:bidi="ar-DZ"/>
+              </w:rPr>
+            </w:pPr>
+            <w:r>
+              <w:rPr>
+                <w:lang w:bidi="ar-DZ"/>
+              </w:rPr>
+              <w:t>Vehicle</w:t>
+            </w:r>
+          </w:p>
+        </w:tc>
+        <w:tc>
+          <w:tcPr>
+            <w:tcW w:w="6832" w:type="dxa"/>
+            <w:vAlign w:val="center"/>
+            <w:hideMark/>
+          </w:tcPr>
+          <w:p>
+            <w:pPr>
+              <w:spacing w:line="278" w:lineRule="auto"/>
+              <w:cnfStyle w:val="000000100000" w:firstRow="0" w:lastRow="0" w:firstColumn="0" w:lastColumn="0" w:oddVBand="0" w:evenVBand="0" w:oddHBand="1" w:evenHBand="0" w:firstRowFirstColumn="0" w:firstRowLastColumn="0" w:lastRowFirstColumn="0" w:lastRowLastColumn="0"/>
+              <w:rPr>
+                <w:lang w:bidi="ar-DZ"/>
+              </w:rPr>
+            </w:pPr>
+            <w:r>
+              <w:rPr>
+                <w:lang w:bidi="ar-DZ"/>
+              </w:rPr>
+              <w:t>Stores vehicle specifications and availability information.</w:t>
+            </w:r>
+          </w:p>
+        </w:tc>
+      </w:tr>
+      <w:tr>
+        <w:trPr>
+          <w:trHeight w:val="639"/>
+        </w:trPr>
+        <w:tc>
+          <w:tcPr>
+            <w:cnfStyle w:val="001000000000" w:firstRow="0" w:lastRow="0" w:firstColumn="1" w:lastColumn="0" w:oddVBand="0" w:evenVBand="0" w:oddHBand="0" w:evenHBand="0" w:firstRowFirstColumn="0" w:firstRowLastColumn="0" w:lastRowFirstColumn="0" w:lastRowLastColumn="0"/>
+            <w:tcW w:w="2515" w:type="dxa"/>
+            <w:vAlign w:val="center"/>
+            <w:hideMark/>
+          </w:tcPr>
+          <w:p>
+            <w:pPr>
+              <w:spacing w:line="278" w:lineRule="auto"/>
+              <w:rPr>
+                <w:lang w:bidi="ar-DZ"/>
+              </w:rPr>
+            </w:pPr>
+            <w:r>
+              <w:rPr>
+                <w:lang w:bidi="ar-DZ"/>
+              </w:rPr>
+              <w:t>Reservation</w:t>
+            </w:r>
+          </w:p>
+        </w:tc>
+        <w:tc>
+          <w:tcPr>
+            <w:tcW w:w="6832" w:type="dxa"/>
+            <w:vAlign w:val="center"/>
+            <w:hideMark/>
+          </w:tcPr>
+          <w:p>
+            <w:pPr>
+              <w:spacing w:line="278" w:lineRule="auto"/>
+              <w:cnfStyle w:val="000000000000" w:firstRow="0" w:lastRow="0" w:firstColumn="0" w:lastColumn="0" w:oddVBand="0" w:evenVBand="0" w:oddHBand="0" w:evenHBand="0" w:firstRowFirstColumn="0" w:firstRowLastColumn="0" w:lastRowFirstColumn="0" w:lastRowLastColumn="0"/>
+              <w:rPr>
+                <w:lang w:bidi="ar-DZ"/>
+              </w:rPr>
+            </w:pPr>
+            <w:r>
+              <w:rPr>
+                <w:lang w:bidi="ar-DZ"/>
+              </w:rPr>
+              <w:t>Records vehicle booking transactions.</w:t>
+            </w:r>
+          </w:p>
+        </w:tc>
+      </w:tr>
+      <w:tr>
+        <w:trPr>
+          <w:cnfStyle w:val="000000100000" w:firstRow="0" w:lastRow="0" w:firstColumn="0" w:lastColumn="0" w:oddVBand="0" w:evenVBand="0" w:oddHBand="1" w:evenHBand="0" w:firstRowFirstColumn="0" w:firstRowLastColumn="0" w:lastRowFirstColumn="0" w:lastRowLastColumn="0"/>
+          <w:trHeight w:val="639"/>
+        </w:trPr>
+        <w:tc>
+          <w:tcPr>
+            <w:cnfStyle w:val="001000000000" w:firstRow="0" w:lastRow="0" w:firstColumn="1" w:lastColumn="0" w:oddVBand="0" w:evenVBand="0" w:oddHBand="0" w:evenHBand="0" w:firstRowFirstColumn="0" w:firstRowLastColumn="0" w:lastRowFirstColumn="0" w:lastRowLastColumn="0"/>
+            <w:tcW w:w="2515" w:type="dxa"/>
+            <w:vAlign w:val="center"/>
+            <w:hideMark/>
+          </w:tcPr>
+          <w:p>
+            <w:pPr>
+              <w:spacing w:line="278" w:lineRule="auto"/>
+              <w:rPr>
+                <w:lang w:bidi="ar-DZ"/>
+              </w:rPr>
+            </w:pPr>
+            <w:r>
+              <w:rPr>
+                <w:lang w:bidi="ar-DZ"/>
+              </w:rPr>
+              <w:t>Payment</w:t>
+            </w:r>
+          </w:p>
+        </w:tc>
+        <w:tc>
+          <w:tcPr>
+            <w:tcW w:w="6832" w:type="dxa"/>
+            <w:vAlign w:val="center"/>
+            <w:hideMark/>
+          </w:tcPr>
+          <w:p>
+            <w:pPr>
+              <w:spacing w:line="278" w:lineRule="auto"/>
+              <w:cnfStyle w:val="000000100000" w:firstRow="0" w:lastRow="0" w:firstColumn="0" w:lastColumn="0" w:oddVBand="0" w:evenVBand="0" w:oddHBand="1" w:evenHBand="0" w:firstRowFirstColumn="0" w:firstRowLastColumn="0" w:lastRowFirstColumn="0" w:lastRowLastColumn="0"/>
+              <w:rPr>
+                <w:lang w:bidi="ar-DZ"/>
+              </w:rPr>
+            </w:pPr>
+            <w:r>
+              <w:rPr>
+                <w:lang w:bidi="ar-DZ"/>
+              </w:rPr>
+              <w:t>Stores payment transactions processed through the Edahabia payment gateway.</w:t>
+            </w:r>
+          </w:p>
+        </w:tc>
+      </w:tr>
+      <w:tr>
+        <w:trPr>
+          <w:trHeight w:val="639"/>
+        </w:trPr>
+        <w:tc>
+          <w:tcPr>
+            <w:cnfStyle w:val="001000000000" w:firstRow="0" w:lastRow="0" w:firstColumn="1" w:lastColumn="0" w:oddVBand="0" w:evenVBand="0" w:oddHBand="0" w:evenHBand="0" w:firstRowFirstColumn="0" w:firstRowLastColumn="0" w:lastRowFirstColumn="0" w:lastRowLastColumn="0"/>
+            <w:tcW w:w="2515" w:type="dxa"/>
+            <w:vAlign w:val="center"/>
+            <w:hideMark/>
+          </w:tcPr>
+          <w:p>
+            <w:pPr>
+              <w:spacing w:line="278" w:lineRule="auto"/>
+              <w:rPr>
+                <w:lang w:bidi="ar-DZ"/>
+              </w:rPr>
+            </w:pPr>
+            <w:r>
+              <w:rPr>
+                <w:lang w:bidi="ar-DZ"/>
+              </w:rPr>
+              <w:t>Review</w:t>
+            </w:r>
+          </w:p>
+        </w:tc>
+        <w:tc>
+          <w:tcPr>
+            <w:tcW w:w="6832" w:type="dxa"/>
+            <w:vAlign w:val="center"/>
+            <w:hideMark/>
+          </w:tcPr>
+          <w:p>
+            <w:pPr>
+              <w:spacing w:line="278" w:lineRule="auto"/>
+              <w:cnfStyle w:val="000000000000" w:firstRow="0" w:lastRow="0" w:firstColumn="0" w:lastColumn="0" w:oddVBand="0" w:evenVBand="0" w:oddHBand="0" w:evenHBand="0" w:firstRowFirstColumn="0" w:firstRowLastColumn="0" w:lastRowFirstColumn="0" w:lastRowLastColumn="0"/>
+              <w:rPr>
+                <w:lang w:bidi="ar-DZ"/>
+              </w:rPr>
+            </w:pPr>
+            <w:r>
+              <w:rPr>
+                <w:lang w:bidi="ar-DZ"/>
+              </w:rPr>
+              <w:t>Stores customer ratings and reviews.</w:t>
+            </w:r>
+          </w:p>
+        </w:tc>
+      </w:tr>
+      <w:tr>
+        <w:trPr>
+          <w:cnfStyle w:val="000000100000" w:firstRow="0" w:lastRow="0" w:firstColumn="0" w:lastColumn="0" w:oddVBand="0" w:evenVBand="0" w:oddHBand="1" w:evenHBand="0" w:firstRowFirstColumn="0" w:firstRowLastColumn="0" w:lastRowFirstColumn="0" w:lastRowLastColumn="0"/>
+          <w:trHeight w:val="639"/>
+        </w:trPr>
+        <w:tc>
+          <w:tcPr>
+            <w:cnfStyle w:val="001000000000" w:firstRow="0" w:lastRow="0" w:firstColumn="1" w:lastColumn="0" w:oddVBand="0" w:evenVBand="0" w:oddHBand="0" w:evenHBand="0" w:firstRowFirstColumn="0" w:firstRowLastColumn="0" w:lastRowFirstColumn="0" w:lastRowLastColumn="0"/>
+            <w:tcW w:w="2515" w:type="dxa"/>
+            <w:vAlign w:val="center"/>
+            <w:hideMark/>
+          </w:tcPr>
+          <w:p>
+            <w:pPr>
+              <w:spacing w:line="278" w:lineRule="auto"/>
+              <w:rPr>
+                <w:lang w:bidi="ar-DZ"/>
+              </w:rPr>
+            </w:pPr>
+            <w:r>
+              <w:rPr>
+                <w:lang w:bidi="ar-DZ"/>
+              </w:rPr>
+              <w:lastRenderedPageBreak/>
+              <w:t>Dispute</w:t>
+            </w:r>
+          </w:p>
+        </w:tc>
+        <w:tc>
+          <w:tcPr>
+            <w:tcW w:w="6832" w:type="dxa"/>
+            <w:vAlign w:val="center"/>
+            <w:hideMark/>
+          </w:tcPr>
+          <w:p>
+            <w:pPr>
+              <w:spacing w:line="278" w:lineRule="auto"/>
+              <w:cnfStyle w:val="000000100000" w:firstRow="0" w:lastRow="0" w:firstColumn="0" w:lastColumn="0" w:oddVBand="0" w:evenVBand="0" w:oddHBand="1" w:evenHBand="0" w:firstRowFirstColumn="0" w:firstRowLastColumn="0" w:lastRowFirstColumn="0" w:lastRowLastColumn="0"/>
+              <w:rPr>
+                <w:lang w:bidi="ar-DZ"/>
+              </w:rPr>
+            </w:pPr>
+            <w:r>
+              <w:rPr>
+                <w:lang w:bidi="ar-DZ"/>
+              </w:rPr>
+              <w:t>Manages customer and agency dispute cases.</w:t>
+            </w:r>
+          </w:p>
+        </w:tc>
+      </w:tr>
+      <w:tr>
+        <w:trPr>
+          <w:trHeight w:val="639"/>
+        </w:trPr>
+        <w:tc>
+          <w:tcPr>
+            <w:cnfStyle w:val="001000000000" w:firstRow="0" w:lastRow="0" w:firstColumn="1" w:lastColumn="0" w:oddVBand="0" w:evenVBand="0" w:oddHBand="0" w:evenHBand="0" w:firstRowFirstColumn="0" w:firstRowLastColumn="0" w:lastRowFirstColumn="0" w:lastRowLastColumn="0"/>
+            <w:tcW w:w="2515" w:type="dxa"/>
+            <w:vAlign w:val="center"/>
+            <w:hideMark/>
+          </w:tcPr>
+          <w:p>
+            <w:pPr>
+              <w:spacing w:line="278" w:lineRule="auto"/>
+              <w:rPr>
+                <w:lang w:bidi="ar-DZ"/>
+              </w:rPr>
+            </w:pPr>
+            <w:r>
+              <w:rPr>
+                <w:lang w:bidi="ar-DZ"/>
+              </w:rPr>
+              <w:t>Notification</w:t>
+            </w:r>
+          </w:p>
+        </w:tc>
+        <w:tc>
+          <w:tcPr>
+            <w:tcW w:w="6832" w:type="dxa"/>
+            <w:vAlign w:val="center"/>
+            <w:hideMark/>
+          </w:tcPr>
+          <w:p>
+            <w:pPr>
+              <w:spacing w:line="278" w:lineRule="auto"/>
+              <w:cnfStyle w:val="000000000000" w:firstRow="0" w:lastRow="0" w:firstColumn="0" w:lastColumn="0" w:oddVBand="0" w:evenVBand="0" w:oddHBand="0" w:evenHBand="0" w:firstRowFirstColumn="0" w:firstRowLastColumn="0" w:lastRowFirstColumn="0" w:lastRowLastColumn="0"/>
+              <w:rPr>
+                <w:lang w:bidi="ar-DZ"/>
+              </w:rPr>
+            </w:pPr>
+            <w:r>
+              <w:rPr>
+                <w:lang w:bidi="ar-DZ"/>
+              </w:rPr>
+              <w:t>Stores system notifications sent to users.</w:t>
+            </w:r>
+          </w:p>
+        </w:tc>
+      </w:tr>
+      <w:tr>
+        <w:trPr>
+          <w:cnfStyle w:val="000000100000" w:firstRow="0" w:lastRow="0" w:firstColumn="0" w:lastColumn="0" w:oddVBand="0" w:evenVBand="0" w:oddHBand="1" w:evenHBand="0" w:firstRowFirstColumn="0" w:firstRowLastColumn="0" w:lastRowFirstColumn="0" w:lastRowLastColumn="0"/>
+          <w:trHeight w:val="639"/>
+        </w:trPr>
+        <w:tc>
+          <w:tcPr>
+            <w:cnfStyle w:val="001000000000" w:firstRow="0" w:lastRow="0" w:firstColumn="1" w:lastColumn="0" w:oddVBand="0" w:evenVBand="0" w:oddHBand="0" w:evenHBand="0" w:firstRowFirstColumn="0" w:firstRowLastColumn="0" w:lastRowFirstColumn="0" w:lastRowLastColumn="0"/>
+            <w:tcW w:w="2515" w:type="dxa"/>
+            <w:vAlign w:val="center"/>
+            <w:hideMark/>
+          </w:tcPr>
+          <w:p>
+            <w:pPr>
+              <w:spacing w:line="278" w:lineRule="auto"/>
+              <w:rPr>
+                <w:lang w:bidi="ar-DZ"/>
+              </w:rPr>
+            </w:pPr>
+            <w:r>
+              <w:rPr>
+                <w:lang w:bidi="ar-DZ"/>
+              </w:rPr>
+              <w:t>AI Recommendation</w:t>
+            </w:r>
+          </w:p>
+        </w:tc>
+        <w:tc>
+          <w:tcPr>
+            <w:tcW w:w="6832" w:type="dxa"/>
+            <w:vAlign w:val="center"/>
+            <w:hideMark/>
+          </w:tcPr>
+          <w:p>
+            <w:pPr>
+              <w:spacing w:line="278" w:lineRule="auto"/>
+              <w:cnfStyle w:val="000000100000" w:firstRow="0" w:lastRow="0" w:firstColumn="0" w:lastColumn="0" w:oddVBand="0" w:evenVBand="0" w:oddHBand="1" w:evenHBand="0" w:firstRowFirstColumn="0" w:firstRowLastColumn="0" w:lastRowFirstColumn="0" w:lastRowLastColumn="0"/>
+              <w:rPr>
+                <w:lang w:bidi="ar-DZ"/>
+              </w:rPr>
+            </w:pPr>
+            <w:r>
+              <w:rPr>
+                <w:lang w:bidi="ar-DZ"/>
+              </w:rPr>
+              <w:t>Stores personalized vehicle recommendations generated by the AI engine.</w:t>
+            </w:r>
+          </w:p>
+        </w:tc>
+      </w:tr>
+      <w:tr>
+        <w:trPr>
+          <w:trHeight w:val="639"/>
+        </w:trPr>
+        <w:tc>
+          <w:tcPr>
+            <w:cnfStyle w:val="001000000000" w:firstRow="0" w:lastRow="0" w:firstColumn="1" w:lastColumn="0" w:oddVBand="0" w:evenVBand="0" w:oddHBand="0" w:evenHBand="0" w:firstRowFirstColumn="0" w:firstRowLastColumn="0" w:lastRowFirstColumn="0" w:lastRowLastColumn="0"/>
+            <w:tcW w:w="2515" w:type="dxa"/>
+            <w:vAlign w:val="center"/>
+            <w:hideMark/>
+          </w:tcPr>
+          <w:p>
+            <w:pPr>
+              <w:spacing w:line="278" w:lineRule="auto"/>
+              <w:rPr>
+                <w:lang w:bidi="ar-DZ"/>
+              </w:rPr>
+            </w:pPr>
+            <w:r>
+              <w:rPr>
+                <w:lang w:bidi="ar-DZ"/>
+              </w:rPr>
+              <w:t>AI Conversation</w:t>
+            </w:r>
+          </w:p>
+        </w:tc>
+        <w:tc>
+          <w:tcPr>
+            <w:tcW w:w="6832" w:type="dxa"/>
+            <w:vAlign w:val="center"/>
+            <w:hideMark/>
+          </w:tcPr>
+          <w:p>
+            <w:pPr>
+              <w:spacing w:line="278" w:lineRule="auto"/>
+              <w:cnfStyle w:val="000000000000" w:firstRow="0" w:lastRow="0" w:firstColumn="0" w:lastColumn="0" w:oddVBand="0" w:evenVBand="0" w:oddHBand="0" w:evenHBand="0" w:firstRowFirstColumn="0" w:firstRowLastColumn="0" w:lastRowFirstColumn="0" w:lastRowLastColumn="0"/>
+              <w:rPr>
+                <w:lang w:bidi="ar-DZ"/>
+              </w:rPr>
+            </w:pPr>
+            <w:r>
+              <w:rPr>
+                <w:lang w:bidi="ar-DZ"/>
+              </w:rPr>
+              <w:t>Stores customer interactions with the AI assistant.</w:t>
+            </w:r>
+          </w:p>
+        </w:tc>
+      </w:tr>
+      <w:tr>
+        <w:trPr>
+          <w:cnfStyle w:val="000000100000" w:firstRow="0" w:lastRow="0" w:firstColumn="0" w:lastColumn="0" w:oddVBand="0" w:evenVBand="0" w:oddHBand="1" w:evenHBand="0" w:firstRowFirstColumn="0" w:firstRowLastColumn="0" w:lastRowFirstColumn="0" w:lastRowLastColumn="0"/>
+          <w:trHeight w:val="640"/>
+        </w:trPr>
+        <w:tc>
+          <w:tcPr>
+            <w:cnfStyle w:val="001000000000" w:firstRow="0" w:lastRow="0" w:firstColumn="1" w:lastColumn="0" w:oddVBand="0" w:evenVBand="0" w:oddHBand="0" w:evenHBand="0" w:firstRowFirstColumn="0" w:firstRowLastColumn="0" w:lastRowFirstColumn="0" w:lastRowLastColumn="0"/>
+            <w:tcW w:w="2515" w:type="dxa"/>
+            <w:vAlign w:val="center"/>
+            <w:hideMark/>
+          </w:tcPr>
+          <w:p>
+            <w:pPr>
+              <w:spacing w:line="278" w:lineRule="auto"/>
+              <w:rPr>
+                <w:lang w:bidi="ar-DZ"/>
+              </w:rPr>
+            </w:pPr>
+            <w:r>
+              <w:rPr>
+                <w:lang w:bidi="ar-DZ"/>
+              </w:rPr>
+              <w:t>Analytics Report</w:t>
+            </w:r>
+          </w:p>
+        </w:tc>
+        <w:tc>
+          <w:tcPr>
+            <w:tcW w:w="6832" w:type="dxa"/>
+            <w:vAlign w:val="center"/>
+            <w:hideMark/>
+          </w:tcPr>
+          <w:p>
+            <w:pPr>
+              <w:spacing w:line="278" w:lineRule="auto"/>
+              <w:cnfStyle w:val="000000100000" w:firstRow="0" w:lastRow="0" w:firstColumn="0" w:lastColumn="0" w:oddVBand="0" w:evenVBand="0" w:oddHBand="1" w:evenHBand="0" w:firstRowFirstColumn="0" w:firstRowLastColumn="0" w:lastRowFirstColumn="0" w:lastRowLastColumn="0"/>
+              <w:rPr>
+                <w:lang w:bidi="ar-DZ"/>
+              </w:rPr>
+            </w:pPr>
+            <w:r>
+              <w:rPr>
+                <w:lang w:bidi="ar-DZ"/>
+              </w:rPr>
+              <w:t>Stores reports generated for system administrators.</w:t>
+            </w:r>
+          </w:p>
+        </w:tc>
+      </w:tr>
+    </w:tbl>
+    <w:p>
+      <w:pPr>
+        <w:spacing w:before="240" w:after="0" w:line="278" w:lineRule="auto"/>
+        <w:rPr>
+          <w:lang w:bidi="ar-DZ"/>
+        </w:rPr>
+      </w:pPr>
+    </w:p>
+    <w:p>
+      <w:pPr>
+        <w:pStyle w:val="Heading3"/>
+        <w:rPr>
+          <w:lang w:bidi="ar-DZ"/>
+        </w:rPr>
+      </w:pPr>
+      <w:r>
+        <w:rPr>
+          <w:lang w:bidi="ar-DZ"/>
+        </w:rPr>
+        <w:t>5.3 Entity Relationships</w:t>
+      </w:r>
+    </w:p>
+    <w:p>
+      <w:pPr>
+        <w:spacing w:before="240" w:line="278" w:lineRule="auto"/>
+        <w:rPr>
+          <w:lang w:bidi="ar-DZ"/>
+        </w:rPr>
+      </w:pPr>
+      <w:r>
+        <w:rPr>
+          <w:lang w:bidi="ar-DZ"/>
+        </w:rPr>
+        <w:t>The Core ERD models the following relationships:</w:t>
+      </w:r>
+    </w:p>
+    <w:tbl>
+      <w:tblPr>
+        <w:tblStyle w:val="PlainTable1"/>
+        <w:tblW w:w="9355" w:type="dxa"/>
+        <w:tblCellMar>
+          <w:top w:w="29" w:type="dxa"/>
+          <w:bottom w:w="29" w:type="dxa"/>
+        </w:tblCellMar>
+        <w:tblLook w:val="04A0" w:firstRow="1" w:lastRow="0" w:firstColumn="1" w:lastColumn="0" w:noHBand="0" w:noVBand="1"/>
+      </w:tblPr>
+      <w:tblGrid>
+        <w:gridCol w:w="6565"/>
+        <w:gridCol w:w="2790"/>
+      </w:tblGrid>
+      <w:tr>
+        <w:trPr>
+          <w:cnfStyle w:val="100000000000" w:firstRow="1" w:lastRow="0" w:firstColumn="0" w:lastColumn="0" w:oddVBand="0" w:evenVBand="0" w:oddHBand="0" w:evenHBand="0" w:firstRowFirstColumn="0" w:firstRowLastColumn="0" w:lastRowFirstColumn="0" w:lastRowLastColumn="0"/>
+          <w:trHeight w:val="550"/>
+        </w:trPr>
+        <w:tc>
+          <w:tcPr>
+            <w:cnfStyle w:val="001000000000" w:firstRow="0" w:lastRow="0" w:firstColumn="1" w:lastColumn="0" w:oddVBand="0" w:evenVBand="0" w:oddHBand="0" w:evenHBand="0" w:firstRowFirstColumn="0" w:firstRowLastColumn="0" w:lastRowFirstColumn="0" w:lastRowLastColumn="0"/>
+            <w:tcW w:w="6565" w:type="dxa"/>
+            <w:vAlign w:val="center"/>
+            <w:hideMark/>
+          </w:tcPr>
+          <w:p>
+            <w:pPr>
+              <w:spacing w:line="278" w:lineRule="auto"/>
+              <w:rPr>
+                <w:lang w:bidi="ar-DZ"/>
+              </w:rPr>
+            </w:pPr>
+            <w:r>
+              <w:rPr>
+                <w:lang w:bidi="ar-DZ"/>
+              </w:rPr>
+              <w:t>Relationship</w:t>
+            </w:r>
+          </w:p>
+        </w:tc>
+        <w:tc>
+          <w:tcPr>
+            <w:tcW w:w="2790" w:type="dxa"/>
+            <w:vAlign w:val="center"/>
+            <w:hideMark/>
+          </w:tcPr>
+          <w:p>
+            <w:pPr>
+              <w:spacing w:line="278" w:lineRule="auto"/>
+              <w:cnfStyle w:val="100000000000" w:firstRow="1" w:lastRow="0" w:firstColumn="0" w:lastColumn="0" w:oddVBand="0" w:evenVBand="0" w:oddHBand="0" w:evenHBand="0" w:firstRowFirstColumn="0" w:firstRowLastColumn="0" w:lastRowFirstColumn="0" w:lastRowLastColumn="0"/>
+              <w:rPr>
+                <w:lang w:bidi="ar-DZ"/>
+              </w:rPr>
+            </w:pPr>
+            <w:r>
+              <w:rPr>
+                <w:lang w:bidi="ar-DZ"/>
+              </w:rPr>
+              <w:t>Cardinality</w:t>
+            </w:r>
+          </w:p>
+        </w:tc>
+      </w:tr>
+      <w:tr>
+        <w:trPr>
+          <w:cnfStyle w:val="000000100000" w:firstRow="0" w:lastRow="0" w:firstColumn="0" w:lastColumn="0" w:oddVBand="0" w:evenVBand="0" w:oddHBand="1" w:evenHBand="0" w:firstRowFirstColumn="0" w:firstRowLastColumn="0" w:lastRowFirstColumn="0" w:lastRowLastColumn="0"/>
+          <w:trHeight w:val="576"/>
+        </w:trPr>
+        <w:tc>
+          <w:tcPr>
+            <w:cnfStyle w:val="001000000000" w:firstRow="0" w:lastRow="0" w:firstColumn="1" w:lastColumn="0" w:oddVBand="0" w:evenVBand="0" w:oddHBand="0" w:evenHBand="0" w:firstRowFirstColumn="0" w:firstRowLastColumn="0" w:lastRowFirstColumn="0" w:lastRowLastColumn="0"/>
+            <w:tcW w:w="6565" w:type="dxa"/>
+            <w:vAlign w:val="center"/>
+            <w:hideMark/>
+          </w:tcPr>
+          <w:p>
+            <w:pPr>
+              <w:spacing w:line="278" w:lineRule="auto"/>
+              <w:rPr>
+                <w:lang w:bidi="ar-DZ"/>
+              </w:rPr>
+            </w:pPr>
+            <w:r>
+              <w:rPr>
+                <w:lang w:bidi="ar-DZ"/>
+              </w:rPr>
+              <w:t>User — Customer</w:t>
+            </w:r>
+          </w:p>
+        </w:tc>
+        <w:tc>
+          <w:tcPr>
+            <w:tcW w:w="2790" w:type="dxa"/>
+            <w:vAlign w:val="center"/>
+            <w:hideMark/>
+          </w:tcPr>
+          <w:p>
+            <w:pPr>
+              <w:spacing w:line="278" w:lineRule="auto"/>
+              <w:cnfStyle w:val="000000100000" w:firstRow="0" w:lastRow="0" w:firstColumn="0" w:lastColumn="0" w:oddVBand="0" w:evenVBand="0" w:oddHBand="1" w:evenHBand="0" w:firstRowFirstColumn="0" w:firstRowLastColumn="0" w:lastRowFirstColumn="0" w:lastRowLastColumn="0"/>
+              <w:rPr>
+                <w:lang w:bidi="ar-DZ"/>
+              </w:rPr>
+            </w:pPr>
+            <w:r>
+              <w:rPr>
+                <w:lang w:bidi="ar-DZ"/>
+              </w:rPr>
+              <w:t>1 : 1</w:t>
+            </w:r>
+          </w:p>
+        </w:tc>
+      </w:tr>
+      <w:tr>
+        <w:trPr>
+          <w:trHeight w:val="576"/>
+        </w:trPr>
+        <w:tc>
+          <w:tcPr>
+            <w:cnfStyle w:val="001000000000" w:firstRow="0" w:lastRow="0" w:firstColumn="1" w:lastColumn="0" w:oddVBand="0" w:evenVBand="0" w:oddHBand="0" w:evenHBand="0" w:firstRowFirstColumn="0" w:firstRowLastColumn="0" w:lastRowFirstColumn="0" w:lastRowLastColumn="0"/>
+            <w:tcW w:w="6565" w:type="dxa"/>
+            <w:vAlign w:val="center"/>
+            <w:hideMark/>
+          </w:tcPr>
+          <w:p>
+            <w:pPr>
+              <w:spacing w:line="278" w:lineRule="auto"/>
+              <w:rPr>
+                <w:lang w:bidi="ar-DZ"/>
+              </w:rPr>
+            </w:pPr>
+            <w:r>
+              <w:rPr>
+                <w:lang w:bidi="ar-DZ"/>
+              </w:rPr>
+              <w:t>User — Agency</w:t>
+            </w:r>
+          </w:p>
+        </w:tc>
+        <w:tc>
+          <w:tcPr>
+            <w:tcW w:w="2790" w:type="dxa"/>
+            <w:vAlign w:val="center"/>
+            <w:hideMark/>
+          </w:tcPr>
+          <w:p>
+            <w:pPr>
+              <w:spacing w:line="278" w:lineRule="auto"/>
+              <w:cnfStyle w:val="000000000000" w:firstRow="0" w:lastRow="0" w:firstColumn="0" w:lastColumn="0" w:oddVBand="0" w:evenVBand="0" w:oddHBand="0" w:evenHBand="0" w:firstRowFirstColumn="0" w:firstRowLastColumn="0" w:lastRowFirstColumn="0" w:lastRowLastColumn="0"/>
+              <w:rPr>
+                <w:lang w:bidi="ar-DZ"/>
+              </w:rPr>
+            </w:pPr>
+            <w:r>
+              <w:rPr>
+                <w:lang w:bidi="ar-DZ"/>
+              </w:rPr>
+              <w:t>1 : 1</w:t>
+            </w:r>
+          </w:p>
+        </w:tc>
+      </w:tr>
+      <w:tr>
+        <w:trPr>
+          <w:cnfStyle w:val="000000100000" w:firstRow="0" w:lastRow="0" w:firstColumn="0" w:lastColumn="0" w:oddVBand="0" w:evenVBand="0" w:oddHBand="1" w:evenHBand="0" w:firstRowFirstColumn="0" w:firstRowLastColumn="0" w:lastRowFirstColumn="0" w:lastRowLastColumn="0"/>
+          <w:trHeight w:val="576"/>
+        </w:trPr>
+        <w:tc>
+          <w:tcPr>
+            <w:cnfStyle w:val="001000000000" w:firstRow="0" w:lastRow="0" w:firstColumn="1" w:lastColumn="0" w:oddVBand="0" w:evenVBand="0" w:oddHBand="0" w:evenHBand="0" w:firstRowFirstColumn="0" w:firstRowLastColumn="0" w:lastRowFirstColumn="0" w:lastRowLastColumn="0"/>
+            <w:tcW w:w="6565" w:type="dxa"/>
+            <w:vAlign w:val="center"/>
+            <w:hideMark/>
+          </w:tcPr>
+          <w:p>
+            <w:pPr>
+              <w:spacing w:line="278" w:lineRule="auto"/>
+              <w:rPr>
+                <w:lang w:bidi="ar-DZ"/>
+              </w:rPr>
+            </w:pPr>
+            <w:r>
+              <w:rPr>
+                <w:lang w:bidi="ar-DZ"/>
+              </w:rPr>
+              <w:t>Agency — Agency Verification</w:t>
+            </w:r>
+          </w:p>
+        </w:tc>
+        <w:tc>
+          <w:tcPr>
+            <w:tcW w:w="2790" w:type="dxa"/>
+            <w:vAlign w:val="center"/>
+            <w:hideMark/>
+          </w:tcPr>
+          <w:p>
+            <w:pPr>
+              <w:spacing w:line="278" w:lineRule="auto"/>
+              <w:cnfStyle w:val="000000100000" w:firstRow="0" w:lastRow="0" w:firstColumn="0" w:lastColumn="0" w:oddVBand="0" w:evenVBand="0" w:oddHBand="1" w:evenHBand="0" w:firstRowFirstColumn="0" w:firstRowLastColumn="0" w:lastRowFirstColumn="0" w:lastRowLastColumn="0"/>
+              <w:rPr>
+                <w:lang w:bidi="ar-DZ"/>
+              </w:rPr>
+            </w:pPr>
+            <w:r>
+              <w:rPr>
+                <w:lang w:bidi="ar-DZ"/>
+              </w:rPr>
+              <w:t>1 : 0..1</w:t>
+            </w:r>
+          </w:p>
+        </w:tc>
+      </w:tr>
+      <w:tr>
+        <w:trPr>
+          <w:trHeight w:val="576"/>
+        </w:trPr>
+        <w:tc>
+          <w:tcPr>
+            <w:cnfStyle w:val="001000000000" w:firstRow="0" w:lastRow="0" w:firstColumn="1" w:lastColumn="0" w:oddVBand="0" w:evenVBand="0" w:oddHBand="0" w:evenHBand="0" w:firstRowFirstColumn="0" w:firstRowLastColumn="0" w:lastRowFirstColumn="0" w:lastRowLastColumn="0"/>
+            <w:tcW w:w="6565" w:type="dxa"/>
+            <w:vAlign w:val="center"/>
+            <w:hideMark/>
+          </w:tcPr>
+          <w:p>
+            <w:pPr>
+              <w:spacing w:line="278" w:lineRule="auto"/>
+              <w:rPr>
+                <w:lang w:bidi="ar-DZ"/>
+              </w:rPr>
+            </w:pPr>
+            <w:r>
+              <w:rPr>
+                <w:lang w:bidi="ar-DZ"/>
+              </w:rPr>
+              <w:t>Agency — Branch</w:t>
+            </w:r>
+          </w:p>
+        </w:tc>
+        <w:tc>
+          <w:tcPr>
+            <w:tcW w:w="2790" w:type="dxa"/>
+            <w:vAlign w:val="center"/>
+            <w:hideMark/>
+          </w:tcPr>
+          <w:p>
+            <w:pPr>
+              <w:spacing w:line="278" w:lineRule="auto"/>
+              <w:cnfStyle w:val="000000000000" w:firstRow="0" w:lastRow="0" w:firstColumn="0" w:lastColumn="0" w:oddVBand="0" w:evenVBand="0" w:oddHBand="0" w:evenHBand="0" w:firstRowFirstColumn="0" w:firstRowLastColumn="0" w:lastRowFirstColumn="0" w:lastRowLastColumn="0"/>
+              <w:rPr>
+                <w:lang w:bidi="ar-DZ"/>
+              </w:rPr>
+            </w:pPr>
+            <w:r>
+              <w:rPr>
+                <w:lang w:bidi="ar-DZ"/>
+              </w:rPr>
+              <w:t>1 : N</w:t>
+            </w:r>
+          </w:p>
+        </w:tc>
+      </w:tr>
+      <w:tr>
+        <w:trPr>
+          <w:cnfStyle w:val="000000100000" w:firstRow="0" w:lastRow="0" w:firstColumn="0" w:lastColumn="0" w:oddVBand="0" w:evenVBand="0" w:oddHBand="1" w:evenHBand="0" w:firstRowFirstColumn="0" w:firstRowLastColumn="0" w:lastRowFirstColumn="0" w:lastRowLastColumn="0"/>
+          <w:trHeight w:val="576"/>
+        </w:trPr>
+        <w:tc>
+          <w:tcPr>
+            <w:cnfStyle w:val="001000000000" w:firstRow="0" w:lastRow="0" w:firstColumn="1" w:lastColumn="0" w:oddVBand="0" w:evenVBand="0" w:oddHBand="0" w:evenHBand="0" w:firstRowFirstColumn="0" w:firstRowLastColumn="0" w:lastRowFirstColumn="0" w:lastRowLastColumn="0"/>
+            <w:tcW w:w="6565" w:type="dxa"/>
+            <w:vAlign w:val="center"/>
+            <w:hideMark/>
+          </w:tcPr>
+          <w:p>
+            <w:pPr>
+              <w:spacing w:line="278" w:lineRule="auto"/>
+              <w:rPr>
+                <w:lang w:bidi="ar-DZ"/>
+              </w:rPr>
+            </w:pPr>
+            <w:r>
+              <w:rPr>
+                <w:lang w:bidi="ar-DZ"/>
+              </w:rPr>
+              <w:t>Branch — Employee</w:t>
+            </w:r>
+          </w:p>
+        </w:tc>
+        <w:tc>
+          <w:tcPr>
+            <w:tcW w:w="2790" w:type="dxa"/>
+            <w:vAlign w:val="center"/>
+            <w:hideMark/>
+          </w:tcPr>
+          <w:p>
+            <w:pPr>
+              <w:spacing w:line="278" w:lineRule="auto"/>
+              <w:cnfStyle w:val="000000100000" w:firstRow="0" w:lastRow="0" w:firstColumn="0" w:lastColumn="0" w:oddVBand="0" w:evenVBand="0" w:oddHBand="1" w:evenHBand="0" w:firstRowFirstColumn="0" w:firstRowLastColumn="0" w:lastRowFirstColumn="0" w:lastRowLastColumn="0"/>
+              <w:rPr>
+                <w:lang w:bidi="ar-DZ"/>
+              </w:rPr>
+            </w:pPr>
+            <w:r>
+              <w:rPr>
+                <w:lang w:bidi="ar-DZ"/>
+              </w:rPr>
+              <w:t>1 : N</w:t>
+            </w:r>
+          </w:p>
+        </w:tc>
+      </w:tr>
+      <w:tr>
+        <w:trPr>
+          <w:trHeight w:val="576"/>
+        </w:trPr>
+        <w:tc>
+          <w:tcPr>
+            <w:cnfStyle w:val="001000000000" w:firstRow="0" w:lastRow="0" w:firstColumn="1" w:lastColumn="0" w:oddVBand="0" w:evenVBand="0" w:oddHBand="0" w:evenHBand="0" w:firstRowFirstColumn="0" w:firstRowLastColumn="0" w:lastRowFirstColumn="0" w:lastRowLastColumn="0"/>
+            <w:tcW w:w="6565" w:type="dxa"/>
+            <w:vAlign w:val="center"/>
+            <w:hideMark/>
+          </w:tcPr>
+          <w:p>
+            <w:pPr>
+              <w:spacing w:line="278" w:lineRule="auto"/>
+              <w:rPr>
+                <w:lang w:bidi="ar-DZ"/>
+              </w:rPr>
+            </w:pPr>
+            <w:r>
+              <w:rPr>
+                <w:lang w:bidi="ar-DZ"/>
+              </w:rPr>
+              <w:t>Agency — Vehicle</w:t>
+            </w:r>
+          </w:p>
+        </w:tc>
+        <w:tc>
+          <w:tcPr>
+            <w:tcW w:w="2790" w:type="dxa"/>
+            <w:vAlign w:val="center"/>
+            <w:hideMark/>
+          </w:tcPr>
+          <w:p>
+            <w:pPr>
+              <w:spacing w:line="278" w:lineRule="auto"/>
+              <w:cnfStyle w:val="000000000000" w:firstRow="0" w:lastRow="0" w:firstColumn="0" w:lastColumn="0" w:oddVBand="0" w:evenVBand="0" w:oddHBand="0" w:evenHBand="0" w:firstRowFirstColumn="0" w:firstRowLastColumn="0" w:lastRowFirstColumn="0" w:lastRowLastColumn="0"/>
+              <w:rPr>
+                <w:lang w:bidi="ar-DZ"/>
+              </w:rPr>
+            </w:pPr>
+            <w:r>
+              <w:rPr>
+                <w:lang w:bidi="ar-DZ"/>
+              </w:rPr>
+              <w:t>1 : N</w:t>
+            </w:r>
+          </w:p>
+        </w:tc>
+      </w:tr>
+      <w:tr>
+        <w:trPr>
+          <w:cnfStyle w:val="000000100000" w:firstRow="0" w:lastRow="0" w:firstColumn="0" w:lastColumn="0" w:oddVBand="0" w:evenVBand="0" w:oddHBand="1" w:evenHBand="0" w:firstRowFirstColumn="0" w:firstRowLastColumn="0" w:lastRowFirstColumn="0" w:lastRowLastColumn="0"/>
+          <w:trHeight w:val="576"/>
+        </w:trPr>
+        <w:tc>
+          <w:tcPr>
+            <w:cnfStyle w:val="001000000000" w:firstRow="0" w:lastRow="0" w:firstColumn="1" w:lastColumn="0" w:oddVBand="0" w:evenVBand="0" w:oddHBand="0" w:evenHBand="0" w:firstRowFirstColumn="0" w:firstRowLastColumn="0" w:lastRowFirstColumn="0" w:lastRowLastColumn="0"/>
+            <w:tcW w:w="6565" w:type="dxa"/>
+            <w:vAlign w:val="center"/>
+            <w:hideMark/>
+          </w:tcPr>
+          <w:p>
+            <w:pPr>
+              <w:spacing w:line="278" w:lineRule="auto"/>
+              <w:rPr>
+                <w:lang w:bidi="ar-DZ"/>
+              </w:rPr>
+            </w:pPr>
+            <w:r>
+              <w:rPr>
+                <w:lang w:bidi="ar-DZ"/>
+              </w:rPr>
+              <w:t>Branch — Vehicle</w:t>
+            </w:r>
+          </w:p>
+        </w:tc>
+        <w:tc>
+          <w:tcPr>
+            <w:tcW w:w="2790" w:type="dxa"/>
+            <w:vAlign w:val="center"/>
+            <w:hideMark/>
+          </w:tcPr>
+          <w:p>
+            <w:pPr>
+              <w:spacing w:line="278" w:lineRule="auto"/>
+              <w:cnfStyle w:val="000000100000" w:firstRow="0" w:lastRow="0" w:firstColumn="0" w:lastColumn="0" w:oddVBand="0" w:evenVBand="0" w:oddHBand="1" w:evenHBand="0" w:firstRowFirstColumn="0" w:firstRowLastColumn="0" w:lastRowFirstColumn="0" w:lastRowLastColumn="0"/>
+              <w:rPr>
+                <w:lang w:bidi="ar-DZ"/>
+              </w:rPr>
+            </w:pPr>
+            <w:r>
+              <w:rPr>
+                <w:lang w:bidi="ar-DZ"/>
+              </w:rPr>
+              <w:t>1 : N</w:t>
+            </w:r>
+          </w:p>
+        </w:tc>
+      </w:tr>
+      <w:tr>
+        <w:trPr>
+          <w:trHeight w:val="576"/>
+        </w:trPr>
+        <w:tc>
+          <w:tcPr>
+            <w:cnfStyle w:val="001000000000" w:firstRow="0" w:lastRow="0" w:firstColumn="1" w:lastColumn="0" w:oddVBand="0" w:evenVBand="0" w:oddHBand="0" w:evenHBand="0" w:firstRowFirstColumn="0" w:firstRowLastColumn="0" w:lastRowFirstColumn="0" w:lastRowLastColumn="0"/>
+            <w:tcW w:w="6565" w:type="dxa"/>
+            <w:vAlign w:val="center"/>
+            <w:hideMark/>
+          </w:tcPr>
+          <w:p>
+            <w:pPr>
+              <w:spacing w:line="278" w:lineRule="auto"/>
+              <w:rPr>
+                <w:lang w:bidi="ar-DZ"/>
+              </w:rPr>
+            </w:pPr>
+            <w:r>
+              <w:rPr>
+                <w:lang w:bidi="ar-DZ"/>
+              </w:rPr>
+              <w:t>Customer — Reservation</w:t>
+            </w:r>
+          </w:p>
+        </w:tc>
+        <w:tc>
+          <w:tcPr>
+            <w:tcW w:w="2790" w:type="dxa"/>
+            <w:vAlign w:val="center"/>
+            <w:hideMark/>
+          </w:tcPr>
+          <w:p>
+            <w:pPr>
+              <w:spacing w:line="278" w:lineRule="auto"/>
+              <w:cnfStyle w:val="000000000000" w:firstRow="0" w:lastRow="0" w:firstColumn="0" w:lastColumn="0" w:oddVBand="0" w:evenVBand="0" w:oddHBand="0" w:evenHBand="0" w:firstRowFirstColumn="0" w:firstRowLastColumn="0" w:lastRowFirstColumn="0" w:lastRowLastColumn="0"/>
+              <w:rPr>
+                <w:lang w:bidi="ar-DZ"/>
+              </w:rPr>
+            </w:pPr>
+            <w:r>
+              <w:rPr>
+                <w:lang w:bidi="ar-DZ"/>
+              </w:rPr>
+              <w:t>1 : N</w:t>
+            </w:r>
+          </w:p>
+        </w:tc>
+      </w:tr>
+      <w:tr>
+        <w:trPr>
+          <w:cnfStyle w:val="000000100000" w:firstRow="0" w:lastRow="0" w:firstColumn="0" w:lastColumn="0" w:oddVBand="0" w:evenVBand="0" w:oddHBand="1" w:evenHBand="0" w:firstRowFirstColumn="0" w:firstRowLastColumn="0" w:lastRowFirstColumn="0" w:lastRowLastColumn="0"/>
+          <w:trHeight w:val="576"/>
+        </w:trPr>
+        <w:tc>
+          <w:tcPr>
+            <w:cnfStyle w:val="001000000000" w:firstRow="0" w:lastRow="0" w:firstColumn="1" w:lastColumn="0" w:oddVBand="0" w:evenVBand="0" w:oddHBand="0" w:evenHBand="0" w:firstRowFirstColumn="0" w:firstRowLastColumn="0" w:lastRowFirstColumn="0" w:lastRowLastColumn="0"/>
+            <w:tcW w:w="6565" w:type="dxa"/>
+            <w:vAlign w:val="center"/>
+            <w:hideMark/>
+          </w:tcPr>
+          <w:p>
+            <w:pPr>
+              <w:spacing w:line="278" w:lineRule="auto"/>
+              <w:rPr>
+                <w:lang w:bidi="ar-DZ"/>
+              </w:rPr>
+            </w:pPr>
+            <w:r>
+              <w:rPr>
+                <w:lang w:bidi="ar-DZ"/>
+              </w:rPr>
+              <w:t>Vehicle — Reservation</w:t>
+            </w:r>
+          </w:p>
+        </w:tc>
+        <w:tc>
+          <w:tcPr>
+            <w:tcW w:w="2790" w:type="dxa"/>
+            <w:vAlign w:val="center"/>
+            <w:hideMark/>
+          </w:tcPr>
+          <w:p>
+            <w:pPr>
+              <w:spacing w:line="278" w:lineRule="auto"/>
+              <w:cnfStyle w:val="000000100000" w:firstRow="0" w:lastRow="0" w:firstColumn="0" w:lastColumn="0" w:oddVBand="0" w:evenVBand="0" w:oddHBand="1" w:evenHBand="0" w:firstRowFirstColumn="0" w:firstRowLastColumn="0" w:lastRowFirstColumn="0" w:lastRowLastColumn="0"/>
+              <w:rPr>
+                <w:lang w:bidi="ar-DZ"/>
+              </w:rPr>
+            </w:pPr>
+            <w:r>
+              <w:rPr>
+                <w:lang w:bidi="ar-DZ"/>
+              </w:rPr>
+              <w:t>1 : N</w:t>
+            </w:r>
+          </w:p>
+        </w:tc>
+      </w:tr>
+      <w:tr>
+        <w:trPr>
+          <w:trHeight w:val="576"/>
+        </w:trPr>
+        <w:tc>
+          <w:tcPr>
+            <w:cnfStyle w:val="001000000000" w:firstRow="0" w:lastRow="0" w:firstColumn="1" w:lastColumn="0" w:oddVBand="0" w:evenVBand="0" w:oddHBand="0" w:evenHBand="0" w:firstRowFirstColumn="0" w:firstRowLastColumn="0" w:lastRowFirstColumn="0" w:lastRowLastColumn="0"/>
+            <w:tcW w:w="6565" w:type="dxa"/>
+            <w:vAlign w:val="center"/>
+            <w:hideMark/>
+          </w:tcPr>
+          <w:p>
+            <w:pPr>
+              <w:spacing w:line="278" w:lineRule="auto"/>
+              <w:rPr>
+                <w:lang w:bidi="ar-DZ"/>
+              </w:rPr>
+            </w:pPr>
+            <w:r>
+              <w:rPr>
+                <w:lang w:bidi="ar-DZ"/>
+              </w:rPr>
+              <w:t>Reservation — Payment</w:t>
+            </w:r>
+          </w:p>
+        </w:tc>
+        <w:tc>
+          <w:tcPr>
+            <w:tcW w:w="2790" w:type="dxa"/>
+            <w:vAlign w:val="center"/>
+            <w:hideMark/>
+          </w:tcPr>
+          <w:p>
+            <w:pPr>
+              <w:spacing w:line="278" w:lineRule="auto"/>
+              <w:cnfStyle w:val="000000000000" w:firstRow="0" w:lastRow="0" w:firstColumn="0" w:lastColumn="0" w:oddVBand="0" w:evenVBand="0" w:oddHBand="0" w:evenHBand="0" w:firstRowFirstColumn="0" w:firstRowLastColumn="0" w:lastRowFirstColumn="0" w:lastRowLastColumn="0"/>
+              <w:rPr>
+                <w:lang w:bidi="ar-DZ"/>
+              </w:rPr>
+            </w:pPr>
+            <w:r>
+              <w:rPr>
+                <w:lang w:bidi="ar-DZ"/>
+              </w:rPr>
+              <w:t>1 : 1</w:t>
+            </w:r>
+          </w:p>
+        </w:tc>
+      </w:tr>
+      <w:tr>
+        <w:trPr>
+          <w:cnfStyle w:val="000000100000" w:firstRow="0" w:lastRow="0" w:firstColumn="0" w:lastColumn="0" w:oddVBand="0" w:evenVBand="0" w:oddHBand="1" w:evenHBand="0" w:firstRowFirstColumn="0" w:firstRowLastColumn="0" w:lastRowFirstColumn="0" w:lastRowLastColumn="0"/>
+          <w:trHeight w:val="576"/>
+        </w:trPr>
+        <w:tc>
+          <w:tcPr>
+            <w:cnfStyle w:val="001000000000" w:firstRow="0" w:lastRow="0" w:firstColumn="1" w:lastColumn="0" w:oddVBand="0" w:evenVBand="0" w:oddHBand="0" w:evenHBand="0" w:firstRowFirstColumn="0" w:firstRowLastColumn="0" w:lastRowFirstColumn="0" w:lastRowLastColumn="0"/>
+            <w:tcW w:w="6565" w:type="dxa"/>
+            <w:vAlign w:val="center"/>
+            <w:hideMark/>
+          </w:tcPr>
+          <w:p>
+            <w:pPr>
+              <w:spacing w:line="278" w:lineRule="auto"/>
+              <w:rPr>
+                <w:lang w:bidi="ar-DZ"/>
+              </w:rPr>
+            </w:pPr>
+            <w:r>
+              <w:rPr>
+                <w:lang w:bidi="ar-DZ"/>
+              </w:rPr>
+              <w:t>Reservation — Review</w:t>
+            </w:r>
+          </w:p>
+        </w:tc>
+        <w:tc>
+          <w:tcPr>
+            <w:tcW w:w="2790" w:type="dxa"/>
+            <w:vAlign w:val="center"/>
+            <w:hideMark/>
+          </w:tcPr>
+          <w:p>
+            <w:pPr>
+              <w:spacing w:line="278" w:lineRule="auto"/>
+              <w:cnfStyle w:val="000000100000" w:firstRow="0" w:lastRow="0" w:firstColumn="0" w:lastColumn="0" w:oddVBand="0" w:evenVBand="0" w:oddHBand="1" w:evenHBand="0" w:firstRowFirstColumn="0" w:firstRowLastColumn="0" w:lastRowFirstColumn="0" w:lastRowLastColumn="0"/>
+              <w:rPr>
+                <w:lang w:bidi="ar-DZ"/>
+              </w:rPr>
+            </w:pPr>
+            <w:r>
+              <w:rPr>
+                <w:lang w:bidi="ar-DZ"/>
+              </w:rPr>
+              <w:t>1 : 0..1</w:t>
+            </w:r>
+          </w:p>
+        </w:tc>
+      </w:tr>
+      <w:tr>
+        <w:trPr>
+          <w:trHeight w:val="576"/>
+        </w:trPr>
+        <w:tc>
+          <w:tcPr>
+            <w:cnfStyle w:val="001000000000" w:firstRow="0" w:lastRow="0" w:firstColumn="1" w:lastColumn="0" w:oddVBand="0" w:evenVBand="0" w:oddHBand="0" w:evenHBand="0" w:firstRowFirstColumn="0" w:firstRowLastColumn="0" w:lastRowFirstColumn="0" w:lastRowLastColumn="0"/>
+            <w:tcW w:w="6565" w:type="dxa"/>
+            <w:vAlign w:val="center"/>
+            <w:hideMark/>
+          </w:tcPr>
+          <w:p>
+            <w:pPr>
+              <w:spacing w:line="278" w:lineRule="auto"/>
+              <w:rPr>
+                <w:lang w:bidi="ar-DZ"/>
+              </w:rPr>
+            </w:pPr>
+            <w:r>
+              <w:rPr>
+                <w:lang w:bidi="ar-DZ"/>
+              </w:rPr>
+              <w:t>Customer — Review</w:t>
+            </w:r>
+          </w:p>
+        </w:tc>
+        <w:tc>
+          <w:tcPr>
+            <w:tcW w:w="2790" w:type="dxa"/>
+            <w:vAlign w:val="center"/>
+            <w:hideMark/>
+          </w:tcPr>
+          <w:p>
+            <w:pPr>
+              <w:spacing w:line="278" w:lineRule="auto"/>
+              <w:cnfStyle w:val="000000000000" w:firstRow="0" w:lastRow="0" w:firstColumn="0" w:lastColumn="0" w:oddVBand="0" w:evenVBand="0" w:oddHBand="0" w:evenHBand="0" w:firstRowFirstColumn="0" w:firstRowLastColumn="0" w:lastRowFirstColumn="0" w:lastRowLastColumn="0"/>
+              <w:rPr>
+                <w:lang w:bidi="ar-DZ"/>
+              </w:rPr>
+            </w:pPr>
+            <w:r>
+              <w:rPr>
+                <w:lang w:bidi="ar-DZ"/>
+              </w:rPr>
+              <w:t>1 : N</w:t>
+            </w:r>
+          </w:p>
+        </w:tc>
+      </w:tr>
+      <w:tr>
+        <w:trPr>
+          <w:cnfStyle w:val="000000100000" w:firstRow="0" w:lastRow="0" w:firstColumn="0" w:lastColumn="0" w:oddVBand="0" w:evenVBand="0" w:oddHBand="1" w:evenHBand="0" w:firstRowFirstColumn="0" w:firstRowLastColumn="0" w:lastRowFirstColumn="0" w:lastRowLastColumn="0"/>
+          <w:trHeight w:val="576"/>
+        </w:trPr>
+        <w:tc>
+          <w:tcPr>
+            <w:cnfStyle w:val="001000000000" w:firstRow="0" w:lastRow="0" w:firstColumn="1" w:lastColumn="0" w:oddVBand="0" w:evenVBand="0" w:oddHBand="0" w:evenHBand="0" w:firstRowFirstColumn="0" w:firstRowLastColumn="0" w:lastRowFirstColumn="0" w:lastRowLastColumn="0"/>
+            <w:tcW w:w="6565" w:type="dxa"/>
+            <w:vAlign w:val="center"/>
+            <w:hideMark/>
+          </w:tcPr>
+          <w:p>
+            <w:pPr>
+              <w:spacing w:line="278" w:lineRule="auto"/>
+              <w:rPr>
+                <w:lang w:bidi="ar-DZ"/>
+              </w:rPr>
+            </w:pPr>
+            <w:r>
+              <w:rPr>
+                <w:lang w:bidi="ar-DZ"/>
+              </w:rPr>
+              <w:lastRenderedPageBreak/>
+              <w:t>Reservation — Dispute</w:t>
+            </w:r>
+          </w:p>
+        </w:tc>
+        <w:tc>
+          <w:tcPr>
+            <w:tcW w:w="2790" w:type="dxa"/>
+            <w:vAlign w:val="center"/>
+            <w:hideMark/>
+          </w:tcPr>
+          <w:p>
+            <w:pPr>
+              <w:spacing w:line="278" w:lineRule="auto"/>
+              <w:cnfStyle w:val="000000100000" w:firstRow="0" w:lastRow="0" w:firstColumn="0" w:lastColumn="0" w:oddVBand="0" w:evenVBand="0" w:oddHBand="1" w:evenHBand="0" w:firstRowFirstColumn="0" w:firstRowLastColumn="0" w:lastRowFirstColumn="0" w:lastRowLastColumn="0"/>
+              <w:rPr>
+                <w:lang w:bidi="ar-DZ"/>
+              </w:rPr>
+            </w:pPr>
+            <w:r>
+              <w:rPr>
+                <w:lang w:bidi="ar-DZ"/>
+              </w:rPr>
+              <w:t>1 : 0..N</w:t>
+            </w:r>
+          </w:p>
+        </w:tc>
+      </w:tr>
+      <w:tr>
+        <w:trPr>
+          <w:trHeight w:val="576"/>
+        </w:trPr>
+        <w:tc>
+          <w:tcPr>
+            <w:cnfStyle w:val="001000000000" w:firstRow="0" w:lastRow="0" w:firstColumn="1" w:lastColumn="0" w:oddVBand="0" w:evenVBand="0" w:oddHBand="0" w:evenHBand="0" w:firstRowFirstColumn="0" w:firstRowLastColumn="0" w:lastRowFirstColumn="0" w:lastRowLastColumn="0"/>
+            <w:tcW w:w="6565" w:type="dxa"/>
+            <w:vAlign w:val="center"/>
+            <w:hideMark/>
+          </w:tcPr>
+          <w:p>
+            <w:pPr>
+              <w:spacing w:line="278" w:lineRule="auto"/>
+              <w:rPr>
+                <w:lang w:bidi="ar-DZ"/>
+              </w:rPr>
+            </w:pPr>
+            <w:r>
+              <w:rPr>
+                <w:lang w:bidi="ar-DZ"/>
+              </w:rPr>
+              <w:t>User — Notification</w:t>
+            </w:r>
+          </w:p>
+        </w:tc>
+        <w:tc>
+          <w:tcPr>
+            <w:tcW w:w="2790" w:type="dxa"/>
+            <w:vAlign w:val="center"/>
+            <w:hideMark/>
+          </w:tcPr>
+          <w:p>
+            <w:pPr>
+              <w:spacing w:line="278" w:lineRule="auto"/>
+              <w:cnfStyle w:val="000000000000" w:firstRow="0" w:lastRow="0" w:firstColumn="0" w:lastColumn="0" w:oddVBand="0" w:evenVBand="0" w:oddHBand="0" w:evenHBand="0" w:firstRowFirstColumn="0" w:firstRowLastColumn="0" w:lastRowFirstColumn="0" w:lastRowLastColumn="0"/>
+              <w:rPr>
+                <w:lang w:bidi="ar-DZ"/>
+              </w:rPr>
+            </w:pPr>
+            <w:r>
+              <w:rPr>
+                <w:lang w:bidi="ar-DZ"/>
+              </w:rPr>
+              <w:t>1 : N</w:t>
+            </w:r>
+          </w:p>
+        </w:tc>
+      </w:tr>
+      <w:tr>
+        <w:trPr>
+          <w:cnfStyle w:val="000000100000" w:firstRow="0" w:lastRow="0" w:firstColumn="0" w:lastColumn="0" w:oddVBand="0" w:evenVBand="0" w:oddHBand="1" w:evenHBand="0" w:firstRowFirstColumn="0" w:firstRowLastColumn="0" w:lastRowFirstColumn="0" w:lastRowLastColumn="0"/>
+          <w:trHeight w:val="576"/>
+        </w:trPr>
+        <w:tc>
+          <w:tcPr>
+            <w:cnfStyle w:val="001000000000" w:firstRow="0" w:lastRow="0" w:firstColumn="1" w:lastColumn="0" w:oddVBand="0" w:evenVBand="0" w:oddHBand="0" w:evenHBand="0" w:firstRowFirstColumn="0" w:firstRowLastColumn="0" w:lastRowFirstColumn="0" w:lastRowLastColumn="0"/>
+            <w:tcW w:w="6565" w:type="dxa"/>
+            <w:vAlign w:val="center"/>
+            <w:hideMark/>
+          </w:tcPr>
+          <w:p>
+            <w:pPr>
+              <w:spacing w:line="278" w:lineRule="auto"/>
+              <w:rPr>
+                <w:lang w:bidi="ar-DZ"/>
+              </w:rPr>
+            </w:pPr>
+            <w:r>
+              <w:rPr>
+                <w:lang w:bidi="ar-DZ"/>
+              </w:rPr>
+              <w:t>Customer — AI Recommendation</w:t>
+            </w:r>
+          </w:p>
+        </w:tc>
+        <w:tc>
+          <w:tcPr>
+            <w:tcW w:w="2790" w:type="dxa"/>
+            <w:vAlign w:val="center"/>
+            <w:hideMark/>
+          </w:tcPr>
+          <w:p>
+            <w:pPr>
+              <w:spacing w:line="278" w:lineRule="auto"/>
+              <w:cnfStyle w:val="000000100000" w:firstRow="0" w:lastRow="0" w:firstColumn="0" w:lastColumn="0" w:oddVBand="0" w:evenVBand="0" w:oddHBand="1" w:evenHBand="0" w:firstRowFirstColumn="0" w:firstRowLastColumn="0" w:lastRowFirstColumn="0" w:lastRowLastColumn="0"/>
+              <w:rPr>
+                <w:lang w:bidi="ar-DZ"/>
+              </w:rPr>
+            </w:pPr>
+            <w:r>
+              <w:rPr>
+                <w:lang w:bidi="ar-DZ"/>
+              </w:rPr>
+              <w:t>1 : N</w:t>
+            </w:r>
+          </w:p>
+        </w:tc>
+      </w:tr>
+      <w:tr>
+        <w:trPr>
+          <w:trHeight w:val="576"/>
+        </w:trPr>
+        <w:tc>
+          <w:tcPr>
+            <w:cnfStyle w:val="001000000000" w:firstRow="0" w:lastRow="0" w:firstColumn="1" w:lastColumn="0" w:oddVBand="0" w:evenVBand="0" w:oddHBand="0" w:evenHBand="0" w:firstRowFirstColumn="0" w:firstRowLastColumn="0" w:lastRowFirstColumn="0" w:lastRowLastColumn="0"/>
+            <w:tcW w:w="6565" w:type="dxa"/>
+            <w:vAlign w:val="center"/>
+            <w:hideMark/>
+          </w:tcPr>
+          <w:p>
+            <w:pPr>
+              <w:spacing w:line="278" w:lineRule="auto"/>
+              <w:rPr>
+                <w:lang w:bidi="ar-DZ"/>
+              </w:rPr>
+            </w:pPr>
+            <w:r>
+              <w:rPr>
+                <w:lang w:bidi="ar-DZ"/>
+              </w:rPr>
+              <w:t>Vehicle — AI Recommendation</w:t>
+            </w:r>
+          </w:p>
+        </w:tc>
+        <w:tc>
+          <w:tcPr>
+            <w:tcW w:w="2790" w:type="dxa"/>
+            <w:vAlign w:val="center"/>
+            <w:hideMark/>
+          </w:tcPr>
+          <w:p>
+            <w:pPr>
+              <w:spacing w:line="278" w:lineRule="auto"/>
+              <w:cnfStyle w:val="000000000000" w:firstRow="0" w:lastRow="0" w:firstColumn="0" w:lastColumn="0" w:oddVBand="0" w:evenVBand="0" w:oddHBand="0" w:evenHBand="0" w:firstRowFirstColumn="0" w:firstRowLastColumn="0" w:lastRowFirstColumn="0" w:lastRowLastColumn="0"/>
+              <w:rPr>
+                <w:lang w:bidi="ar-DZ"/>
+              </w:rPr>
+            </w:pPr>
+            <w:r>
+              <w:rPr>
+                <w:lang w:bidi="ar-DZ"/>
+              </w:rPr>
+              <w:t>1 : N</w:t>
+            </w:r>
+          </w:p>
+        </w:tc>
+      </w:tr>
+      <w:tr>
+        <w:trPr>
+          <w:cnfStyle w:val="000000100000" w:firstRow="0" w:lastRow="0" w:firstColumn="0" w:lastColumn="0" w:oddVBand="0" w:evenVBand="0" w:oddHBand="1" w:evenHBand="0" w:firstRowFirstColumn="0" w:firstRowLastColumn="0" w:lastRowFirstColumn="0" w:lastRowLastColumn="0"/>
+          <w:trHeight w:val="576"/>
+        </w:trPr>
+        <w:tc>
+          <w:tcPr>
+            <w:cnfStyle w:val="001000000000" w:firstRow="0" w:lastRow="0" w:firstColumn="1" w:lastColumn="0" w:oddVBand="0" w:evenVBand="0" w:oddHBand="0" w:evenHBand="0" w:firstRowFirstColumn="0" w:firstRowLastColumn="0" w:lastRowFirstColumn="0" w:lastRowLastColumn="0"/>
+            <w:tcW w:w="6565" w:type="dxa"/>
+            <w:vAlign w:val="center"/>
+            <w:hideMark/>
+          </w:tcPr>
+          <w:p>
+            <w:pPr>
+              <w:spacing w:line="278" w:lineRule="auto"/>
+              <w:rPr>
+                <w:lang w:bidi="ar-DZ"/>
+              </w:rPr>
+            </w:pPr>
+            <w:r>
+              <w:rPr>
+                <w:lang w:bidi="ar-DZ"/>
+              </w:rPr>
+              <w:t>Customer — AI Conversation</w:t>
+            </w:r>
+          </w:p>
+        </w:tc>
+        <w:tc>
+          <w:tcPr>
+            <w:tcW w:w="2790" w:type="dxa"/>
+            <w:vAlign w:val="center"/>
+            <w:hideMark/>
+          </w:tcPr>
+          <w:p>
+            <w:pPr>
+              <w:spacing w:line="278" w:lineRule="auto"/>
+              <w:cnfStyle w:val="000000100000" w:firstRow="0" w:lastRow="0" w:firstColumn="0" w:lastColumn="0" w:oddVBand="0" w:evenVBand="0" w:oddHBand="1" w:evenHBand="0" w:firstRowFirstColumn="0" w:firstRowLastColumn="0" w:lastRowFirstColumn="0" w:lastRowLastColumn="0"/>
+              <w:rPr>
+                <w:lang w:bidi="ar-DZ"/>
+              </w:rPr>
+            </w:pPr>
+            <w:r>
+              <w:rPr>
+                <w:lang w:bidi="ar-DZ"/>
+              </w:rPr>
+              <w:t>1 : N</w:t>
+            </w:r>
+          </w:p>
+        </w:tc>
+      </w:tr>
+      <w:tr>
+        <w:trPr>
+          <w:trHeight w:val="576"/>
+        </w:trPr>
+        <w:tc>
+          <w:tcPr>
+            <w:cnfStyle w:val="001000000000" w:firstRow="0" w:lastRow="0" w:firstColumn="1" w:lastColumn="0" w:oddVBand="0" w:evenVBand="0" w:oddHBand="0" w:evenHBand="0" w:firstRowFirstColumn="0" w:firstRowLastColumn="0" w:lastRowFirstColumn="0" w:lastRowLastColumn="0"/>
+            <w:tcW w:w="6565" w:type="dxa"/>
+            <w:vAlign w:val="center"/>
+            <w:hideMark/>
+          </w:tcPr>
+          <w:p>
+            <w:pPr>
+              <w:spacing w:line="278" w:lineRule="auto"/>
+              <w:rPr>
+                <w:lang w:bidi="ar-DZ"/>
+              </w:rPr>
+            </w:pPr>
+            <w:r>
+              <w:rPr>
+                <w:lang w:bidi="ar-DZ"/>
+              </w:rPr>
+              <w:t>User (Administrator) — Analytics Report</w:t>
+            </w:r>
+          </w:p>
+        </w:tc>
+        <w:tc>
+          <w:tcPr>
+            <w:tcW w:w="2790" w:type="dxa"/>
+            <w:vAlign w:val="center"/>
+            <w:hideMark/>
+          </w:tcPr>
+          <w:p>
+            <w:pPr>
+              <w:spacing w:line="278" w:lineRule="auto"/>
+              <w:cnfStyle w:val="000000000000" w:firstRow="0" w:lastRow="0" w:firstColumn="0" w:lastColumn="0" w:oddVBand="0" w:evenVBand="0" w:oddHBand="0" w:evenHBand="0" w:firstRowFirstColumn="0" w:firstRowLastColumn="0" w:lastRowFirstColumn="0" w:lastRowLastColumn="0"/>
+              <w:rPr>
+                <w:lang w:bidi="ar-DZ"/>
+              </w:rPr>
+            </w:pPr>
+            <w:r>
+              <w:rPr>
+                <w:lang w:bidi="ar-DZ"/>
+              </w:rPr>
+              <w:t>1 : N</w:t>
+            </w:r>
+          </w:p>
+        </w:tc>
+      </w:tr>
+    </w:tbl>
+    <w:p>
+      <w:pPr>
+        <w:rPr>
+          <w:lang w:bidi="ar-DZ"/>
+        </w:rPr>
+      </w:pPr>
+    </w:p>
+    <w:p>
+      <w:pPr>
+        <w:pStyle w:val="Heading3"/>
+        <w:rPr>
+          <w:lang w:bidi="ar-DZ"/>
+        </w:rPr>
+      </w:pPr>
+      <w:r>
+        <w:rPr>
+          <w:lang w:bidi="ar-DZ"/>
+        </w:rPr>
+        <w:t>5.4 Primary and Foreign Keys</w:t>
+      </w:r>
+    </w:p>
+    <w:p>
+      <w:pPr>
+        <w:spacing w:before="240" w:after="0" w:line="278" w:lineRule="auto"/>
+        <w:rPr>
+          <w:lang w:bidi="ar-DZ"/>
+        </w:rPr>
+      </w:pPr>
+      <w:r>
+        <w:rPr>
+          <w:lang w:bidi="ar-DZ"/>
+        </w:rPr>
+        <w:t>The ERD defines unique primary keys for each entity and foreign keys to enforce referential integrity.</w:t>
+      </w:r>
+    </w:p>
+    <w:p>
+      <w:pPr>
+        <w:spacing w:before="240" w:after="0" w:line="278" w:lineRule="auto"/>
+        <w:rPr>
+          <w:lang w:bidi="ar-DZ"/>
+        </w:rPr>
+      </w:pPr>
+      <w:r>
+        <w:rPr>
+          <w:lang w:bidi="ar-DZ"/>
+        </w:rPr>
+        <w:t>Examples include:</w:t>
+      </w:r>
+    </w:p>
+    <w:p>
+      <w:pPr>
+        <w:pStyle w:val="ListParagraph"/>
+        <w:numPr>
+          <w:ilvl w:val="0"/>
+          <w:numId w:val="170"/>
+        </w:numPr>
+        <w:spacing w:before="240" w:after="0" w:line="278" w:lineRule="auto"/>
+        <w:rPr>
+          <w:lang w:bidi="ar-DZ"/>
+        </w:rPr>
+      </w:pPr>
+      <w:r>
+        <w:rPr>
+          <w:b/>
+          <w:bCs/>
+          <w:lang w:bidi="ar-DZ"/>
+        </w:rPr>
+        <w:t>Customer.UserID → User.UserID</w:t>
+      </w:r>
+      <w:r>
+        <w:rPr>
+          <w:lang w:bidi="ar-DZ"/>
+        </w:rPr>
+        <w:t xml:space="preserve"> </w:t>
+      </w:r>
+    </w:p>
+    <w:p>
+      <w:pPr>
+        <w:pStyle w:val="ListParagraph"/>
+        <w:numPr>
+          <w:ilvl w:val="0"/>
+          <w:numId w:val="170"/>
+        </w:numPr>
+        <w:spacing w:before="240" w:after="0" w:line="278" w:lineRule="auto"/>
+        <w:rPr>
+          <w:lang w:bidi="ar-DZ"/>
+        </w:rPr>
+      </w:pPr>
+      <w:r>
+        <w:rPr>
+          <w:b/>
+          <w:bCs/>
+          <w:lang w:bidi="ar-DZ"/>
+        </w:rPr>
+        <w:t>Agency.UserID → User.UserID</w:t>
+      </w:r>
+      <w:r>
+        <w:rPr>
+          <w:lang w:bidi="ar-DZ"/>
+        </w:rPr>
+        <w:t xml:space="preserve"> </w:t>
+      </w:r>
+    </w:p>
+    <w:p>
+      <w:pPr>
+        <w:pStyle w:val="ListParagraph"/>
+        <w:numPr>
+          <w:ilvl w:val="0"/>
+          <w:numId w:val="170"/>
+        </w:numPr>
+        <w:spacing w:before="240" w:after="0" w:line="278" w:lineRule="auto"/>
+        <w:rPr>
+          <w:lang w:bidi="ar-DZ"/>
+        </w:rPr>
+      </w:pPr>
+      <w:r>
+        <w:rPr>
+          <w:b/>
+          <w:bCs/>
+          <w:lang w:bidi="ar-DZ"/>
+        </w:rPr>
+        <w:t>AgencyVerification.AgencyID → Agency.AgencyID</w:t>
+      </w:r>
+      <w:r>
+        <w:rPr>
+          <w:lang w:bidi="ar-DZ"/>
+        </w:rPr>
+        <w:t xml:space="preserve"> </w:t>
+      </w:r>
+    </w:p>
+    <w:p>
+      <w:pPr>
+        <w:pStyle w:val="ListParagraph"/>
+        <w:numPr>
+          <w:ilvl w:val="0"/>
+          <w:numId w:val="170"/>
+        </w:numPr>
+        <w:spacing w:before="240" w:after="0" w:line="278" w:lineRule="auto"/>
+        <w:rPr>
+          <w:lang w:bidi="ar-DZ"/>
+        </w:rPr>
+      </w:pPr>
+      <w:r>
+        <w:rPr>
+          <w:b/>
+          <w:bCs/>
+          <w:lang w:bidi="ar-DZ"/>
+        </w:rPr>
+        <w:t>Branch.AgencyID → Agency.AgencyID</w:t>
+      </w:r>
+      <w:r>
+        <w:rPr>
+          <w:lang w:bidi="ar-DZ"/>
+        </w:rPr>
+        <w:t xml:space="preserve"> </w:t>
+      </w:r>
+    </w:p>
+    <w:p>
+      <w:pPr>
+        <w:pStyle w:val="ListParagraph"/>
+        <w:numPr>
+          <w:ilvl w:val="0"/>
+          <w:numId w:val="170"/>
+        </w:numPr>
+        <w:spacing w:before="240" w:after="0" w:line="278" w:lineRule="auto"/>
+        <w:rPr>
+          <w:lang w:bidi="ar-DZ"/>
+        </w:rPr>
+      </w:pPr>
+      <w:r>
+        <w:rPr>
+          <w:b/>
+          <w:bCs/>
+          <w:lang w:bidi="ar-DZ"/>
+        </w:rPr>
+        <w:t>Employee.BranchID → Branch.BranchID</w:t>
+      </w:r>
+      <w:r>
+        <w:rPr>
+          <w:lang w:bidi="ar-DZ"/>
+        </w:rPr>
+        <w:t xml:space="preserve"> </w:t>
+      </w:r>
+    </w:p>
+    <w:p>
+      <w:pPr>
+        <w:pStyle w:val="ListParagraph"/>
+        <w:numPr>
+          <w:ilvl w:val="0"/>
+          <w:numId w:val="170"/>
+        </w:numPr>
+        <w:spacing w:before="240" w:after="0" w:line="278" w:lineRule="auto"/>
+        <w:rPr>
+          <w:lang w:bidi="ar-DZ"/>
+        </w:rPr>
+      </w:pPr>
+      <w:r>
+        <w:rPr>
+          <w:b/>
+          <w:bCs/>
+          <w:lang w:bidi="ar-DZ"/>
+        </w:rPr>
+        <w:t>Vehicle.AgencyID → Agency.AgencyID</w:t>
+      </w:r>
+      <w:r>
+        <w:rPr>
+          <w:lang w:bidi="ar-DZ"/>
+        </w:rPr>
+        <w:t xml:space="preserve"> </w:t>
+      </w:r>
+    </w:p>
+    <w:p>
+      <w:pPr>
+        <w:pStyle w:val="ListParagraph"/>
+        <w:numPr>
+          <w:ilvl w:val="0"/>
+          <w:numId w:val="170"/>
+        </w:numPr>
+        <w:spacing w:before="240" w:after="0" w:line="278" w:lineRule="auto"/>
+        <w:rPr>
+          <w:lang w:bidi="ar-DZ"/>
+        </w:rPr>
+      </w:pPr>
+      <w:r>
+        <w:rPr>
+          <w:b/>
+          <w:bCs/>
+          <w:lang w:bidi="ar-DZ"/>
+        </w:rPr>
+        <w:t>Vehicle.BranchID → Branch.BranchID</w:t>
+      </w:r>
+      <w:r>
+        <w:rPr>
+          <w:lang w:bidi="ar-DZ"/>
+        </w:rPr>
+        <w:t xml:space="preserve"> </w:t>
+      </w:r>
+    </w:p>
+    <w:p>
+      <w:pPr>
+        <w:pStyle w:val="ListParagraph"/>
+        <w:numPr>
+          <w:ilvl w:val="0"/>
+          <w:numId w:val="170"/>
+        </w:numPr>
+        <w:spacing w:before="240" w:after="0" w:line="278" w:lineRule="auto"/>
+        <w:rPr>
+          <w:lang w:bidi="ar-DZ"/>
+        </w:rPr>
+      </w:pPr>
+      <w:r>
+        <w:rPr>
+          <w:b/>
+          <w:bCs/>
+          <w:lang w:bidi="ar-DZ"/>
+        </w:rPr>
+        <w:t>Reservation.CustomerID → Customer.CustomerID</w:t>
+      </w:r>
+      <w:r>
+        <w:rPr>
+          <w:lang w:bidi="ar-DZ"/>
+        </w:rPr>
+        <w:t xml:space="preserve"> </w:t>
+      </w:r>
+    </w:p>
+    <w:p>
+      <w:pPr>
+        <w:pStyle w:val="ListParagraph"/>
+        <w:numPr>
+          <w:ilvl w:val="0"/>
+          <w:numId w:val="170"/>
+        </w:numPr>
+        <w:spacing w:before="240" w:after="0" w:line="278" w:lineRule="auto"/>
+        <w:rPr>
+          <w:lang w:bidi="ar-DZ"/>
+        </w:rPr>
+      </w:pPr>
+      <w:r>
+        <w:rPr>
+          <w:b/>
+          <w:bCs/>
+          <w:lang w:bidi="ar-DZ"/>
+        </w:rPr>
+        <w:t>Reservation.VehicleID → Vehicle.VehicleID</w:t>
+      </w:r>
+      <w:r>
+        <w:rPr>
+          <w:lang w:bidi="ar-DZ"/>
+        </w:rPr>
+        <w:t xml:space="preserve"> </w:t>
+      </w:r>
+    </w:p>
+    <w:p>
+      <w:pPr>
+        <w:pStyle w:val="ListParagraph"/>
+        <w:numPr>
+          <w:ilvl w:val="0"/>
+          <w:numId w:val="170"/>
+        </w:numPr>
+        <w:spacing w:before="240" w:after="0" w:line="278" w:lineRule="auto"/>
+        <w:rPr>
+          <w:lang w:bidi="ar-DZ"/>
+        </w:rPr>
+      </w:pPr>
+      <w:r>
+        <w:rPr>
+          <w:b/>
+          <w:bCs/>
+          <w:lang w:bidi="ar-DZ"/>
+        </w:rPr>
+        <w:t>Payment.ReservationID → Reservation.ReservationID</w:t>
+      </w:r>
+      <w:r>
+        <w:rPr>
+          <w:lang w:bidi="ar-DZ"/>
+        </w:rPr>
+        <w:t xml:space="preserve"> </w:t>
+      </w:r>
+    </w:p>
+    <w:p>
+      <w:pPr>
+        <w:pStyle w:val="ListParagraph"/>
+        <w:numPr>
+          <w:ilvl w:val="0"/>
+          <w:numId w:val="170"/>
+        </w:numPr>
+        <w:spacing w:before="240" w:after="0" w:line="278" w:lineRule="auto"/>
+        <w:rPr>
+          <w:lang w:bidi="ar-DZ"/>
+        </w:rPr>
+      </w:pPr>
+      <w:r>
+        <w:rPr>
+          <w:b/>
+          <w:bCs/>
+          <w:lang w:bidi="ar-DZ"/>
+        </w:rPr>
+        <w:t>Review.CustomerID → Customer.CustomerID</w:t>
+      </w:r>
+      <w:r>
+        <w:rPr>
+          <w:lang w:bidi="ar-DZ"/>
+        </w:rPr>
+        <w:t xml:space="preserve"> </w:t>
+      </w:r>
+    </w:p>
+    <w:p>
+      <w:pPr>
+        <w:pStyle w:val="ListParagraph"/>
+        <w:numPr>
+          <w:ilvl w:val="0"/>
+          <w:numId w:val="170"/>
+        </w:numPr>
+        <w:spacing w:before="240" w:after="0" w:line="278" w:lineRule="auto"/>
+        <w:rPr>
+          <w:lang w:bidi="ar-DZ"/>
+        </w:rPr>
+      </w:pPr>
+      <w:r>
+        <w:rPr>
+          <w:b/>
+          <w:bCs/>
+          <w:lang w:bidi="ar-DZ"/>
+        </w:rPr>
+        <w:t>Review.ReservationID → Reservation.ReservationID</w:t>
+      </w:r>
+      <w:r>
+        <w:rPr>
+          <w:lang w:bidi="ar-DZ"/>
+        </w:rPr>
+        <w:t xml:space="preserve"> </w:t>
+      </w:r>
+    </w:p>
+    <w:p>
+      <w:pPr>
+        <w:pStyle w:val="ListParagraph"/>
+        <w:numPr>
+          <w:ilvl w:val="0"/>
+          <w:numId w:val="170"/>
+        </w:numPr>
+        <w:spacing w:before="240" w:after="0" w:line="278" w:lineRule="auto"/>
+        <w:rPr>
+          <w:lang w:bidi="ar-DZ"/>
+        </w:rPr>
+      </w:pPr>
+      <w:r>
+        <w:rPr>
+          <w:b/>
+          <w:bCs/>
+          <w:lang w:bidi="ar-DZ"/>
+        </w:rPr>
+        <w:t>Dispute.ReservationID → Reservation.ReservationID</w:t>
+      </w:r>
+      <w:r>
+        <w:rPr>
+          <w:lang w:bidi="ar-DZ"/>
+        </w:rPr>
+        <w:t xml:space="preserve"> </w:t>
+      </w:r>
+    </w:p>
+    <w:p>
+      <w:pPr>
+        <w:pStyle w:val="ListParagraph"/>
+        <w:numPr>
+          <w:ilvl w:val="0"/>
+          <w:numId w:val="170"/>
+        </w:numPr>
+        <w:spacing w:before="240" w:after="0" w:line="278" w:lineRule="auto"/>
+        <w:rPr>
+          <w:lang w:bidi="ar-DZ"/>
+        </w:rPr>
+      </w:pPr>
+      <w:r>
+        <w:rPr>
+          <w:b/>
+          <w:bCs/>
+          <w:lang w:bidi="ar-DZ"/>
+        </w:rPr>
+        <w:t>Notification.UserID → User.UserID</w:t>
+      </w:r>
+      <w:r>
+        <w:rPr>
+          <w:lang w:bidi="ar-DZ"/>
+        </w:rPr>
+        <w:t xml:space="preserve"> </w:t>
+      </w:r>
+    </w:p>
+    <w:p>
+      <w:pPr>
+        <w:pStyle w:val="ListParagraph"/>
+        <w:numPr>
+          <w:ilvl w:val="0"/>
+          <w:numId w:val="170"/>
+        </w:numPr>
+        <w:spacing w:before="240" w:after="0" w:line="278" w:lineRule="auto"/>
+        <w:rPr>
+          <w:lang w:bidi="ar-DZ"/>
+        </w:rPr>
+      </w:pPr>
+      <w:r>
+        <w:rPr>
+          <w:b/>
+          <w:bCs/>
+          <w:lang w:bidi="ar-DZ"/>
+        </w:rPr>
+        <w:t>AIRecommendation.CustomerID → Customer.CustomerID</w:t>
+      </w:r>
+      <w:r>
+        <w:rPr>
+          <w:lang w:bidi="ar-DZ"/>
+        </w:rPr>
+        <w:t xml:space="preserve"> </w:t>
+      </w:r>
+    </w:p>
+    <w:p>
+      <w:pPr>
+        <w:pStyle w:val="ListParagraph"/>
+        <w:numPr>
+          <w:ilvl w:val="0"/>
+          <w:numId w:val="170"/>
+        </w:numPr>
+        <w:spacing w:before="240" w:after="0" w:line="278" w:lineRule="auto"/>
+        <w:rPr>
+          <w:lang w:bidi="ar-DZ"/>
+        </w:rPr>
+      </w:pPr>
+      <w:r>
+        <w:rPr>
+          <w:b/>
+          <w:bCs/>
+          <w:lang w:bidi="ar-DZ"/>
+        </w:rPr>
+        <w:t>AIRecommendation.VehicleID → Vehicle.VehicleID</w:t>
+      </w:r>
+      <w:r>
+        <w:rPr>
+          <w:lang w:bidi="ar-DZ"/>
+        </w:rPr>
+        <w:t xml:space="preserve"> </w:t>
+      </w:r>
+    </w:p>
+    <w:p>
+      <w:pPr>
+        <w:pStyle w:val="ListParagraph"/>
+        <w:numPr>
+          <w:ilvl w:val="0"/>
+          <w:numId w:val="170"/>
+        </w:numPr>
+        <w:spacing w:before="240" w:after="0" w:line="278" w:lineRule="auto"/>
+        <w:rPr>
+          <w:lang w:bidi="ar-DZ"/>
+        </w:rPr>
+      </w:pPr>
+      <w:r>
+        <w:rPr>
+          <w:b/>
+          <w:bCs/>
+          <w:lang w:bidi="ar-DZ"/>
+        </w:rPr>
+        <w:t>AIConversation.CustomerID → Customer.CustomerID</w:t>
+      </w:r>
+      <w:r>
+        <w:rPr>
+          <w:lang w:bidi="ar-DZ"/>
+        </w:rPr>
+        <w:t xml:space="preserve"> </w:t>
+      </w:r>
+    </w:p>
+    <w:p>
+      <w:pPr>
+        <w:pStyle w:val="ListParagraph"/>
+        <w:numPr>
+          <w:ilvl w:val="0"/>
+          <w:numId w:val="170"/>
+        </w:numPr>
+        <w:spacing w:before="240" w:after="0" w:line="278" w:lineRule="auto"/>
+        <w:rPr>
+          <w:lang w:bidi="ar-DZ"/>
+        </w:rPr>
+      </w:pPr>
+      <w:r>
+        <w:rPr>
+          <w:b/>
+          <w:bCs/>
+          <w:lang w:bidi="ar-DZ"/>
+        </w:rPr>
+        <w:t>AnalyticsReport.GeneratedBy → User.UserID</w:t>
+      </w:r>
+      <w:r>
+        <w:rPr>
+          <w:lang w:bidi="ar-DZ"/>
+        </w:rPr>
+        <w:t xml:space="preserve"> </w:t>
+      </w:r>
+    </w:p>
+    <w:p>
+      <w:pPr>
+        <w:spacing w:before="240" w:after="0" w:line="278" w:lineRule="auto"/>
+        <w:rPr>
+          <w:lang w:bidi="ar-DZ"/>
+        </w:rPr>
+      </w:pPr>
+      <w:r>
+        <w:rPr>
+          <w:lang w:bidi="ar-DZ"/>
+        </w:rPr>
+        <w:t>These foreign keys ensure consistent relationships between records while preventing orphaned data.</w:t>
+      </w:r>
+    </w:p>
+    <w:p>
+      <w:pPr>
+        <w:spacing w:before="240" w:after="0" w:line="278" w:lineRule="auto"/>
+        <w:rPr>
+          <w:lang w:bidi="ar-DZ"/>
+        </w:rPr>
+      </w:pPr>
+    </w:p>
+    <w:p>
+      <w:pPr>
+        <w:pStyle w:val="Heading3"/>
+        <w:rPr>
+          <w:lang w:bidi="ar-DZ"/>
+        </w:rPr>
+      </w:pPr>
+      <w:r>
+        <w:rPr>
+          <w:lang w:bidi="ar-DZ"/>
+        </w:rPr>
+        <w:lastRenderedPageBreak/>
+        <w:t>5.5 ERD Design Characteristics</w:t>
+      </w:r>
+    </w:p>
+    <w:p>
+      <w:pPr>
+        <w:spacing w:before="240" w:after="0" w:line="278" w:lineRule="auto"/>
+        <w:rPr>
+          <w:lang w:bidi="ar-DZ"/>
+        </w:rPr>
+      </w:pPr>
+      <w:r>
+        <w:rPr>
+          <w:lang w:bidi="ar-DZ"/>
+        </w:rPr>
+        <w:t>The Core ERD has been designed according to the following principles:</w:t>
+      </w:r>
+    </w:p>
+    <w:p>
+      <w:pPr>
+        <w:pStyle w:val="ListParagraph"/>
+        <w:numPr>
+          <w:ilvl w:val="0"/>
+          <w:numId w:val="171"/>
+        </w:numPr>
+        <w:spacing w:before="240" w:after="0" w:line="278" w:lineRule="auto"/>
+        <w:rPr>
+          <w:lang w:bidi="ar-DZ"/>
+        </w:rPr>
+      </w:pPr>
+      <w:r>
+        <w:rPr>
+          <w:lang w:bidi="ar-DZ"/>
+        </w:rPr>
+        <w:t xml:space="preserve">Every entity possesses a unique primary key. </w:t>
+      </w:r>
+    </w:p>
+    <w:p>
+      <w:pPr>
+        <w:pStyle w:val="ListParagraph"/>
+        <w:numPr>
+          <w:ilvl w:val="0"/>
+          <w:numId w:val="171"/>
+        </w:numPr>
+        <w:spacing w:before="240" w:after="0" w:line="278" w:lineRule="auto"/>
+        <w:rPr>
+          <w:lang w:bidi="ar-DZ"/>
+        </w:rPr>
+      </w:pPr>
+      <w:r>
+        <w:rPr>
+          <w:lang w:bidi="ar-DZ"/>
+        </w:rPr>
+        <w:t xml:space="preserve">Relationships are implemented using foreign keys. </w:t>
+      </w:r>
+    </w:p>
+    <w:p>
+      <w:pPr>
+        <w:pStyle w:val="ListParagraph"/>
+        <w:numPr>
+          <w:ilvl w:val="0"/>
+          <w:numId w:val="171"/>
+        </w:numPr>
+        <w:spacing w:before="240" w:after="0" w:line="278" w:lineRule="auto"/>
+        <w:rPr>
+          <w:lang w:bidi="ar-DZ"/>
+        </w:rPr>
+      </w:pPr>
+      <w:r>
+        <w:rPr>
+          <w:lang w:bidi="ar-DZ"/>
+        </w:rPr>
+        <w:t xml:space="preserve">The schema satisfies the requirements of </w:t>
+      </w:r>
+      <w:r>
+        <w:rPr>
+          <w:b/>
+          <w:bCs/>
+          <w:lang w:bidi="ar-DZ"/>
+        </w:rPr>
+        <w:t>First Normal Form (1NF)</w:t>
+      </w:r>
+      <w:r>
+        <w:rPr>
+          <w:lang w:bidi="ar-DZ"/>
+        </w:rPr>
+        <w:t xml:space="preserve">, </w:t>
+      </w:r>
+      <w:r>
+        <w:rPr>
+          <w:b/>
+          <w:bCs/>
+          <w:lang w:bidi="ar-DZ"/>
+        </w:rPr>
+        <w:t>Second Normal Form (2NF)</w:t>
+      </w:r>
+      <w:r>
+        <w:rPr>
+          <w:lang w:bidi="ar-DZ"/>
+        </w:rPr>
+        <w:t xml:space="preserve">, and </w:t>
+      </w:r>
+      <w:r>
+        <w:rPr>
+          <w:b/>
+          <w:bCs/>
+          <w:lang w:bidi="ar-DZ"/>
+        </w:rPr>
+        <w:t>Third Normal Form (3NF)</w:t>
+      </w:r>
+      <w:r>
+        <w:rPr>
+          <w:lang w:bidi="ar-DZ"/>
+        </w:rPr>
+        <w:t xml:space="preserve">. </w:t>
+      </w:r>
+    </w:p>
+    <w:p>
+      <w:pPr>
+        <w:pStyle w:val="ListParagraph"/>
+        <w:numPr>
+          <w:ilvl w:val="0"/>
+          <w:numId w:val="171"/>
+        </w:numPr>
+        <w:spacing w:before="240" w:after="0" w:line="278" w:lineRule="auto"/>
+        <w:rPr>
+          <w:lang w:bidi="ar-DZ"/>
+        </w:rPr>
+      </w:pPr>
+      <w:r>
+        <w:rPr>
+          <w:lang w:bidi="ar-DZ"/>
+        </w:rPr>
+        <w:t xml:space="preserve">Business entities are separated to eliminate redundancy and improve maintainability. </w:t>
+      </w:r>
+    </w:p>
+    <w:p>
+      <w:pPr>
+        <w:pStyle w:val="ListParagraph"/>
+        <w:numPr>
+          <w:ilvl w:val="0"/>
+          <w:numId w:val="171"/>
+        </w:numPr>
+        <w:spacing w:before="240" w:after="0" w:line="278" w:lineRule="auto"/>
+        <w:rPr>
+          <w:lang w:bidi="ar-DZ"/>
+        </w:rPr>
+      </w:pPr>
+      <w:r>
+        <w:rPr>
+          <w:lang w:bidi="ar-DZ"/>
+        </w:rPr>
+        <w:t xml:space="preserve">Referential integrity constraints preserve data consistency. </w:t>
+      </w:r>
+    </w:p>
+    <w:p>
+      <w:pPr>
+        <w:pStyle w:val="ListParagraph"/>
+        <w:numPr>
+          <w:ilvl w:val="0"/>
+          <w:numId w:val="171"/>
+        </w:numPr>
+        <w:spacing w:before="240" w:after="0" w:line="278" w:lineRule="auto"/>
+        <w:rPr>
+          <w:lang w:bidi="ar-DZ"/>
+        </w:rPr>
+      </w:pPr>
+      <w:r>
+        <w:rPr>
+          <w:lang w:bidi="ar-DZ"/>
+        </w:rPr>
+        <w:t xml:space="preserve">The design supports future scalability, allowing new entities or relationships to be introduced with minimal structural changes. </w:t>
+      </w:r>
+    </w:p>
+    <w:p>
+      <w:pPr>
+        <w:pStyle w:val="ListParagraph"/>
+        <w:numPr>
+          <w:ilvl w:val="0"/>
+          <w:numId w:val="171"/>
+        </w:numPr>
+        <w:spacing w:before="240" w:after="0" w:line="278" w:lineRule="auto"/>
+        <w:rPr>
+          <w:lang w:bidi="ar-DZ"/>
+        </w:rPr>
+      </w:pPr>
+      <w:r>
+        <w:rPr>
+          <w:lang w:bidi="ar-DZ"/>
+        </w:rPr>
+        <w:t xml:space="preserve">AI, analytics, and notification modules are modeled independently to maintain modularity and extensibility. </w:t>
+      </w:r>
+    </w:p>
+    <w:p>
+      <w:pPr>
+        <w:pStyle w:val="Heading3"/>
+        <w:rPr>
+          <w:lang w:bidi="ar-DZ"/>
+        </w:rPr>
+      </w:pPr>
+      <w:r>
+        <w:rPr>
+          <w:lang w:bidi="ar-DZ"/>
+        </w:rPr>
+        <w:t>5.6 Core ERD Description</w:t>
+      </w:r>
+    </w:p>
+    <w:p>
+      <w:pPr>
+        <w:spacing w:before="240" w:after="0" w:line="278" w:lineRule="auto"/>
+        <w:rPr>
+          <w:lang w:bidi="ar-DZ"/>
+        </w:rPr>
+      </w:pPr>
+      <w:r>
+        <w:rPr>
+          <w:lang w:bidi="ar-DZ"/>
+        </w:rPr>
+        <w:t>User is the main entity of our database and serves for authentication and user accounts for customers, rental agencies, employees, and administration. Profiles of customers and rental agencies expand user accounts via one-to-one relations.</w:t>
+      </w:r>
+    </w:p>
+    <w:p>
+      <w:pPr>
+        <w:spacing w:before="240" w:after="0" w:line="278" w:lineRule="auto"/>
+        <w:rPr>
+          <w:lang w:bidi="ar-DZ"/>
+        </w:rPr>
+      </w:pPr>
+      <w:r>
+        <w:rPr>
+          <w:lang w:bidi="ar-DZ"/>
+        </w:rPr>
+        <w:t>Agencies own one or several Branches where work employees and there are several Vehicles under management of each agency. Customers make Reservations for the available vehicles, and each reservation is connected to some Payment transaction. After renting the vehicle, customers can write some Reviews, and all problems that occurred during the rent are handled in the form of Disputes.</w:t>
+      </w:r>
+    </w:p>
+    <w:p>
+      <w:pPr>
+        <w:spacing w:before="240" w:after="0" w:line="278" w:lineRule="auto"/>
+        <w:rPr>
+          <w:lang w:bidi="ar-DZ"/>
+        </w:rPr>
+      </w:pPr>
+      <w:r>
+        <w:rPr>
+          <w:lang w:bidi="ar-DZ"/>
+        </w:rPr>
+        <w:t>Our system communicates with users via Notifications, makes AI Recommendations, tracks communications between customer and AI Assistant, and generates Analytics Reports.</w:t>
+      </w:r>
+    </w:p>
+    <w:p>
+      <w:pPr>
+        <w:pStyle w:val="Heading3"/>
+        <w:rPr>
+          <w:lang w:bidi="ar-DZ"/>
+        </w:rPr>
+      </w:pPr>
+      <w:r>
+        <w:rPr>
+          <w:lang w:bidi="ar-DZ"/>
+        </w:rPr>
+        <w:t>5.7 Conclusion</w:t>
+      </w:r>
+    </w:p>
+    <w:p>
+      <w:pPr>
+        <w:spacing w:before="240" w:after="0" w:line="278" w:lineRule="auto"/>
+        <w:rPr>
+          <w:lang w:bidi="ar-DZ"/>
+        </w:rPr>
+      </w:pPr>
+      <w:r>
+        <w:rPr>
+          <w:lang w:bidi="ar-DZ"/>
+        </w:rPr>
+        <w:t>The Core Entity Relationship Diagram is the complete depiction of the data model in relation to the logical structure of the KriGo application. By creating entities, attributes, primary key, foreign key, and cardinality of relationships, the ERD forms the basis of the relational database design. This ensures consistency of data and minimizes redundancy by means of normalization, while meeting all of the functional requirements of the application such as user, rental, payment, agency administration, artificial intelligence, and business analysis functionalities.</w:t>
+      </w:r>
     </w:p>
     <w:sectPr>
       <w:pgSz w:w="11906" w:h="16838" w:code="9"/>
@@ -23795,6 +26553,155 @@
     </w:lvl>
   </w:abstractNum>
   <w:abstractNum w:abstractNumId="63" w15:restartNumberingAfterBreak="0">
+    <w:nsid w:val="31BE7B56"/>
+    <w:multiLevelType w:val="multilevel"/>
+    <w:tmpl w:val="ED985E60"/>
+    <w:lvl w:ilvl="0">
+      <w:start w:val="1"/>
+      <w:numFmt w:val="bullet"/>
+      <w:lvlText w:val=""/>
+      <w:lvlJc w:val="left"/>
+      <w:pPr>
+        <w:tabs>
+          <w:tab w:val="num" w:pos="720"/>
+        </w:tabs>
+        <w:ind w:left="720" w:hanging="360"/>
+      </w:pPr>
+      <w:rPr>
+        <w:rFonts w:ascii="Symbol" w:hAnsi="Symbol" w:hint="default"/>
+        <w:sz w:val="20"/>
+      </w:rPr>
+    </w:lvl>
+    <w:lvl w:ilvl="1" w:tentative="1">
+      <w:start w:val="1"/>
+      <w:numFmt w:val="bullet"/>
+      <w:lvlText w:val="o"/>
+      <w:lvlJc w:val="left"/>
+      <w:pPr>
+        <w:tabs>
+          <w:tab w:val="num" w:pos="1440"/>
+        </w:tabs>
+        <w:ind w:left="1440" w:hanging="360"/>
+      </w:pPr>
+      <w:rPr>
+        <w:rFonts w:ascii="Courier New" w:hAnsi="Courier New" w:hint="default"/>
+        <w:sz w:val="20"/>
+      </w:rPr>
+    </w:lvl>
+    <w:lvl w:ilvl="2" w:tentative="1">
+      <w:start w:val="1"/>
+      <w:numFmt w:val="bullet"/>
+      <w:lvlText w:val=""/>
+      <w:lvlJc w:val="left"/>
+      <w:pPr>
+        <w:tabs>
+          <w:tab w:val="num" w:pos="2160"/>
+        </w:tabs>
+        <w:ind w:left="2160" w:hanging="360"/>
+      </w:pPr>
+      <w:rPr>
+        <w:rFonts w:ascii="Wingdings" w:hAnsi="Wingdings" w:hint="default"/>
+        <w:sz w:val="20"/>
+      </w:rPr>
+    </w:lvl>
+    <w:lvl w:ilvl="3" w:tentative="1">
+      <w:start w:val="1"/>
+      <w:numFmt w:val="bullet"/>
+      <w:lvlText w:val=""/>
+      <w:lvlJc w:val="left"/>
+      <w:pPr>
+        <w:tabs>
+          <w:tab w:val="num" w:pos="2880"/>
+        </w:tabs>
+        <w:ind w:left="2880" w:hanging="360"/>
+      </w:pPr>
+      <w:rPr>
+        <w:rFonts w:ascii="Wingdings" w:hAnsi="Wingdings" w:hint="default"/>
+        <w:sz w:val="20"/>
+      </w:rPr>
+    </w:lvl>
+    <w:lvl w:ilvl="4" w:tentative="1">
+      <w:start w:val="1"/>
+      <w:numFmt w:val="bullet"/>
+      <w:lvlText w:val=""/>
+      <w:lvlJc w:val="left"/>
+      <w:pPr>
+        <w:tabs>
+          <w:tab w:val="num" w:pos="3600"/>
+        </w:tabs>
+        <w:ind w:left="3600" w:hanging="360"/>
+      </w:pPr>
+      <w:rPr>
+        <w:rFonts w:ascii="Wingdings" w:hAnsi="Wingdings" w:hint="default"/>
+        <w:sz w:val="20"/>
+      </w:rPr>
+    </w:lvl>
+    <w:lvl w:ilvl="5" w:tentative="1">
+      <w:start w:val="1"/>
+      <w:numFmt w:val="bullet"/>
+      <w:lvlText w:val=""/>
+      <w:lvlJc w:val="left"/>
+      <w:pPr>
+        <w:tabs>
+          <w:tab w:val="num" w:pos="4320"/>
+        </w:tabs>
+        <w:ind w:left="4320" w:hanging="360"/>
+      </w:pPr>
+      <w:rPr>
+        <w:rFonts w:ascii="Wingdings" w:hAnsi="Wingdings" w:hint="default"/>
+        <w:sz w:val="20"/>
+      </w:rPr>
+    </w:lvl>
+    <w:lvl w:ilvl="6" w:tentative="1">
+      <w:start w:val="1"/>
+      <w:numFmt w:val="bullet"/>
+      <w:lvlText w:val=""/>
+      <w:lvlJc w:val="left"/>
+      <w:pPr>
+        <w:tabs>
+          <w:tab w:val="num" w:pos="5040"/>
+        </w:tabs>
+        <w:ind w:left="5040" w:hanging="360"/>
+      </w:pPr>
+      <w:rPr>
+        <w:rFonts w:ascii="Wingdings" w:hAnsi="Wingdings" w:hint="default"/>
+        <w:sz w:val="20"/>
+      </w:rPr>
+    </w:lvl>
+    <w:lvl w:ilvl="7" w:tentative="1">
+      <w:start w:val="1"/>
+      <w:numFmt w:val="bullet"/>
+      <w:lvlText w:val=""/>
+      <w:lvlJc w:val="left"/>
+      <w:pPr>
+        <w:tabs>
+          <w:tab w:val="num" w:pos="5760"/>
+        </w:tabs>
+        <w:ind w:left="5760" w:hanging="360"/>
+      </w:pPr>
+      <w:rPr>
+        <w:rFonts w:ascii="Wingdings" w:hAnsi="Wingdings" w:hint="default"/>
+        <w:sz w:val="20"/>
+      </w:rPr>
+    </w:lvl>
+    <w:lvl w:ilvl="8" w:tentative="1">
+      <w:start w:val="1"/>
+      <w:numFmt w:val="bullet"/>
+      <w:lvlText w:val=""/>
+      <w:lvlJc w:val="left"/>
+      <w:pPr>
+        <w:tabs>
+          <w:tab w:val="num" w:pos="6480"/>
+        </w:tabs>
+        <w:ind w:left="6480" w:hanging="360"/>
+      </w:pPr>
+      <w:rPr>
+        <w:rFonts w:ascii="Wingdings" w:hAnsi="Wingdings" w:hint="default"/>
+        <w:sz w:val="20"/>
+      </w:rPr>
+    </w:lvl>
+  </w:abstractNum>
+  <w:abstractNum w:abstractNumId="64" w15:restartNumberingAfterBreak="0">
     <w:nsid w:val="321E65E6"/>
     <w:multiLevelType w:val="multilevel"/>
     <w:tmpl w:val="63F4E6F0"/>
@@ -23943,7 +26850,7 @@
       </w:rPr>
     </w:lvl>
   </w:abstractNum>
-  <w:abstractNum w:abstractNumId="64" w15:restartNumberingAfterBreak="0">
+  <w:abstractNum w:abstractNumId="65" w15:restartNumberingAfterBreak="0">
     <w:nsid w:val="332E29E8"/>
     <w:multiLevelType w:val="multilevel"/>
     <w:tmpl w:val="BF082128"/>
@@ -24092,7 +26999,7 @@
       </w:rPr>
     </w:lvl>
   </w:abstractNum>
-  <w:abstractNum w:abstractNumId="65" w15:restartNumberingAfterBreak="0">
+  <w:abstractNum w:abstractNumId="66" w15:restartNumberingAfterBreak="0">
     <w:nsid w:val="34251C5D"/>
     <w:multiLevelType w:val="multilevel"/>
     <w:tmpl w:val="C31CBCE0"/>
@@ -24241,7 +27148,7 @@
       </w:rPr>
     </w:lvl>
   </w:abstractNum>
-  <w:abstractNum w:abstractNumId="66" w15:restartNumberingAfterBreak="0">
+  <w:abstractNum w:abstractNumId="67" w15:restartNumberingAfterBreak="0">
     <w:nsid w:val="342A6150"/>
     <w:multiLevelType w:val="multilevel"/>
     <w:tmpl w:val="29E0BE1C"/>
@@ -24390,7 +27297,7 @@
       </w:rPr>
     </w:lvl>
   </w:abstractNum>
-  <w:abstractNum w:abstractNumId="67" w15:restartNumberingAfterBreak="0">
+  <w:abstractNum w:abstractNumId="68" w15:restartNumberingAfterBreak="0">
     <w:nsid w:val="352806E0"/>
     <w:multiLevelType w:val="hybridMultilevel"/>
     <w:tmpl w:val="C4D01788"/>
@@ -24503,7 +27410,7 @@
       </w:rPr>
     </w:lvl>
   </w:abstractNum>
-  <w:abstractNum w:abstractNumId="68" w15:restartNumberingAfterBreak="0">
+  <w:abstractNum w:abstractNumId="69" w15:restartNumberingAfterBreak="0">
     <w:nsid w:val="356F220A"/>
     <w:multiLevelType w:val="multilevel"/>
     <w:tmpl w:val="0FFA5254"/>
@@ -24652,7 +27559,7 @@
       </w:rPr>
     </w:lvl>
   </w:abstractNum>
-  <w:abstractNum w:abstractNumId="69" w15:restartNumberingAfterBreak="0">
+  <w:abstractNum w:abstractNumId="70" w15:restartNumberingAfterBreak="0">
     <w:nsid w:val="357B7363"/>
     <w:multiLevelType w:val="hybridMultilevel"/>
     <w:tmpl w:val="00D411EC"/>
@@ -24764,7 +27671,7 @@
       </w:rPr>
     </w:lvl>
   </w:abstractNum>
-  <w:abstractNum w:abstractNumId="70" w15:restartNumberingAfterBreak="0">
+  <w:abstractNum w:abstractNumId="71" w15:restartNumberingAfterBreak="0">
     <w:nsid w:val="3583100F"/>
     <w:multiLevelType w:val="hybridMultilevel"/>
     <w:tmpl w:val="848ECFAA"/>
@@ -24877,7 +27784,7 @@
       </w:rPr>
     </w:lvl>
   </w:abstractNum>
-  <w:abstractNum w:abstractNumId="71" w15:restartNumberingAfterBreak="0">
+  <w:abstractNum w:abstractNumId="72" w15:restartNumberingAfterBreak="0">
     <w:nsid w:val="3623194A"/>
     <w:multiLevelType w:val="multilevel"/>
     <w:tmpl w:val="63F4E6F0"/>
@@ -25026,7 +27933,7 @@
       </w:rPr>
     </w:lvl>
   </w:abstractNum>
-  <w:abstractNum w:abstractNumId="72" w15:restartNumberingAfterBreak="0">
+  <w:abstractNum w:abstractNumId="73" w15:restartNumberingAfterBreak="0">
     <w:nsid w:val="36AD3FB0"/>
     <w:multiLevelType w:val="multilevel"/>
     <w:tmpl w:val="0644AEEA"/>
@@ -25175,7 +28082,7 @@
       </w:rPr>
     </w:lvl>
   </w:abstractNum>
-  <w:abstractNum w:abstractNumId="73" w15:restartNumberingAfterBreak="0">
+  <w:abstractNum w:abstractNumId="74" w15:restartNumberingAfterBreak="0">
     <w:nsid w:val="371A2CDE"/>
     <w:multiLevelType w:val="hybridMultilevel"/>
     <w:tmpl w:val="EA9C00CC"/>
@@ -25287,7 +28194,7 @@
       </w:rPr>
     </w:lvl>
   </w:abstractNum>
-  <w:abstractNum w:abstractNumId="74" w15:restartNumberingAfterBreak="0">
+  <w:abstractNum w:abstractNumId="75" w15:restartNumberingAfterBreak="0">
     <w:nsid w:val="373D5E48"/>
     <w:multiLevelType w:val="hybridMultilevel"/>
     <w:tmpl w:val="8A6E38C0"/>
@@ -25400,7 +28307,7 @@
       </w:rPr>
     </w:lvl>
   </w:abstractNum>
-  <w:abstractNum w:abstractNumId="75" w15:restartNumberingAfterBreak="0">
+  <w:abstractNum w:abstractNumId="76" w15:restartNumberingAfterBreak="0">
     <w:nsid w:val="38C04ECD"/>
     <w:multiLevelType w:val="hybridMultilevel"/>
     <w:tmpl w:val="BD96A908"/>
@@ -25513,7 +28420,7 @@
       </w:rPr>
     </w:lvl>
   </w:abstractNum>
-  <w:abstractNum w:abstractNumId="76" w15:restartNumberingAfterBreak="0">
+  <w:abstractNum w:abstractNumId="77" w15:restartNumberingAfterBreak="0">
     <w:nsid w:val="3B446B2D"/>
     <w:multiLevelType w:val="hybridMultilevel"/>
     <w:tmpl w:val="B638176E"/>
@@ -25625,7 +28532,7 @@
       </w:rPr>
     </w:lvl>
   </w:abstractNum>
-  <w:abstractNum w:abstractNumId="77" w15:restartNumberingAfterBreak="0">
+  <w:abstractNum w:abstractNumId="78" w15:restartNumberingAfterBreak="0">
     <w:nsid w:val="3B6B41F5"/>
     <w:multiLevelType w:val="hybridMultilevel"/>
     <w:tmpl w:val="10A26168"/>
@@ -25737,7 +28644,7 @@
       </w:rPr>
     </w:lvl>
   </w:abstractNum>
-  <w:abstractNum w:abstractNumId="78" w15:restartNumberingAfterBreak="0">
+  <w:abstractNum w:abstractNumId="79" w15:restartNumberingAfterBreak="0">
     <w:nsid w:val="3C5546BA"/>
     <w:multiLevelType w:val="hybridMultilevel"/>
     <w:tmpl w:val="3434F5E4"/>
@@ -25849,7 +28756,7 @@
       </w:rPr>
     </w:lvl>
   </w:abstractNum>
-  <w:abstractNum w:abstractNumId="79" w15:restartNumberingAfterBreak="0">
+  <w:abstractNum w:abstractNumId="80" w15:restartNumberingAfterBreak="0">
     <w:nsid w:val="3C623C55"/>
     <w:multiLevelType w:val="multilevel"/>
     <w:tmpl w:val="A0B0E8F4"/>
@@ -25998,7 +28905,7 @@
       </w:rPr>
     </w:lvl>
   </w:abstractNum>
-  <w:abstractNum w:abstractNumId="80" w15:restartNumberingAfterBreak="0">
+  <w:abstractNum w:abstractNumId="81" w15:restartNumberingAfterBreak="0">
     <w:nsid w:val="3CD27F78"/>
     <w:multiLevelType w:val="multilevel"/>
     <w:tmpl w:val="FCDE767A"/>
@@ -26147,7 +29054,7 @@
       </w:rPr>
     </w:lvl>
   </w:abstractNum>
-  <w:abstractNum w:abstractNumId="81" w15:restartNumberingAfterBreak="0">
+  <w:abstractNum w:abstractNumId="82" w15:restartNumberingAfterBreak="0">
     <w:nsid w:val="3CD74B18"/>
     <w:multiLevelType w:val="hybridMultilevel"/>
     <w:tmpl w:val="2FF42220"/>
@@ -26260,7 +29167,7 @@
       </w:rPr>
     </w:lvl>
   </w:abstractNum>
-  <w:abstractNum w:abstractNumId="82" w15:restartNumberingAfterBreak="0">
+  <w:abstractNum w:abstractNumId="83" w15:restartNumberingAfterBreak="0">
     <w:nsid w:val="3D2F7E79"/>
     <w:multiLevelType w:val="hybridMultilevel"/>
     <w:tmpl w:val="6ED674BE"/>
@@ -26372,7 +29279,7 @@
       </w:rPr>
     </w:lvl>
   </w:abstractNum>
-  <w:abstractNum w:abstractNumId="83" w15:restartNumberingAfterBreak="0">
+  <w:abstractNum w:abstractNumId="84" w15:restartNumberingAfterBreak="0">
     <w:nsid w:val="3D397287"/>
     <w:multiLevelType w:val="hybridMultilevel"/>
     <w:tmpl w:val="F4503122"/>
@@ -26484,7 +29391,7 @@
       </w:rPr>
     </w:lvl>
   </w:abstractNum>
-  <w:abstractNum w:abstractNumId="84" w15:restartNumberingAfterBreak="0">
+  <w:abstractNum w:abstractNumId="85" w15:restartNumberingAfterBreak="0">
     <w:nsid w:val="3DD260EB"/>
     <w:multiLevelType w:val="multilevel"/>
     <w:tmpl w:val="B07886AE"/>
@@ -26633,7 +29540,7 @@
       </w:rPr>
     </w:lvl>
   </w:abstractNum>
-  <w:abstractNum w:abstractNumId="85" w15:restartNumberingAfterBreak="0">
+  <w:abstractNum w:abstractNumId="86" w15:restartNumberingAfterBreak="0">
     <w:nsid w:val="3E685FF3"/>
     <w:multiLevelType w:val="multilevel"/>
     <w:tmpl w:val="7D20B538"/>
@@ -26782,7 +29689,7 @@
       </w:rPr>
     </w:lvl>
   </w:abstractNum>
-  <w:abstractNum w:abstractNumId="86" w15:restartNumberingAfterBreak="0">
+  <w:abstractNum w:abstractNumId="87" w15:restartNumberingAfterBreak="0">
     <w:nsid w:val="3F346C2C"/>
     <w:multiLevelType w:val="multilevel"/>
     <w:tmpl w:val="63F4E6F0"/>
@@ -26931,7 +29838,7 @@
       </w:rPr>
     </w:lvl>
   </w:abstractNum>
-  <w:abstractNum w:abstractNumId="87" w15:restartNumberingAfterBreak="0">
+  <w:abstractNum w:abstractNumId="88" w15:restartNumberingAfterBreak="0">
     <w:nsid w:val="3FCB1322"/>
     <w:multiLevelType w:val="hybridMultilevel"/>
     <w:tmpl w:val="55C012B2"/>
@@ -27043,7 +29950,7 @@
       </w:rPr>
     </w:lvl>
   </w:abstractNum>
-  <w:abstractNum w:abstractNumId="88" w15:restartNumberingAfterBreak="0">
+  <w:abstractNum w:abstractNumId="89" w15:restartNumberingAfterBreak="0">
     <w:nsid w:val="414B1957"/>
     <w:multiLevelType w:val="multilevel"/>
     <w:tmpl w:val="B270F070"/>
@@ -27192,7 +30099,7 @@
       </w:rPr>
     </w:lvl>
   </w:abstractNum>
-  <w:abstractNum w:abstractNumId="89" w15:restartNumberingAfterBreak="0">
+  <w:abstractNum w:abstractNumId="90" w15:restartNumberingAfterBreak="0">
     <w:nsid w:val="41A9344F"/>
     <w:multiLevelType w:val="hybridMultilevel"/>
     <w:tmpl w:val="0FB60038"/>
@@ -27305,7 +30212,7 @@
       </w:rPr>
     </w:lvl>
   </w:abstractNum>
-  <w:abstractNum w:abstractNumId="90" w15:restartNumberingAfterBreak="0">
+  <w:abstractNum w:abstractNumId="91" w15:restartNumberingAfterBreak="0">
     <w:nsid w:val="42004E1F"/>
     <w:multiLevelType w:val="hybridMultilevel"/>
     <w:tmpl w:val="770C8314"/>
@@ -27417,7 +30324,7 @@
       </w:rPr>
     </w:lvl>
   </w:abstractNum>
-  <w:abstractNum w:abstractNumId="91" w15:restartNumberingAfterBreak="0">
+  <w:abstractNum w:abstractNumId="92" w15:restartNumberingAfterBreak="0">
     <w:nsid w:val="439F7169"/>
     <w:multiLevelType w:val="hybridMultilevel"/>
     <w:tmpl w:val="1884EDCA"/>
@@ -27530,7 +30437,7 @@
       </w:rPr>
     </w:lvl>
   </w:abstractNum>
-  <w:abstractNum w:abstractNumId="92" w15:restartNumberingAfterBreak="0">
+  <w:abstractNum w:abstractNumId="93" w15:restartNumberingAfterBreak="0">
     <w:nsid w:val="43EA1D69"/>
     <w:multiLevelType w:val="multilevel"/>
     <w:tmpl w:val="DFEC23EC"/>
@@ -27679,7 +30586,7 @@
       </w:rPr>
     </w:lvl>
   </w:abstractNum>
-  <w:abstractNum w:abstractNumId="93" w15:restartNumberingAfterBreak="0">
+  <w:abstractNum w:abstractNumId="94" w15:restartNumberingAfterBreak="0">
     <w:nsid w:val="44320084"/>
     <w:multiLevelType w:val="hybridMultilevel"/>
     <w:tmpl w:val="CE5076D4"/>
@@ -27791,7 +30698,7 @@
       </w:rPr>
     </w:lvl>
   </w:abstractNum>
-  <w:abstractNum w:abstractNumId="94" w15:restartNumberingAfterBreak="0">
+  <w:abstractNum w:abstractNumId="95" w15:restartNumberingAfterBreak="0">
     <w:nsid w:val="44554567"/>
     <w:multiLevelType w:val="hybridMultilevel"/>
     <w:tmpl w:val="78748252"/>
@@ -27903,7 +30810,7 @@
       </w:rPr>
     </w:lvl>
   </w:abstractNum>
-  <w:abstractNum w:abstractNumId="95" w15:restartNumberingAfterBreak="0">
+  <w:abstractNum w:abstractNumId="96" w15:restartNumberingAfterBreak="0">
     <w:nsid w:val="49005094"/>
     <w:multiLevelType w:val="hybridMultilevel"/>
     <w:tmpl w:val="14848CBE"/>
@@ -28015,7 +30922,7 @@
       </w:rPr>
     </w:lvl>
   </w:abstractNum>
-  <w:abstractNum w:abstractNumId="96" w15:restartNumberingAfterBreak="0">
+  <w:abstractNum w:abstractNumId="97" w15:restartNumberingAfterBreak="0">
     <w:nsid w:val="49243794"/>
     <w:multiLevelType w:val="multilevel"/>
     <w:tmpl w:val="E7681528"/>
@@ -28164,7 +31071,7 @@
       </w:rPr>
     </w:lvl>
   </w:abstractNum>
-  <w:abstractNum w:abstractNumId="97" w15:restartNumberingAfterBreak="0">
+  <w:abstractNum w:abstractNumId="98" w15:restartNumberingAfterBreak="0">
     <w:nsid w:val="4A880990"/>
     <w:multiLevelType w:val="hybridMultilevel"/>
     <w:tmpl w:val="F17E12C2"/>
@@ -28276,7 +31183,7 @@
       </w:rPr>
     </w:lvl>
   </w:abstractNum>
-  <w:abstractNum w:abstractNumId="98" w15:restartNumberingAfterBreak="0">
+  <w:abstractNum w:abstractNumId="99" w15:restartNumberingAfterBreak="0">
     <w:nsid w:val="4B182B12"/>
     <w:multiLevelType w:val="hybridMultilevel"/>
     <w:tmpl w:val="31C486B4"/>
@@ -28388,7 +31295,7 @@
       </w:rPr>
     </w:lvl>
   </w:abstractNum>
-  <w:abstractNum w:abstractNumId="99" w15:restartNumberingAfterBreak="0">
+  <w:abstractNum w:abstractNumId="100" w15:restartNumberingAfterBreak="0">
     <w:nsid w:val="4BA13766"/>
     <w:multiLevelType w:val="multilevel"/>
     <w:tmpl w:val="63F4E6F0"/>
@@ -28537,7 +31444,156 @@
       </w:rPr>
     </w:lvl>
   </w:abstractNum>
-  <w:abstractNum w:abstractNumId="100" w15:restartNumberingAfterBreak="0">
+  <w:abstractNum w:abstractNumId="101" w15:restartNumberingAfterBreak="0">
+    <w:nsid w:val="4BC76145"/>
+    <w:multiLevelType w:val="multilevel"/>
+    <w:tmpl w:val="AD66B3F0"/>
+    <w:lvl w:ilvl="0">
+      <w:start w:val="1"/>
+      <w:numFmt w:val="bullet"/>
+      <w:lvlText w:val=""/>
+      <w:lvlJc w:val="left"/>
+      <w:pPr>
+        <w:tabs>
+          <w:tab w:val="num" w:pos="720"/>
+        </w:tabs>
+        <w:ind w:left="720" w:hanging="360"/>
+      </w:pPr>
+      <w:rPr>
+        <w:rFonts w:ascii="Symbol" w:hAnsi="Symbol" w:hint="default"/>
+        <w:sz w:val="20"/>
+      </w:rPr>
+    </w:lvl>
+    <w:lvl w:ilvl="1" w:tentative="1">
+      <w:start w:val="1"/>
+      <w:numFmt w:val="bullet"/>
+      <w:lvlText w:val="o"/>
+      <w:lvlJc w:val="left"/>
+      <w:pPr>
+        <w:tabs>
+          <w:tab w:val="num" w:pos="1440"/>
+        </w:tabs>
+        <w:ind w:left="1440" w:hanging="360"/>
+      </w:pPr>
+      <w:rPr>
+        <w:rFonts w:ascii="Courier New" w:hAnsi="Courier New" w:hint="default"/>
+        <w:sz w:val="20"/>
+      </w:rPr>
+    </w:lvl>
+    <w:lvl w:ilvl="2" w:tentative="1">
+      <w:start w:val="1"/>
+      <w:numFmt w:val="bullet"/>
+      <w:lvlText w:val=""/>
+      <w:lvlJc w:val="left"/>
+      <w:pPr>
+        <w:tabs>
+          <w:tab w:val="num" w:pos="2160"/>
+        </w:tabs>
+        <w:ind w:left="2160" w:hanging="360"/>
+      </w:pPr>
+      <w:rPr>
+        <w:rFonts w:ascii="Wingdings" w:hAnsi="Wingdings" w:hint="default"/>
+        <w:sz w:val="20"/>
+      </w:rPr>
+    </w:lvl>
+    <w:lvl w:ilvl="3" w:tentative="1">
+      <w:start w:val="1"/>
+      <w:numFmt w:val="bullet"/>
+      <w:lvlText w:val=""/>
+      <w:lvlJc w:val="left"/>
+      <w:pPr>
+        <w:tabs>
+          <w:tab w:val="num" w:pos="2880"/>
+        </w:tabs>
+        <w:ind w:left="2880" w:hanging="360"/>
+      </w:pPr>
+      <w:rPr>
+        <w:rFonts w:ascii="Wingdings" w:hAnsi="Wingdings" w:hint="default"/>
+        <w:sz w:val="20"/>
+      </w:rPr>
+    </w:lvl>
+    <w:lvl w:ilvl="4" w:tentative="1">
+      <w:start w:val="1"/>
+      <w:numFmt w:val="bullet"/>
+      <w:lvlText w:val=""/>
+      <w:lvlJc w:val="left"/>
+      <w:pPr>
+        <w:tabs>
+          <w:tab w:val="num" w:pos="3600"/>
+        </w:tabs>
+        <w:ind w:left="3600" w:hanging="360"/>
+      </w:pPr>
+      <w:rPr>
+        <w:rFonts w:ascii="Wingdings" w:hAnsi="Wingdings" w:hint="default"/>
+        <w:sz w:val="20"/>
+      </w:rPr>
+    </w:lvl>
+    <w:lvl w:ilvl="5" w:tentative="1">
+      <w:start w:val="1"/>
+      <w:numFmt w:val="bullet"/>
+      <w:lvlText w:val=""/>
+      <w:lvlJc w:val="left"/>
+      <w:pPr>
+        <w:tabs>
+          <w:tab w:val="num" w:pos="4320"/>
+        </w:tabs>
+        <w:ind w:left="4320" w:hanging="360"/>
+      </w:pPr>
+      <w:rPr>
+        <w:rFonts w:ascii="Wingdings" w:hAnsi="Wingdings" w:hint="default"/>
+        <w:sz w:val="20"/>
+      </w:rPr>
+    </w:lvl>
+    <w:lvl w:ilvl="6" w:tentative="1">
+      <w:start w:val="1"/>
+      <w:numFmt w:val="bullet"/>
+      <w:lvlText w:val=""/>
+      <w:lvlJc w:val="left"/>
+      <w:pPr>
+        <w:tabs>
+          <w:tab w:val="num" w:pos="5040"/>
+        </w:tabs>
+        <w:ind w:left="5040" w:hanging="360"/>
+      </w:pPr>
+      <w:rPr>
+        <w:rFonts w:ascii="Wingdings" w:hAnsi="Wingdings" w:hint="default"/>
+        <w:sz w:val="20"/>
+      </w:rPr>
+    </w:lvl>
+    <w:lvl w:ilvl="7" w:tentative="1">
+      <w:start w:val="1"/>
+      <w:numFmt w:val="bullet"/>
+      <w:lvlText w:val=""/>
+      <w:lvlJc w:val="left"/>
+      <w:pPr>
+        <w:tabs>
+          <w:tab w:val="num" w:pos="5760"/>
+        </w:tabs>
+        <w:ind w:left="5760" w:hanging="360"/>
+      </w:pPr>
+      <w:rPr>
+        <w:rFonts w:ascii="Wingdings" w:hAnsi="Wingdings" w:hint="default"/>
+        <w:sz w:val="20"/>
+      </w:rPr>
+    </w:lvl>
+    <w:lvl w:ilvl="8" w:tentative="1">
+      <w:start w:val="1"/>
+      <w:numFmt w:val="bullet"/>
+      <w:lvlText w:val=""/>
+      <w:lvlJc w:val="left"/>
+      <w:pPr>
+        <w:tabs>
+          <w:tab w:val="num" w:pos="6480"/>
+        </w:tabs>
+        <w:ind w:left="6480" w:hanging="360"/>
+      </w:pPr>
+      <w:rPr>
+        <w:rFonts w:ascii="Wingdings" w:hAnsi="Wingdings" w:hint="default"/>
+        <w:sz w:val="20"/>
+      </w:rPr>
+    </w:lvl>
+  </w:abstractNum>
+  <w:abstractNum w:abstractNumId="102" w15:restartNumberingAfterBreak="0">
     <w:nsid w:val="4E65371E"/>
     <w:multiLevelType w:val="hybridMultilevel"/>
     <w:tmpl w:val="53EE4538"/>
@@ -28649,7 +31705,7 @@
       </w:rPr>
     </w:lvl>
   </w:abstractNum>
-  <w:abstractNum w:abstractNumId="101" w15:restartNumberingAfterBreak="0">
+  <w:abstractNum w:abstractNumId="103" w15:restartNumberingAfterBreak="0">
     <w:nsid w:val="4E9A3F16"/>
     <w:multiLevelType w:val="multilevel"/>
     <w:tmpl w:val="63F4E6F0"/>
@@ -28798,7 +31854,7 @@
       </w:rPr>
     </w:lvl>
   </w:abstractNum>
-  <w:abstractNum w:abstractNumId="102" w15:restartNumberingAfterBreak="0">
+  <w:abstractNum w:abstractNumId="104" w15:restartNumberingAfterBreak="0">
     <w:nsid w:val="500B790D"/>
     <w:multiLevelType w:val="multilevel"/>
     <w:tmpl w:val="63F4E6F0"/>
@@ -28947,7 +32003,7 @@
       </w:rPr>
     </w:lvl>
   </w:abstractNum>
-  <w:abstractNum w:abstractNumId="103" w15:restartNumberingAfterBreak="0">
+  <w:abstractNum w:abstractNumId="105" w15:restartNumberingAfterBreak="0">
     <w:nsid w:val="526538B7"/>
     <w:multiLevelType w:val="hybridMultilevel"/>
     <w:tmpl w:val="E6A017F2"/>
@@ -29060,7 +32116,7 @@
       </w:rPr>
     </w:lvl>
   </w:abstractNum>
-  <w:abstractNum w:abstractNumId="104" w15:restartNumberingAfterBreak="0">
+  <w:abstractNum w:abstractNumId="106" w15:restartNumberingAfterBreak="0">
     <w:nsid w:val="537E56D9"/>
     <w:multiLevelType w:val="multilevel"/>
     <w:tmpl w:val="1B6E8B6A"/>
@@ -29209,7 +32265,7 @@
       </w:rPr>
     </w:lvl>
   </w:abstractNum>
-  <w:abstractNum w:abstractNumId="105" w15:restartNumberingAfterBreak="0">
+  <w:abstractNum w:abstractNumId="107" w15:restartNumberingAfterBreak="0">
     <w:nsid w:val="53E6601E"/>
     <w:multiLevelType w:val="hybridMultilevel"/>
     <w:tmpl w:val="66F0666A"/>
@@ -29322,7 +32378,7 @@
       </w:rPr>
     </w:lvl>
   </w:abstractNum>
-  <w:abstractNum w:abstractNumId="106" w15:restartNumberingAfterBreak="0">
+  <w:abstractNum w:abstractNumId="108" w15:restartNumberingAfterBreak="0">
     <w:nsid w:val="54E9416B"/>
     <w:multiLevelType w:val="multilevel"/>
     <w:tmpl w:val="A98E3AA0"/>
@@ -29471,7 +32527,7 @@
       </w:rPr>
     </w:lvl>
   </w:abstractNum>
-  <w:abstractNum w:abstractNumId="107" w15:restartNumberingAfterBreak="0">
+  <w:abstractNum w:abstractNumId="109" w15:restartNumberingAfterBreak="0">
     <w:nsid w:val="551D6F91"/>
     <w:multiLevelType w:val="hybridMultilevel"/>
     <w:tmpl w:val="9522B3C6"/>
@@ -29583,7 +32639,7 @@
       </w:rPr>
     </w:lvl>
   </w:abstractNum>
-  <w:abstractNum w:abstractNumId="108" w15:restartNumberingAfterBreak="0">
+  <w:abstractNum w:abstractNumId="110" w15:restartNumberingAfterBreak="0">
     <w:nsid w:val="55655B93"/>
     <w:multiLevelType w:val="multilevel"/>
     <w:tmpl w:val="9C88A4A8"/>
@@ -29732,7 +32788,7 @@
       </w:rPr>
     </w:lvl>
   </w:abstractNum>
-  <w:abstractNum w:abstractNumId="109" w15:restartNumberingAfterBreak="0">
+  <w:abstractNum w:abstractNumId="111" w15:restartNumberingAfterBreak="0">
     <w:nsid w:val="562D4F1F"/>
     <w:multiLevelType w:val="hybridMultilevel"/>
     <w:tmpl w:val="1FF8D31C"/>
@@ -29844,7 +32900,7 @@
       </w:rPr>
     </w:lvl>
   </w:abstractNum>
-  <w:abstractNum w:abstractNumId="110" w15:restartNumberingAfterBreak="0">
+  <w:abstractNum w:abstractNumId="112" w15:restartNumberingAfterBreak="0">
     <w:nsid w:val="565A0C8B"/>
     <w:multiLevelType w:val="multilevel"/>
     <w:tmpl w:val="AB24FF2E"/>
@@ -29993,7 +33049,7 @@
       </w:rPr>
     </w:lvl>
   </w:abstractNum>
-  <w:abstractNum w:abstractNumId="111" w15:restartNumberingAfterBreak="0">
+  <w:abstractNum w:abstractNumId="113" w15:restartNumberingAfterBreak="0">
     <w:nsid w:val="566E7C65"/>
     <w:multiLevelType w:val="multilevel"/>
     <w:tmpl w:val="28803B4C"/>
@@ -30142,7 +33198,7 @@
       </w:rPr>
     </w:lvl>
   </w:abstractNum>
-  <w:abstractNum w:abstractNumId="112" w15:restartNumberingAfterBreak="0">
+  <w:abstractNum w:abstractNumId="114" w15:restartNumberingAfterBreak="0">
     <w:nsid w:val="57407594"/>
     <w:multiLevelType w:val="multilevel"/>
     <w:tmpl w:val="E6E2F8AE"/>
@@ -30291,7 +33347,7 @@
       </w:rPr>
     </w:lvl>
   </w:abstractNum>
-  <w:abstractNum w:abstractNumId="113" w15:restartNumberingAfterBreak="0">
+  <w:abstractNum w:abstractNumId="115" w15:restartNumberingAfterBreak="0">
     <w:nsid w:val="577F771B"/>
     <w:multiLevelType w:val="hybridMultilevel"/>
     <w:tmpl w:val="0F2C5914"/>
@@ -30403,7 +33459,7 @@
       </w:rPr>
     </w:lvl>
   </w:abstractNum>
-  <w:abstractNum w:abstractNumId="114" w15:restartNumberingAfterBreak="0">
+  <w:abstractNum w:abstractNumId="116" w15:restartNumberingAfterBreak="0">
     <w:nsid w:val="57C43CDD"/>
     <w:multiLevelType w:val="hybridMultilevel"/>
     <w:tmpl w:val="6C94FB5E"/>
@@ -30516,7 +33572,7 @@
       </w:rPr>
     </w:lvl>
   </w:abstractNum>
-  <w:abstractNum w:abstractNumId="115" w15:restartNumberingAfterBreak="0">
+  <w:abstractNum w:abstractNumId="117" w15:restartNumberingAfterBreak="0">
     <w:nsid w:val="58393977"/>
     <w:multiLevelType w:val="hybridMultilevel"/>
     <w:tmpl w:val="985A5484"/>
@@ -30629,7 +33685,7 @@
       </w:rPr>
     </w:lvl>
   </w:abstractNum>
-  <w:abstractNum w:abstractNumId="116" w15:restartNumberingAfterBreak="0">
+  <w:abstractNum w:abstractNumId="118" w15:restartNumberingAfterBreak="0">
     <w:nsid w:val="59EB4CE4"/>
     <w:multiLevelType w:val="multilevel"/>
     <w:tmpl w:val="63F4E6F0"/>
@@ -30778,7 +33834,7 @@
       </w:rPr>
     </w:lvl>
   </w:abstractNum>
-  <w:abstractNum w:abstractNumId="117" w15:restartNumberingAfterBreak="0">
+  <w:abstractNum w:abstractNumId="119" w15:restartNumberingAfterBreak="0">
     <w:nsid w:val="5BD11962"/>
     <w:multiLevelType w:val="hybridMultilevel"/>
     <w:tmpl w:val="89A4B834"/>
@@ -30867,7 +33923,7 @@
       </w:pPr>
     </w:lvl>
   </w:abstractNum>
-  <w:abstractNum w:abstractNumId="118" w15:restartNumberingAfterBreak="0">
+  <w:abstractNum w:abstractNumId="120" w15:restartNumberingAfterBreak="0">
     <w:nsid w:val="5C950DBA"/>
     <w:multiLevelType w:val="hybridMultilevel"/>
     <w:tmpl w:val="7D78F950"/>
@@ -30979,7 +34035,7 @@
       </w:rPr>
     </w:lvl>
   </w:abstractNum>
-  <w:abstractNum w:abstractNumId="119" w15:restartNumberingAfterBreak="0">
+  <w:abstractNum w:abstractNumId="121" w15:restartNumberingAfterBreak="0">
     <w:nsid w:val="5D2A5D3B"/>
     <w:multiLevelType w:val="hybridMultilevel"/>
     <w:tmpl w:val="3AF89EA6"/>
@@ -31070,7 +34126,7 @@
       </w:pPr>
     </w:lvl>
   </w:abstractNum>
-  <w:abstractNum w:abstractNumId="120" w15:restartNumberingAfterBreak="0">
+  <w:abstractNum w:abstractNumId="122" w15:restartNumberingAfterBreak="0">
     <w:nsid w:val="5D9E49FD"/>
     <w:multiLevelType w:val="hybridMultilevel"/>
     <w:tmpl w:val="4EE40BB4"/>
@@ -31182,7 +34238,7 @@
       </w:rPr>
     </w:lvl>
   </w:abstractNum>
-  <w:abstractNum w:abstractNumId="121" w15:restartNumberingAfterBreak="0">
+  <w:abstractNum w:abstractNumId="123" w15:restartNumberingAfterBreak="0">
     <w:nsid w:val="5DB7107D"/>
     <w:multiLevelType w:val="multilevel"/>
     <w:tmpl w:val="6520107A"/>
@@ -31331,7 +34387,7 @@
       </w:rPr>
     </w:lvl>
   </w:abstractNum>
-  <w:abstractNum w:abstractNumId="122" w15:restartNumberingAfterBreak="0">
+  <w:abstractNum w:abstractNumId="124" w15:restartNumberingAfterBreak="0">
     <w:nsid w:val="5E3B3A2D"/>
     <w:multiLevelType w:val="multilevel"/>
     <w:tmpl w:val="35708E5C"/>
@@ -31480,7 +34536,7 @@
       </w:rPr>
     </w:lvl>
   </w:abstractNum>
-  <w:abstractNum w:abstractNumId="123" w15:restartNumberingAfterBreak="0">
+  <w:abstractNum w:abstractNumId="125" w15:restartNumberingAfterBreak="0">
     <w:nsid w:val="60421322"/>
     <w:multiLevelType w:val="hybridMultilevel"/>
     <w:tmpl w:val="447CDBDC"/>
@@ -31592,7 +34648,7 @@
       </w:rPr>
     </w:lvl>
   </w:abstractNum>
-  <w:abstractNum w:abstractNumId="124" w15:restartNumberingAfterBreak="0">
+  <w:abstractNum w:abstractNumId="126" w15:restartNumberingAfterBreak="0">
     <w:nsid w:val="61926C31"/>
     <w:multiLevelType w:val="hybridMultilevel"/>
     <w:tmpl w:val="AFD27E5C"/>
@@ -31705,7 +34761,7 @@
       </w:rPr>
     </w:lvl>
   </w:abstractNum>
-  <w:abstractNum w:abstractNumId="125" w15:restartNumberingAfterBreak="0">
+  <w:abstractNum w:abstractNumId="127" w15:restartNumberingAfterBreak="0">
     <w:nsid w:val="622F5FC7"/>
     <w:multiLevelType w:val="hybridMultilevel"/>
     <w:tmpl w:val="49A6C2A6"/>
@@ -31818,7 +34874,7 @@
       </w:rPr>
     </w:lvl>
   </w:abstractNum>
-  <w:abstractNum w:abstractNumId="126" w15:restartNumberingAfterBreak="0">
+  <w:abstractNum w:abstractNumId="128" w15:restartNumberingAfterBreak="0">
     <w:nsid w:val="62AC33B4"/>
     <w:multiLevelType w:val="multilevel"/>
     <w:tmpl w:val="A074F3CA"/>
@@ -31967,7 +35023,7 @@
       </w:rPr>
     </w:lvl>
   </w:abstractNum>
-  <w:abstractNum w:abstractNumId="127" w15:restartNumberingAfterBreak="0">
+  <w:abstractNum w:abstractNumId="129" w15:restartNumberingAfterBreak="0">
     <w:nsid w:val="63B44674"/>
     <w:multiLevelType w:val="multilevel"/>
     <w:tmpl w:val="08F4FA9A"/>
@@ -32116,7 +35172,7 @@
       </w:rPr>
     </w:lvl>
   </w:abstractNum>
-  <w:abstractNum w:abstractNumId="128" w15:restartNumberingAfterBreak="0">
+  <w:abstractNum w:abstractNumId="130" w15:restartNumberingAfterBreak="0">
     <w:nsid w:val="63C245D4"/>
     <w:multiLevelType w:val="hybridMultilevel"/>
     <w:tmpl w:val="E1563A56"/>
@@ -32228,7 +35284,7 @@
       </w:rPr>
     </w:lvl>
   </w:abstractNum>
-  <w:abstractNum w:abstractNumId="129" w15:restartNumberingAfterBreak="0">
+  <w:abstractNum w:abstractNumId="131" w15:restartNumberingAfterBreak="0">
     <w:nsid w:val="64F30198"/>
     <w:multiLevelType w:val="multilevel"/>
     <w:tmpl w:val="63F4E6F0"/>
@@ -32377,7 +35433,7 @@
       </w:rPr>
     </w:lvl>
   </w:abstractNum>
-  <w:abstractNum w:abstractNumId="130" w15:restartNumberingAfterBreak="0">
+  <w:abstractNum w:abstractNumId="132" w15:restartNumberingAfterBreak="0">
     <w:nsid w:val="65AF2502"/>
     <w:multiLevelType w:val="hybridMultilevel"/>
     <w:tmpl w:val="FB2A44D8"/>
@@ -32490,7 +35546,7 @@
       </w:rPr>
     </w:lvl>
   </w:abstractNum>
-  <w:abstractNum w:abstractNumId="131" w15:restartNumberingAfterBreak="0">
+  <w:abstractNum w:abstractNumId="133" w15:restartNumberingAfterBreak="0">
     <w:nsid w:val="671614F0"/>
     <w:multiLevelType w:val="multilevel"/>
     <w:tmpl w:val="63F4E6F0"/>
@@ -32639,7 +35695,7 @@
       </w:rPr>
     </w:lvl>
   </w:abstractNum>
-  <w:abstractNum w:abstractNumId="132" w15:restartNumberingAfterBreak="0">
+  <w:abstractNum w:abstractNumId="134" w15:restartNumberingAfterBreak="0">
     <w:nsid w:val="68112B9F"/>
     <w:multiLevelType w:val="multilevel"/>
     <w:tmpl w:val="4BDA49AC"/>
@@ -32788,7 +35844,7 @@
       </w:rPr>
     </w:lvl>
   </w:abstractNum>
-  <w:abstractNum w:abstractNumId="133" w15:restartNumberingAfterBreak="0">
+  <w:abstractNum w:abstractNumId="135" w15:restartNumberingAfterBreak="0">
     <w:nsid w:val="6859691D"/>
     <w:multiLevelType w:val="multilevel"/>
     <w:tmpl w:val="826A9D48"/>
@@ -32937,7 +35993,7 @@
       </w:rPr>
     </w:lvl>
   </w:abstractNum>
-  <w:abstractNum w:abstractNumId="134" w15:restartNumberingAfterBreak="0">
+  <w:abstractNum w:abstractNumId="136" w15:restartNumberingAfterBreak="0">
     <w:nsid w:val="68817757"/>
     <w:multiLevelType w:val="multilevel"/>
     <w:tmpl w:val="34EE1968"/>
@@ -33086,7 +36142,7 @@
       </w:rPr>
     </w:lvl>
   </w:abstractNum>
-  <w:abstractNum w:abstractNumId="135" w15:restartNumberingAfterBreak="0">
+  <w:abstractNum w:abstractNumId="137" w15:restartNumberingAfterBreak="0">
     <w:nsid w:val="68BE10E8"/>
     <w:multiLevelType w:val="hybridMultilevel"/>
     <w:tmpl w:val="326CD592"/>
@@ -33199,7 +36255,7 @@
       </w:rPr>
     </w:lvl>
   </w:abstractNum>
-  <w:abstractNum w:abstractNumId="136" w15:restartNumberingAfterBreak="0">
+  <w:abstractNum w:abstractNumId="138" w15:restartNumberingAfterBreak="0">
     <w:nsid w:val="69996D9A"/>
     <w:multiLevelType w:val="multilevel"/>
     <w:tmpl w:val="1780FC38"/>
@@ -33348,7 +36404,7 @@
       </w:rPr>
     </w:lvl>
   </w:abstractNum>
-  <w:abstractNum w:abstractNumId="137" w15:restartNumberingAfterBreak="0">
+  <w:abstractNum w:abstractNumId="139" w15:restartNumberingAfterBreak="0">
     <w:nsid w:val="6A3705AD"/>
     <w:multiLevelType w:val="hybridMultilevel"/>
     <w:tmpl w:val="BCA45810"/>
@@ -33461,7 +36517,7 @@
       </w:rPr>
     </w:lvl>
   </w:abstractNum>
-  <w:abstractNum w:abstractNumId="138" w15:restartNumberingAfterBreak="0">
+  <w:abstractNum w:abstractNumId="140" w15:restartNumberingAfterBreak="0">
     <w:nsid w:val="6B3C30B9"/>
     <w:multiLevelType w:val="hybridMultilevel"/>
     <w:tmpl w:val="C938F8DE"/>
@@ -33573,7 +36629,120 @@
       </w:rPr>
     </w:lvl>
   </w:abstractNum>
-  <w:abstractNum w:abstractNumId="139" w15:restartNumberingAfterBreak="0">
+  <w:abstractNum w:abstractNumId="141" w15:restartNumberingAfterBreak="0">
+    <w:nsid w:val="6C141949"/>
+    <w:multiLevelType w:val="hybridMultilevel"/>
+    <w:tmpl w:val="878A5DBC"/>
+    <w:lvl w:ilvl="0" w:tplc="04090005">
+      <w:start w:val="1"/>
+      <w:numFmt w:val="bullet"/>
+      <w:lvlText w:val=""/>
+      <w:lvlJc w:val="left"/>
+      <w:pPr>
+        <w:ind w:left="810" w:hanging="360"/>
+      </w:pPr>
+      <w:rPr>
+        <w:rFonts w:ascii="Wingdings" w:hAnsi="Wingdings" w:hint="default"/>
+      </w:rPr>
+    </w:lvl>
+    <w:lvl w:ilvl="1" w:tplc="04090003" w:tentative="1">
+      <w:start w:val="1"/>
+      <w:numFmt w:val="bullet"/>
+      <w:lvlText w:val="o"/>
+      <w:lvlJc w:val="left"/>
+      <w:pPr>
+        <w:ind w:left="1530" w:hanging="360"/>
+      </w:pPr>
+      <w:rPr>
+        <w:rFonts w:ascii="Courier New" w:hAnsi="Courier New" w:cs="Courier New" w:hint="default"/>
+      </w:rPr>
+    </w:lvl>
+    <w:lvl w:ilvl="2" w:tplc="04090005" w:tentative="1">
+      <w:start w:val="1"/>
+      <w:numFmt w:val="bullet"/>
+      <w:lvlText w:val=""/>
+      <w:lvlJc w:val="left"/>
+      <w:pPr>
+        <w:ind w:left="2250" w:hanging="360"/>
+      </w:pPr>
+      <w:rPr>
+        <w:rFonts w:ascii="Wingdings" w:hAnsi="Wingdings" w:hint="default"/>
+      </w:rPr>
+    </w:lvl>
+    <w:lvl w:ilvl="3" w:tplc="04090001" w:tentative="1">
+      <w:start w:val="1"/>
+      <w:numFmt w:val="bullet"/>
+      <w:lvlText w:val=""/>
+      <w:lvlJc w:val="left"/>
+      <w:pPr>
+        <w:ind w:left="2970" w:hanging="360"/>
+      </w:pPr>
+      <w:rPr>
+        <w:rFonts w:ascii="Symbol" w:hAnsi="Symbol" w:hint="default"/>
+      </w:rPr>
+    </w:lvl>
+    <w:lvl w:ilvl="4" w:tplc="04090003" w:tentative="1">
+      <w:start w:val="1"/>
+      <w:numFmt w:val="bullet"/>
+      <w:lvlText w:val="o"/>
+      <w:lvlJc w:val="left"/>
+      <w:pPr>
+        <w:ind w:left="3690" w:hanging="360"/>
+      </w:pPr>
+      <w:rPr>
+        <w:rFonts w:ascii="Courier New" w:hAnsi="Courier New" w:cs="Courier New" w:hint="default"/>
+      </w:rPr>
+    </w:lvl>
+    <w:lvl w:ilvl="5" w:tplc="04090005" w:tentative="1">
+      <w:start w:val="1"/>
+      <w:numFmt w:val="bullet"/>
+      <w:lvlText w:val=""/>
+      <w:lvlJc w:val="left"/>
+      <w:pPr>
+        <w:ind w:left="4410" w:hanging="360"/>
+      </w:pPr>
+      <w:rPr>
+        <w:rFonts w:ascii="Wingdings" w:hAnsi="Wingdings" w:hint="default"/>
+      </w:rPr>
+    </w:lvl>
+    <w:lvl w:ilvl="6" w:tplc="04090001" w:tentative="1">
+      <w:start w:val="1"/>
+      <w:numFmt w:val="bullet"/>
+      <w:lvlText w:val=""/>
+      <w:lvlJc w:val="left"/>
+      <w:pPr>
+        <w:ind w:left="5130" w:hanging="360"/>
+      </w:pPr>
+      <w:rPr>
+        <w:rFonts w:ascii="Symbol" w:hAnsi="Symbol" w:hint="default"/>
+      </w:rPr>
+    </w:lvl>
+    <w:lvl w:ilvl="7" w:tplc="04090003" w:tentative="1">
+      <w:start w:val="1"/>
+      <w:numFmt w:val="bullet"/>
+      <w:lvlText w:val="o"/>
+      <w:lvlJc w:val="left"/>
+      <w:pPr>
+        <w:ind w:left="5850" w:hanging="360"/>
+      </w:pPr>
+      <w:rPr>
+        <w:rFonts w:ascii="Courier New" w:hAnsi="Courier New" w:cs="Courier New" w:hint="default"/>
+      </w:rPr>
+    </w:lvl>
+    <w:lvl w:ilvl="8" w:tplc="04090005" w:tentative="1">
+      <w:start w:val="1"/>
+      <w:numFmt w:val="bullet"/>
+      <w:lvlText w:val=""/>
+      <w:lvlJc w:val="left"/>
+      <w:pPr>
+        <w:ind w:left="6570" w:hanging="360"/>
+      </w:pPr>
+      <w:rPr>
+        <w:rFonts w:ascii="Wingdings" w:hAnsi="Wingdings" w:hint="default"/>
+      </w:rPr>
+    </w:lvl>
+  </w:abstractNum>
+  <w:abstractNum w:abstractNumId="142" w15:restartNumberingAfterBreak="0">
     <w:nsid w:val="6D1511A0"/>
     <w:multiLevelType w:val="hybridMultilevel"/>
     <w:tmpl w:val="AAD8B9B4"/>
@@ -33685,7 +36854,7 @@
       </w:rPr>
     </w:lvl>
   </w:abstractNum>
-  <w:abstractNum w:abstractNumId="140" w15:restartNumberingAfterBreak="0">
+  <w:abstractNum w:abstractNumId="143" w15:restartNumberingAfterBreak="0">
     <w:nsid w:val="6DD255F1"/>
     <w:multiLevelType w:val="hybridMultilevel"/>
     <w:tmpl w:val="ACBC1404"/>
@@ -33798,7 +36967,7 @@
       </w:rPr>
     </w:lvl>
   </w:abstractNum>
-  <w:abstractNum w:abstractNumId="141" w15:restartNumberingAfterBreak="0">
+  <w:abstractNum w:abstractNumId="144" w15:restartNumberingAfterBreak="0">
     <w:nsid w:val="6DDB4404"/>
     <w:multiLevelType w:val="hybridMultilevel"/>
     <w:tmpl w:val="06428E32"/>
@@ -33911,7 +37080,7 @@
       </w:rPr>
     </w:lvl>
   </w:abstractNum>
-  <w:abstractNum w:abstractNumId="142" w15:restartNumberingAfterBreak="0">
+  <w:abstractNum w:abstractNumId="145" w15:restartNumberingAfterBreak="0">
     <w:nsid w:val="6F014B3B"/>
     <w:multiLevelType w:val="hybridMultilevel"/>
     <w:tmpl w:val="C89A39BE"/>
@@ -34023,7 +37192,7 @@
       </w:rPr>
     </w:lvl>
   </w:abstractNum>
-  <w:abstractNum w:abstractNumId="143" w15:restartNumberingAfterBreak="0">
+  <w:abstractNum w:abstractNumId="146" w15:restartNumberingAfterBreak="0">
     <w:nsid w:val="6F171273"/>
     <w:multiLevelType w:val="multilevel"/>
     <w:tmpl w:val="0240C564"/>
@@ -34172,7 +37341,7 @@
       </w:rPr>
     </w:lvl>
   </w:abstractNum>
-  <w:abstractNum w:abstractNumId="144" w15:restartNumberingAfterBreak="0">
+  <w:abstractNum w:abstractNumId="147" w15:restartNumberingAfterBreak="0">
     <w:nsid w:val="6FB82AAA"/>
     <w:multiLevelType w:val="multilevel"/>
     <w:tmpl w:val="FC46C7C0"/>
@@ -34321,7 +37490,7 @@
       </w:rPr>
     </w:lvl>
   </w:abstractNum>
-  <w:abstractNum w:abstractNumId="145" w15:restartNumberingAfterBreak="0">
+  <w:abstractNum w:abstractNumId="148" w15:restartNumberingAfterBreak="0">
     <w:nsid w:val="6FD46DCF"/>
     <w:multiLevelType w:val="hybridMultilevel"/>
     <w:tmpl w:val="EF5E6EC6"/>
@@ -34434,7 +37603,7 @@
       </w:rPr>
     </w:lvl>
   </w:abstractNum>
-  <w:abstractNum w:abstractNumId="146" w15:restartNumberingAfterBreak="0">
+  <w:abstractNum w:abstractNumId="149" w15:restartNumberingAfterBreak="0">
     <w:nsid w:val="6FDE6C2A"/>
     <w:multiLevelType w:val="multilevel"/>
     <w:tmpl w:val="A4BEBC9C"/>
@@ -34583,7 +37752,7 @@
       </w:rPr>
     </w:lvl>
   </w:abstractNum>
-  <w:abstractNum w:abstractNumId="147" w15:restartNumberingAfterBreak="0">
+  <w:abstractNum w:abstractNumId="150" w15:restartNumberingAfterBreak="0">
     <w:nsid w:val="70484E38"/>
     <w:multiLevelType w:val="multilevel"/>
     <w:tmpl w:val="22B26DD2"/>
@@ -34732,7 +37901,7 @@
       </w:rPr>
     </w:lvl>
   </w:abstractNum>
-  <w:abstractNum w:abstractNumId="148" w15:restartNumberingAfterBreak="0">
+  <w:abstractNum w:abstractNumId="151" w15:restartNumberingAfterBreak="0">
     <w:nsid w:val="70CB723E"/>
     <w:multiLevelType w:val="multilevel"/>
     <w:tmpl w:val="63F4E6F0"/>
@@ -34881,7 +38050,7 @@
       </w:rPr>
     </w:lvl>
   </w:abstractNum>
-  <w:abstractNum w:abstractNumId="149" w15:restartNumberingAfterBreak="0">
+  <w:abstractNum w:abstractNumId="152" w15:restartNumberingAfterBreak="0">
     <w:nsid w:val="71DB3F58"/>
     <w:multiLevelType w:val="multilevel"/>
     <w:tmpl w:val="63F4E6F0"/>
@@ -35030,7 +38199,7 @@
       </w:rPr>
     </w:lvl>
   </w:abstractNum>
-  <w:abstractNum w:abstractNumId="150" w15:restartNumberingAfterBreak="0">
+  <w:abstractNum w:abstractNumId="153" w15:restartNumberingAfterBreak="0">
     <w:nsid w:val="72F31FF2"/>
     <w:multiLevelType w:val="hybridMultilevel"/>
     <w:tmpl w:val="5C2693A0"/>
@@ -35142,7 +38311,7 @@
       </w:rPr>
     </w:lvl>
   </w:abstractNum>
-  <w:abstractNum w:abstractNumId="151" w15:restartNumberingAfterBreak="0">
+  <w:abstractNum w:abstractNumId="154" w15:restartNumberingAfterBreak="0">
     <w:nsid w:val="758F4049"/>
     <w:multiLevelType w:val="multilevel"/>
     <w:tmpl w:val="FEB27F32"/>
@@ -35291,7 +38460,7 @@
       </w:rPr>
     </w:lvl>
   </w:abstractNum>
-  <w:abstractNum w:abstractNumId="152" w15:restartNumberingAfterBreak="0">
+  <w:abstractNum w:abstractNumId="155" w15:restartNumberingAfterBreak="0">
     <w:nsid w:val="75B45140"/>
     <w:multiLevelType w:val="hybridMultilevel"/>
     <w:tmpl w:val="93F8F3C4"/>
@@ -35404,7 +38573,7 @@
       </w:rPr>
     </w:lvl>
   </w:abstractNum>
-  <w:abstractNum w:abstractNumId="153" w15:restartNumberingAfterBreak="0">
+  <w:abstractNum w:abstractNumId="156" w15:restartNumberingAfterBreak="0">
     <w:nsid w:val="76F60FFE"/>
     <w:multiLevelType w:val="multilevel"/>
     <w:tmpl w:val="63F4E6F0"/>
@@ -35553,7 +38722,7 @@
       </w:rPr>
     </w:lvl>
   </w:abstractNum>
-  <w:abstractNum w:abstractNumId="154" w15:restartNumberingAfterBreak="0">
+  <w:abstractNum w:abstractNumId="157" w15:restartNumberingAfterBreak="0">
     <w:nsid w:val="77572323"/>
     <w:multiLevelType w:val="multilevel"/>
     <w:tmpl w:val="63F4E6F0"/>
@@ -35702,7 +38871,7 @@
       </w:rPr>
     </w:lvl>
   </w:abstractNum>
-  <w:abstractNum w:abstractNumId="155" w15:restartNumberingAfterBreak="0">
+  <w:abstractNum w:abstractNumId="158" w15:restartNumberingAfterBreak="0">
     <w:nsid w:val="77B8201F"/>
     <w:multiLevelType w:val="hybridMultilevel"/>
     <w:tmpl w:val="D7160708"/>
@@ -35814,7 +38983,7 @@
       </w:rPr>
     </w:lvl>
   </w:abstractNum>
-  <w:abstractNum w:abstractNumId="156" w15:restartNumberingAfterBreak="0">
+  <w:abstractNum w:abstractNumId="159" w15:restartNumberingAfterBreak="0">
     <w:nsid w:val="79796FF9"/>
     <w:multiLevelType w:val="hybridMultilevel"/>
     <w:tmpl w:val="CFA8EF82"/>
@@ -35926,7 +39095,7 @@
       </w:rPr>
     </w:lvl>
   </w:abstractNum>
-  <w:abstractNum w:abstractNumId="157" w15:restartNumberingAfterBreak="0">
+  <w:abstractNum w:abstractNumId="160" w15:restartNumberingAfterBreak="0">
     <w:nsid w:val="79910410"/>
     <w:multiLevelType w:val="hybridMultilevel"/>
     <w:tmpl w:val="FC923542"/>
@@ -36038,7 +39207,7 @@
       </w:rPr>
     </w:lvl>
   </w:abstractNum>
-  <w:abstractNum w:abstractNumId="158" w15:restartNumberingAfterBreak="0">
+  <w:abstractNum w:abstractNumId="161" w15:restartNumberingAfterBreak="0">
     <w:nsid w:val="7A543765"/>
     <w:multiLevelType w:val="multilevel"/>
     <w:tmpl w:val="CD143834"/>
@@ -36187,7 +39356,7 @@
       </w:rPr>
     </w:lvl>
   </w:abstractNum>
-  <w:abstractNum w:abstractNumId="159" w15:restartNumberingAfterBreak="0">
+  <w:abstractNum w:abstractNumId="162" w15:restartNumberingAfterBreak="0">
     <w:nsid w:val="7AFF575A"/>
     <w:multiLevelType w:val="hybridMultilevel"/>
     <w:tmpl w:val="A6323D3E"/>
@@ -36299,7 +39468,7 @@
       </w:rPr>
     </w:lvl>
   </w:abstractNum>
-  <w:abstractNum w:abstractNumId="160" w15:restartNumberingAfterBreak="0">
+  <w:abstractNum w:abstractNumId="163" w15:restartNumberingAfterBreak="0">
     <w:nsid w:val="7B4018BF"/>
     <w:multiLevelType w:val="multilevel"/>
     <w:tmpl w:val="63F4E6F0"/>
@@ -36448,7 +39617,120 @@
       </w:rPr>
     </w:lvl>
   </w:abstractNum>
-  <w:abstractNum w:abstractNumId="161" w15:restartNumberingAfterBreak="0">
+  <w:abstractNum w:abstractNumId="164" w15:restartNumberingAfterBreak="0">
+    <w:nsid w:val="7B41364C"/>
+    <w:multiLevelType w:val="hybridMultilevel"/>
+    <w:tmpl w:val="A6385A14"/>
+    <w:lvl w:ilvl="0" w:tplc="04090001">
+      <w:start w:val="1"/>
+      <w:numFmt w:val="bullet"/>
+      <w:lvlText w:val=""/>
+      <w:lvlJc w:val="left"/>
+      <w:pPr>
+        <w:ind w:left="1080" w:hanging="360"/>
+      </w:pPr>
+      <w:rPr>
+        <w:rFonts w:ascii="Symbol" w:hAnsi="Symbol" w:hint="default"/>
+      </w:rPr>
+    </w:lvl>
+    <w:lvl w:ilvl="1" w:tplc="04090003" w:tentative="1">
+      <w:start w:val="1"/>
+      <w:numFmt w:val="bullet"/>
+      <w:lvlText w:val="o"/>
+      <w:lvlJc w:val="left"/>
+      <w:pPr>
+        <w:ind w:left="1800" w:hanging="360"/>
+      </w:pPr>
+      <w:rPr>
+        <w:rFonts w:ascii="Courier New" w:hAnsi="Courier New" w:cs="Courier New" w:hint="default"/>
+      </w:rPr>
+    </w:lvl>
+    <w:lvl w:ilvl="2" w:tplc="04090005" w:tentative="1">
+      <w:start w:val="1"/>
+      <w:numFmt w:val="bullet"/>
+      <w:lvlText w:val=""/>
+      <w:lvlJc w:val="left"/>
+      <w:pPr>
+        <w:ind w:left="2520" w:hanging="360"/>
+      </w:pPr>
+      <w:rPr>
+        <w:rFonts w:ascii="Wingdings" w:hAnsi="Wingdings" w:hint="default"/>
+      </w:rPr>
+    </w:lvl>
+    <w:lvl w:ilvl="3" w:tplc="04090001" w:tentative="1">
+      <w:start w:val="1"/>
+      <w:numFmt w:val="bullet"/>
+      <w:lvlText w:val=""/>
+      <w:lvlJc w:val="left"/>
+      <w:pPr>
+        <w:ind w:left="3240" w:hanging="360"/>
+      </w:pPr>
+      <w:rPr>
+        <w:rFonts w:ascii="Symbol" w:hAnsi="Symbol" w:hint="default"/>
+      </w:rPr>
+    </w:lvl>
+    <w:lvl w:ilvl="4" w:tplc="04090003" w:tentative="1">
+      <w:start w:val="1"/>
+      <w:numFmt w:val="bullet"/>
+      <w:lvlText w:val="o"/>
+      <w:lvlJc w:val="left"/>
+      <w:pPr>
+        <w:ind w:left="3960" w:hanging="360"/>
+      </w:pPr>
+      <w:rPr>
+        <w:rFonts w:ascii="Courier New" w:hAnsi="Courier New" w:cs="Courier New" w:hint="default"/>
+      </w:rPr>
+    </w:lvl>
+    <w:lvl w:ilvl="5" w:tplc="04090005" w:tentative="1">
+      <w:start w:val="1"/>
+      <w:numFmt w:val="bullet"/>
+      <w:lvlText w:val=""/>
+      <w:lvlJc w:val="left"/>
+      <w:pPr>
+        <w:ind w:left="4680" w:hanging="360"/>
+      </w:pPr>
+      <w:rPr>
+        <w:rFonts w:ascii="Wingdings" w:hAnsi="Wingdings" w:hint="default"/>
+      </w:rPr>
+    </w:lvl>
+    <w:lvl w:ilvl="6" w:tplc="04090001" w:tentative="1">
+      <w:start w:val="1"/>
+      <w:numFmt w:val="bullet"/>
+      <w:lvlText w:val=""/>
+      <w:lvlJc w:val="left"/>
+      <w:pPr>
+        <w:ind w:left="5400" w:hanging="360"/>
+      </w:pPr>
+      <w:rPr>
+        <w:rFonts w:ascii="Symbol" w:hAnsi="Symbol" w:hint="default"/>
+      </w:rPr>
+    </w:lvl>
+    <w:lvl w:ilvl="7" w:tplc="04090003" w:tentative="1">
+      <w:start w:val="1"/>
+      <w:numFmt w:val="bullet"/>
+      <w:lvlText w:val="o"/>
+      <w:lvlJc w:val="left"/>
+      <w:pPr>
+        <w:ind w:left="6120" w:hanging="360"/>
+      </w:pPr>
+      <w:rPr>
+        <w:rFonts w:ascii="Courier New" w:hAnsi="Courier New" w:cs="Courier New" w:hint="default"/>
+      </w:rPr>
+    </w:lvl>
+    <w:lvl w:ilvl="8" w:tplc="04090005" w:tentative="1">
+      <w:start w:val="1"/>
+      <w:numFmt w:val="bullet"/>
+      <w:lvlText w:val=""/>
+      <w:lvlJc w:val="left"/>
+      <w:pPr>
+        <w:ind w:left="6840" w:hanging="360"/>
+      </w:pPr>
+      <w:rPr>
+        <w:rFonts w:ascii="Wingdings" w:hAnsi="Wingdings" w:hint="default"/>
+      </w:rPr>
+    </w:lvl>
+  </w:abstractNum>
+  <w:abstractNum w:abstractNumId="165" w15:restartNumberingAfterBreak="0">
     <w:nsid w:val="7B4D1B33"/>
     <w:multiLevelType w:val="hybridMultilevel"/>
     <w:tmpl w:val="5EAC717E"/>
@@ -36560,7 +39842,120 @@
       </w:rPr>
     </w:lvl>
   </w:abstractNum>
-  <w:abstractNum w:abstractNumId="162" w15:restartNumberingAfterBreak="0">
+  <w:abstractNum w:abstractNumId="166" w15:restartNumberingAfterBreak="0">
+    <w:nsid w:val="7C8A0A2A"/>
+    <w:multiLevelType w:val="hybridMultilevel"/>
+    <w:tmpl w:val="2AAEA8A4"/>
+    <w:lvl w:ilvl="0" w:tplc="04090005">
+      <w:start w:val="1"/>
+      <w:numFmt w:val="bullet"/>
+      <w:lvlText w:val=""/>
+      <w:lvlJc w:val="left"/>
+      <w:pPr>
+        <w:ind w:left="810" w:hanging="360"/>
+      </w:pPr>
+      <w:rPr>
+        <w:rFonts w:ascii="Wingdings" w:hAnsi="Wingdings" w:hint="default"/>
+      </w:rPr>
+    </w:lvl>
+    <w:lvl w:ilvl="1" w:tplc="FFFFFFFF" w:tentative="1">
+      <w:start w:val="1"/>
+      <w:numFmt w:val="bullet"/>
+      <w:lvlText w:val="o"/>
+      <w:lvlJc w:val="left"/>
+      <w:pPr>
+        <w:ind w:left="1530" w:hanging="360"/>
+      </w:pPr>
+      <w:rPr>
+        <w:rFonts w:ascii="Courier New" w:hAnsi="Courier New" w:cs="Courier New" w:hint="default"/>
+      </w:rPr>
+    </w:lvl>
+    <w:lvl w:ilvl="2" w:tplc="FFFFFFFF" w:tentative="1">
+      <w:start w:val="1"/>
+      <w:numFmt w:val="bullet"/>
+      <w:lvlText w:val=""/>
+      <w:lvlJc w:val="left"/>
+      <w:pPr>
+        <w:ind w:left="2250" w:hanging="360"/>
+      </w:pPr>
+      <w:rPr>
+        <w:rFonts w:ascii="Wingdings" w:hAnsi="Wingdings" w:hint="default"/>
+      </w:rPr>
+    </w:lvl>
+    <w:lvl w:ilvl="3" w:tplc="FFFFFFFF" w:tentative="1">
+      <w:start w:val="1"/>
+      <w:numFmt w:val="bullet"/>
+      <w:lvlText w:val=""/>
+      <w:lvlJc w:val="left"/>
+      <w:pPr>
+        <w:ind w:left="2970" w:hanging="360"/>
+      </w:pPr>
+      <w:rPr>
+        <w:rFonts w:ascii="Symbol" w:hAnsi="Symbol" w:hint="default"/>
+      </w:rPr>
+    </w:lvl>
+    <w:lvl w:ilvl="4" w:tplc="FFFFFFFF" w:tentative="1">
+      <w:start w:val="1"/>
+      <w:numFmt w:val="bullet"/>
+      <w:lvlText w:val="o"/>
+      <w:lvlJc w:val="left"/>
+      <w:pPr>
+        <w:ind w:left="3690" w:hanging="360"/>
+      </w:pPr>
+      <w:rPr>
+        <w:rFonts w:ascii="Courier New" w:hAnsi="Courier New" w:cs="Courier New" w:hint="default"/>
+      </w:rPr>
+    </w:lvl>
+    <w:lvl w:ilvl="5" w:tplc="FFFFFFFF" w:tentative="1">
+      <w:start w:val="1"/>
+      <w:numFmt w:val="bullet"/>
+      <w:lvlText w:val=""/>
+      <w:lvlJc w:val="left"/>
+      <w:pPr>
+        <w:ind w:left="4410" w:hanging="360"/>
+      </w:pPr>
+      <w:rPr>
+        <w:rFonts w:ascii="Wingdings" w:hAnsi="Wingdings" w:hint="default"/>
+      </w:rPr>
+    </w:lvl>
+    <w:lvl w:ilvl="6" w:tplc="FFFFFFFF" w:tentative="1">
+      <w:start w:val="1"/>
+      <w:numFmt w:val="bullet"/>
+      <w:lvlText w:val=""/>
+      <w:lvlJc w:val="left"/>
+      <w:pPr>
+        <w:ind w:left="5130" w:hanging="360"/>
+      </w:pPr>
+      <w:rPr>
+        <w:rFonts w:ascii="Symbol" w:hAnsi="Symbol" w:hint="default"/>
+      </w:rPr>
+    </w:lvl>
+    <w:lvl w:ilvl="7" w:tplc="FFFFFFFF" w:tentative="1">
+      <w:start w:val="1"/>
+      <w:numFmt w:val="bullet"/>
+      <w:lvlText w:val="o"/>
+      <w:lvlJc w:val="left"/>
+      <w:pPr>
+        <w:ind w:left="5850" w:hanging="360"/>
+      </w:pPr>
+      <w:rPr>
+        <w:rFonts w:ascii="Courier New" w:hAnsi="Courier New" w:cs="Courier New" w:hint="default"/>
+      </w:rPr>
+    </w:lvl>
+    <w:lvl w:ilvl="8" w:tplc="FFFFFFFF" w:tentative="1">
+      <w:start w:val="1"/>
+      <w:numFmt w:val="bullet"/>
+      <w:lvlText w:val=""/>
+      <w:lvlJc w:val="left"/>
+      <w:pPr>
+        <w:ind w:left="6570" w:hanging="360"/>
+      </w:pPr>
+      <w:rPr>
+        <w:rFonts w:ascii="Wingdings" w:hAnsi="Wingdings" w:hint="default"/>
+      </w:rPr>
+    </w:lvl>
+  </w:abstractNum>
+  <w:abstractNum w:abstractNumId="167" w15:restartNumberingAfterBreak="0">
     <w:nsid w:val="7CAC27CD"/>
     <w:multiLevelType w:val="multilevel"/>
     <w:tmpl w:val="3BC20E58"/>
@@ -36709,7 +40104,7 @@
       </w:rPr>
     </w:lvl>
   </w:abstractNum>
-  <w:abstractNum w:abstractNumId="163" w15:restartNumberingAfterBreak="0">
+  <w:abstractNum w:abstractNumId="168" w15:restartNumberingAfterBreak="0">
     <w:nsid w:val="7E5978EA"/>
     <w:multiLevelType w:val="hybridMultilevel"/>
     <w:tmpl w:val="D74C0DB0"/>
@@ -36821,7 +40216,7 @@
       </w:rPr>
     </w:lvl>
   </w:abstractNum>
-  <w:abstractNum w:abstractNumId="164" w15:restartNumberingAfterBreak="0">
+  <w:abstractNum w:abstractNumId="169" w15:restartNumberingAfterBreak="0">
     <w:nsid w:val="7E94385D"/>
     <w:multiLevelType w:val="multilevel"/>
     <w:tmpl w:val="02F01B00"/>
@@ -36970,7 +40365,7 @@
       </w:rPr>
     </w:lvl>
   </w:abstractNum>
-  <w:abstractNum w:abstractNumId="165" w15:restartNumberingAfterBreak="0">
+  <w:abstractNum w:abstractNumId="170" w15:restartNumberingAfterBreak="0">
     <w:nsid w:val="7F106A5D"/>
     <w:multiLevelType w:val="hybridMultilevel"/>
     <w:tmpl w:val="A1CA4816"/>
@@ -37083,7 +40478,7 @@
     </w:lvl>
   </w:abstractNum>
   <w:num w:numId="1" w16cid:durableId="1882476756">
-    <w:abstractNumId w:val="96"/>
+    <w:abstractNumId w:val="97"/>
   </w:num>
   <w:num w:numId="2" w16cid:durableId="871453468">
     <w:abstractNumId w:val="27"/>
@@ -37092,73 +40487,73 @@
     <w:abstractNumId w:val="41"/>
   </w:num>
   <w:num w:numId="4" w16cid:durableId="1105467722">
-    <w:abstractNumId w:val="79"/>
+    <w:abstractNumId w:val="80"/>
   </w:num>
   <w:num w:numId="5" w16cid:durableId="769932622">
-    <w:abstractNumId w:val="111"/>
+    <w:abstractNumId w:val="113"/>
   </w:num>
   <w:num w:numId="6" w16cid:durableId="575944109">
     <w:abstractNumId w:val="44"/>
   </w:num>
   <w:num w:numId="7" w16cid:durableId="877661689">
-    <w:abstractNumId w:val="147"/>
+    <w:abstractNumId w:val="150"/>
   </w:num>
   <w:num w:numId="8" w16cid:durableId="1390107422">
-    <w:abstractNumId w:val="85"/>
+    <w:abstractNumId w:val="86"/>
   </w:num>
   <w:num w:numId="9" w16cid:durableId="881866424">
-    <w:abstractNumId w:val="108"/>
+    <w:abstractNumId w:val="110"/>
   </w:num>
   <w:num w:numId="10" w16cid:durableId="1037244995">
-    <w:abstractNumId w:val="136"/>
+    <w:abstractNumId w:val="138"/>
   </w:num>
   <w:num w:numId="11" w16cid:durableId="1575554597">
-    <w:abstractNumId w:val="68"/>
+    <w:abstractNumId w:val="69"/>
   </w:num>
   <w:num w:numId="12" w16cid:durableId="915364478">
-    <w:abstractNumId w:val="92"/>
+    <w:abstractNumId w:val="93"/>
   </w:num>
   <w:num w:numId="13" w16cid:durableId="1386294114">
-    <w:abstractNumId w:val="127"/>
+    <w:abstractNumId w:val="129"/>
   </w:num>
   <w:num w:numId="14" w16cid:durableId="1071851223">
     <w:abstractNumId w:val="28"/>
   </w:num>
   <w:num w:numId="15" w16cid:durableId="1545557520">
-    <w:abstractNumId w:val="80"/>
+    <w:abstractNumId w:val="81"/>
   </w:num>
   <w:num w:numId="16" w16cid:durableId="1102919547">
-    <w:abstractNumId w:val="162"/>
+    <w:abstractNumId w:val="167"/>
   </w:num>
   <w:num w:numId="17" w16cid:durableId="294526838">
     <w:abstractNumId w:val="56"/>
   </w:num>
   <w:num w:numId="18" w16cid:durableId="679889896">
-    <w:abstractNumId w:val="65"/>
+    <w:abstractNumId w:val="66"/>
   </w:num>
   <w:num w:numId="19" w16cid:durableId="2119449470">
-    <w:abstractNumId w:val="104"/>
+    <w:abstractNumId w:val="106"/>
   </w:num>
   <w:num w:numId="20" w16cid:durableId="1365054799">
     <w:abstractNumId w:val="16"/>
   </w:num>
   <w:num w:numId="21" w16cid:durableId="1683512738">
-    <w:abstractNumId w:val="66"/>
+    <w:abstractNumId w:val="67"/>
   </w:num>
   <w:num w:numId="22" w16cid:durableId="1080098953">
-    <w:abstractNumId w:val="133"/>
+    <w:abstractNumId w:val="135"/>
   </w:num>
   <w:num w:numId="23" w16cid:durableId="1635717296">
-    <w:abstractNumId w:val="72"/>
+    <w:abstractNumId w:val="73"/>
   </w:num>
   <w:num w:numId="24" w16cid:durableId="544873123">
-    <w:abstractNumId w:val="126"/>
+    <w:abstractNumId w:val="128"/>
   </w:num>
   <w:num w:numId="25" w16cid:durableId="1128352778">
     <w:abstractNumId w:val="15"/>
   </w:num>
   <w:num w:numId="26" w16cid:durableId="1732537407">
-    <w:abstractNumId w:val="141"/>
+    <w:abstractNumId w:val="144"/>
   </w:num>
   <w:num w:numId="27" w16cid:durableId="945502064">
     <w:abstractNumId w:val="8"/>
@@ -37167,10 +40562,10 @@
     <w:abstractNumId w:val="5"/>
   </w:num>
   <w:num w:numId="29" w16cid:durableId="815955639">
-    <w:abstractNumId w:val="64"/>
+    <w:abstractNumId w:val="65"/>
   </w:num>
   <w:num w:numId="30" w16cid:durableId="1500659483">
-    <w:abstractNumId w:val="89"/>
+    <w:abstractNumId w:val="90"/>
   </w:num>
   <w:num w:numId="31" w16cid:durableId="118301211">
     <w:abstractNumId w:val="18"/>
@@ -37185,43 +40580,43 @@
     <w:abstractNumId w:val="51"/>
   </w:num>
   <w:num w:numId="35" w16cid:durableId="356852923">
-    <w:abstractNumId w:val="103"/>
+    <w:abstractNumId w:val="105"/>
   </w:num>
   <w:num w:numId="36" w16cid:durableId="430662559">
     <w:abstractNumId w:val="23"/>
   </w:num>
   <w:num w:numId="37" w16cid:durableId="247080868">
-    <w:abstractNumId w:val="152"/>
+    <w:abstractNumId w:val="155"/>
   </w:num>
   <w:num w:numId="38" w16cid:durableId="158887408">
-    <w:abstractNumId w:val="124"/>
+    <w:abstractNumId w:val="126"/>
   </w:num>
   <w:num w:numId="39" w16cid:durableId="1681347932">
-    <w:abstractNumId w:val="145"/>
+    <w:abstractNumId w:val="148"/>
   </w:num>
   <w:num w:numId="40" w16cid:durableId="2101440158">
-    <w:abstractNumId w:val="83"/>
+    <w:abstractNumId w:val="84"/>
   </w:num>
   <w:num w:numId="41" w16cid:durableId="1250391122">
-    <w:abstractNumId w:val="119"/>
+    <w:abstractNumId w:val="121"/>
   </w:num>
   <w:num w:numId="42" w16cid:durableId="479083359">
-    <w:abstractNumId w:val="150"/>
+    <w:abstractNumId w:val="153"/>
   </w:num>
   <w:num w:numId="43" w16cid:durableId="1557860317">
-    <w:abstractNumId w:val="105"/>
+    <w:abstractNumId w:val="107"/>
   </w:num>
   <w:num w:numId="44" w16cid:durableId="2142183763">
     <w:abstractNumId w:val="10"/>
   </w:num>
   <w:num w:numId="45" w16cid:durableId="1357736349">
-    <w:abstractNumId w:val="157"/>
+    <w:abstractNumId w:val="160"/>
   </w:num>
   <w:num w:numId="46" w16cid:durableId="1519656040">
-    <w:abstractNumId w:val="156"/>
+    <w:abstractNumId w:val="159"/>
   </w:num>
   <w:num w:numId="47" w16cid:durableId="1078596852">
-    <w:abstractNumId w:val="165"/>
+    <w:abstractNumId w:val="170"/>
   </w:num>
   <w:num w:numId="48" w16cid:durableId="1027950100">
     <w:abstractNumId w:val="38"/>
@@ -37230,22 +40625,22 @@
     <w:abstractNumId w:val="22"/>
   </w:num>
   <w:num w:numId="50" w16cid:durableId="363404927">
-    <w:abstractNumId w:val="73"/>
+    <w:abstractNumId w:val="74"/>
   </w:num>
   <w:num w:numId="51" w16cid:durableId="1128354320">
-    <w:abstractNumId w:val="139"/>
+    <w:abstractNumId w:val="142"/>
   </w:num>
   <w:num w:numId="52" w16cid:durableId="248543928">
-    <w:abstractNumId w:val="82"/>
+    <w:abstractNumId w:val="83"/>
   </w:num>
   <w:num w:numId="53" w16cid:durableId="965889214">
-    <w:abstractNumId w:val="109"/>
+    <w:abstractNumId w:val="111"/>
   </w:num>
   <w:num w:numId="54" w16cid:durableId="1827503240">
-    <w:abstractNumId w:val="117"/>
+    <w:abstractNumId w:val="119"/>
   </w:num>
   <w:num w:numId="55" w16cid:durableId="505748256">
-    <w:abstractNumId w:val="100"/>
+    <w:abstractNumId w:val="102"/>
   </w:num>
   <w:num w:numId="56" w16cid:durableId="2120370925">
     <w:abstractNumId w:val="35"/>
@@ -37254,52 +40649,52 @@
     <w:abstractNumId w:val="19"/>
   </w:num>
   <w:num w:numId="58" w16cid:durableId="1000235123">
-    <w:abstractNumId w:val="107"/>
+    <w:abstractNumId w:val="109"/>
   </w:num>
   <w:num w:numId="59" w16cid:durableId="628516409">
-    <w:abstractNumId w:val="138"/>
+    <w:abstractNumId w:val="140"/>
   </w:num>
   <w:num w:numId="60" w16cid:durableId="2028865444">
-    <w:abstractNumId w:val="98"/>
+    <w:abstractNumId w:val="99"/>
   </w:num>
   <w:num w:numId="61" w16cid:durableId="943926811">
-    <w:abstractNumId w:val="161"/>
+    <w:abstractNumId w:val="165"/>
   </w:num>
   <w:num w:numId="62" w16cid:durableId="1841193257">
-    <w:abstractNumId w:val="76"/>
+    <w:abstractNumId w:val="77"/>
   </w:num>
   <w:num w:numId="63" w16cid:durableId="682322850">
-    <w:abstractNumId w:val="142"/>
+    <w:abstractNumId w:val="145"/>
   </w:num>
   <w:num w:numId="64" w16cid:durableId="2043705333">
-    <w:abstractNumId w:val="77"/>
+    <w:abstractNumId w:val="78"/>
   </w:num>
   <w:num w:numId="65" w16cid:durableId="1164854761">
     <w:abstractNumId w:val="55"/>
   </w:num>
   <w:num w:numId="66" w16cid:durableId="1919972541">
-    <w:abstractNumId w:val="94"/>
+    <w:abstractNumId w:val="95"/>
   </w:num>
   <w:num w:numId="67" w16cid:durableId="463617329">
     <w:abstractNumId w:val="60"/>
   </w:num>
   <w:num w:numId="68" w16cid:durableId="2064014330">
-    <w:abstractNumId w:val="113"/>
+    <w:abstractNumId w:val="115"/>
   </w:num>
   <w:num w:numId="69" w16cid:durableId="452797354">
-    <w:abstractNumId w:val="118"/>
+    <w:abstractNumId w:val="120"/>
   </w:num>
   <w:num w:numId="70" w16cid:durableId="1196650037">
     <w:abstractNumId w:val="49"/>
   </w:num>
   <w:num w:numId="71" w16cid:durableId="940071828">
-    <w:abstractNumId w:val="155"/>
+    <w:abstractNumId w:val="158"/>
   </w:num>
   <w:num w:numId="72" w16cid:durableId="1608273926">
-    <w:abstractNumId w:val="78"/>
+    <w:abstractNumId w:val="79"/>
   </w:num>
   <w:num w:numId="73" w16cid:durableId="2009864772">
-    <w:abstractNumId w:val="95"/>
+    <w:abstractNumId w:val="96"/>
   </w:num>
   <w:num w:numId="74" w16cid:durableId="712267004">
     <w:abstractNumId w:val="37"/>
@@ -37308,10 +40703,10 @@
     <w:abstractNumId w:val="33"/>
   </w:num>
   <w:num w:numId="76" w16cid:durableId="286202349">
-    <w:abstractNumId w:val="123"/>
+    <w:abstractNumId w:val="125"/>
   </w:num>
   <w:num w:numId="77" w16cid:durableId="156460757">
-    <w:abstractNumId w:val="69"/>
+    <w:abstractNumId w:val="70"/>
   </w:num>
   <w:num w:numId="78" w16cid:durableId="1230077056">
     <w:abstractNumId w:val="7"/>
@@ -37323,7 +40718,7 @@
     <w:abstractNumId w:val="36"/>
   </w:num>
   <w:num w:numId="81" w16cid:durableId="1672175260">
-    <w:abstractNumId w:val="90"/>
+    <w:abstractNumId w:val="91"/>
   </w:num>
   <w:num w:numId="82" w16cid:durableId="1954820163">
     <w:abstractNumId w:val="59"/>
@@ -37332,7 +40727,7 @@
     <w:abstractNumId w:val="25"/>
   </w:num>
   <w:num w:numId="84" w16cid:durableId="366876741">
-    <w:abstractNumId w:val="97"/>
+    <w:abstractNumId w:val="98"/>
   </w:num>
   <w:num w:numId="85" w16cid:durableId="15274915">
     <w:abstractNumId w:val="39"/>
@@ -37341,22 +40736,22 @@
     <w:abstractNumId w:val="12"/>
   </w:num>
   <w:num w:numId="87" w16cid:durableId="591351385">
-    <w:abstractNumId w:val="110"/>
+    <w:abstractNumId w:val="112"/>
   </w:num>
   <w:num w:numId="88" w16cid:durableId="1361005725">
-    <w:abstractNumId w:val="159"/>
+    <w:abstractNumId w:val="162"/>
   </w:num>
   <w:num w:numId="89" w16cid:durableId="219681743">
     <w:abstractNumId w:val="13"/>
   </w:num>
   <w:num w:numId="90" w16cid:durableId="194386594">
-    <w:abstractNumId w:val="120"/>
+    <w:abstractNumId w:val="122"/>
   </w:num>
   <w:num w:numId="91" w16cid:durableId="777793346">
-    <w:abstractNumId w:val="87"/>
+    <w:abstractNumId w:val="88"/>
   </w:num>
   <w:num w:numId="92" w16cid:durableId="173346871">
-    <w:abstractNumId w:val="93"/>
+    <w:abstractNumId w:val="94"/>
   </w:num>
   <w:num w:numId="93" w16cid:durableId="948700467">
     <w:abstractNumId w:val="40"/>
@@ -37365,10 +40760,10 @@
     <w:abstractNumId w:val="24"/>
   </w:num>
   <w:num w:numId="95" w16cid:durableId="541676570">
-    <w:abstractNumId w:val="70"/>
+    <w:abstractNumId w:val="71"/>
   </w:num>
   <w:num w:numId="96" w16cid:durableId="694119229">
-    <w:abstractNumId w:val="91"/>
+    <w:abstractNumId w:val="92"/>
   </w:num>
   <w:num w:numId="97" w16cid:durableId="704327987">
     <w:abstractNumId w:val="53"/>
@@ -37377,28 +40772,28 @@
     <w:abstractNumId w:val="26"/>
   </w:num>
   <w:num w:numId="99" w16cid:durableId="1706099794">
-    <w:abstractNumId w:val="144"/>
+    <w:abstractNumId w:val="147"/>
   </w:num>
   <w:num w:numId="100" w16cid:durableId="256404901">
-    <w:abstractNumId w:val="143"/>
+    <w:abstractNumId w:val="146"/>
   </w:num>
   <w:num w:numId="101" w16cid:durableId="924923012">
     <w:abstractNumId w:val="31"/>
   </w:num>
   <w:num w:numId="102" w16cid:durableId="536550966">
-    <w:abstractNumId w:val="160"/>
+    <w:abstractNumId w:val="163"/>
   </w:num>
   <w:num w:numId="103" w16cid:durableId="425157302">
-    <w:abstractNumId w:val="71"/>
+    <w:abstractNumId w:val="72"/>
   </w:num>
   <w:num w:numId="104" w16cid:durableId="967664612">
-    <w:abstractNumId w:val="129"/>
+    <w:abstractNumId w:val="131"/>
   </w:num>
   <w:num w:numId="105" w16cid:durableId="361631616">
-    <w:abstractNumId w:val="99"/>
+    <w:abstractNumId w:val="100"/>
   </w:num>
   <w:num w:numId="106" w16cid:durableId="443623616">
-    <w:abstractNumId w:val="134"/>
+    <w:abstractNumId w:val="136"/>
   </w:num>
   <w:num w:numId="107" w16cid:durableId="150101619">
     <w:abstractNumId w:val="14"/>
@@ -37410,28 +40805,28 @@
     <w:abstractNumId w:val="0"/>
   </w:num>
   <w:num w:numId="110" w16cid:durableId="712924661">
-    <w:abstractNumId w:val="116"/>
+    <w:abstractNumId w:val="118"/>
   </w:num>
   <w:num w:numId="111" w16cid:durableId="1917784113">
-    <w:abstractNumId w:val="112"/>
+    <w:abstractNumId w:val="114"/>
   </w:num>
   <w:num w:numId="112" w16cid:durableId="896237065">
-    <w:abstractNumId w:val="121"/>
+    <w:abstractNumId w:val="123"/>
   </w:num>
   <w:num w:numId="113" w16cid:durableId="1171681430">
-    <w:abstractNumId w:val="148"/>
+    <w:abstractNumId w:val="151"/>
   </w:num>
   <w:num w:numId="114" w16cid:durableId="1552573199">
-    <w:abstractNumId w:val="149"/>
+    <w:abstractNumId w:val="152"/>
   </w:num>
   <w:num w:numId="115" w16cid:durableId="1920869674">
-    <w:abstractNumId w:val="131"/>
+    <w:abstractNumId w:val="133"/>
   </w:num>
   <w:num w:numId="116" w16cid:durableId="476724716">
-    <w:abstractNumId w:val="102"/>
+    <w:abstractNumId w:val="104"/>
   </w:num>
   <w:num w:numId="117" w16cid:durableId="658919541">
-    <w:abstractNumId w:val="101"/>
+    <w:abstractNumId w:val="103"/>
   </w:num>
   <w:num w:numId="118" w16cid:durableId="1622418131">
     <w:abstractNumId w:val="46"/>
@@ -37440,19 +40835,19 @@
     <w:abstractNumId w:val="4"/>
   </w:num>
   <w:num w:numId="120" w16cid:durableId="396828229">
-    <w:abstractNumId w:val="154"/>
+    <w:abstractNumId w:val="157"/>
   </w:num>
   <w:num w:numId="121" w16cid:durableId="986058889">
     <w:abstractNumId w:val="21"/>
   </w:num>
   <w:num w:numId="122" w16cid:durableId="1224410703">
-    <w:abstractNumId w:val="63"/>
+    <w:abstractNumId w:val="64"/>
   </w:num>
   <w:num w:numId="123" w16cid:durableId="1804040304">
-    <w:abstractNumId w:val="86"/>
+    <w:abstractNumId w:val="87"/>
   </w:num>
   <w:num w:numId="124" w16cid:durableId="114181197">
-    <w:abstractNumId w:val="153"/>
+    <w:abstractNumId w:val="156"/>
   </w:num>
   <w:num w:numId="125" w16cid:durableId="772671624">
     <w:abstractNumId w:val="6"/>
@@ -37470,16 +40865,16 @@
     <w:abstractNumId w:val="62"/>
   </w:num>
   <w:num w:numId="130" w16cid:durableId="1168907903">
-    <w:abstractNumId w:val="135"/>
+    <w:abstractNumId w:val="137"/>
   </w:num>
   <w:num w:numId="131" w16cid:durableId="430206235">
-    <w:abstractNumId w:val="125"/>
+    <w:abstractNumId w:val="127"/>
   </w:num>
   <w:num w:numId="132" w16cid:durableId="1207327089">
     <w:abstractNumId w:val="29"/>
   </w:num>
   <w:num w:numId="133" w16cid:durableId="596404292">
-    <w:abstractNumId w:val="114"/>
+    <w:abstractNumId w:val="116"/>
   </w:num>
   <w:num w:numId="134" w16cid:durableId="2070372549">
     <w:abstractNumId w:val="43"/>
@@ -37491,28 +40886,28 @@
     <w:abstractNumId w:val="42"/>
   </w:num>
   <w:num w:numId="137" w16cid:durableId="1218275126">
-    <w:abstractNumId w:val="74"/>
+    <w:abstractNumId w:val="75"/>
   </w:num>
   <w:num w:numId="138" w16cid:durableId="568660900">
-    <w:abstractNumId w:val="81"/>
+    <w:abstractNumId w:val="82"/>
   </w:num>
   <w:num w:numId="139" w16cid:durableId="967976864">
-    <w:abstractNumId w:val="115"/>
+    <w:abstractNumId w:val="117"/>
   </w:num>
   <w:num w:numId="140" w16cid:durableId="650643288">
+    <w:abstractNumId w:val="132"/>
+  </w:num>
+  <w:num w:numId="141" w16cid:durableId="219370247">
     <w:abstractNumId w:val="130"/>
   </w:num>
-  <w:num w:numId="141" w16cid:durableId="219370247">
-    <w:abstractNumId w:val="128"/>
-  </w:num>
   <w:num w:numId="142" w16cid:durableId="323239876">
-    <w:abstractNumId w:val="163"/>
+    <w:abstractNumId w:val="168"/>
   </w:num>
   <w:num w:numId="143" w16cid:durableId="1619793156">
     <w:abstractNumId w:val="34"/>
   </w:num>
   <w:num w:numId="144" w16cid:durableId="1186332867">
-    <w:abstractNumId w:val="140"/>
+    <w:abstractNumId w:val="143"/>
   </w:num>
   <w:num w:numId="145" w16cid:durableId="89937035">
     <w:abstractNumId w:val="54"/>
@@ -37521,7 +40916,7 @@
     <w:abstractNumId w:val="2"/>
   </w:num>
   <w:num w:numId="147" w16cid:durableId="864370856">
-    <w:abstractNumId w:val="84"/>
+    <w:abstractNumId w:val="85"/>
   </w:num>
   <w:num w:numId="148" w16cid:durableId="939608849">
     <w:abstractNumId w:val="3"/>
@@ -37530,55 +40925,70 @@
     <w:abstractNumId w:val="17"/>
   </w:num>
   <w:num w:numId="150" w16cid:durableId="1090004801">
-    <w:abstractNumId w:val="88"/>
+    <w:abstractNumId w:val="89"/>
   </w:num>
   <w:num w:numId="151" w16cid:durableId="1414087550">
     <w:abstractNumId w:val="61"/>
   </w:num>
   <w:num w:numId="152" w16cid:durableId="366570778">
-    <w:abstractNumId w:val="151"/>
+    <w:abstractNumId w:val="154"/>
   </w:num>
   <w:num w:numId="153" w16cid:durableId="1906184224">
-    <w:abstractNumId w:val="122"/>
+    <w:abstractNumId w:val="124"/>
   </w:num>
   <w:num w:numId="154" w16cid:durableId="1642348878">
-    <w:abstractNumId w:val="132"/>
+    <w:abstractNumId w:val="134"/>
   </w:num>
   <w:num w:numId="155" w16cid:durableId="1843541058">
     <w:abstractNumId w:val="11"/>
   </w:num>
   <w:num w:numId="156" w16cid:durableId="167868443">
-    <w:abstractNumId w:val="164"/>
+    <w:abstractNumId w:val="169"/>
   </w:num>
   <w:num w:numId="157" w16cid:durableId="387999141">
-    <w:abstractNumId w:val="146"/>
+    <w:abstractNumId w:val="149"/>
   </w:num>
   <w:num w:numId="158" w16cid:durableId="1357195449">
     <w:abstractNumId w:val="50"/>
   </w:num>
   <w:num w:numId="159" w16cid:durableId="1514228641">
-    <w:abstractNumId w:val="158"/>
+    <w:abstractNumId w:val="161"/>
   </w:num>
   <w:num w:numId="160" w16cid:durableId="2043549187">
     <w:abstractNumId w:val="58"/>
   </w:num>
   <w:num w:numId="161" w16cid:durableId="1054545887">
-    <w:abstractNumId w:val="106"/>
+    <w:abstractNumId w:val="108"/>
   </w:num>
   <w:num w:numId="162" w16cid:durableId="8140075">
-    <w:abstractNumId w:val="137"/>
+    <w:abstractNumId w:val="139"/>
   </w:num>
   <w:num w:numId="163" w16cid:durableId="1797868849">
     <w:abstractNumId w:val="30"/>
   </w:num>
   <w:num w:numId="164" w16cid:durableId="1646817552">
-    <w:abstractNumId w:val="67"/>
+    <w:abstractNumId w:val="68"/>
   </w:num>
   <w:num w:numId="165" w16cid:durableId="1819759365">
-    <w:abstractNumId w:val="75"/>
+    <w:abstractNumId w:val="76"/>
   </w:num>
   <w:num w:numId="166" w16cid:durableId="788085786">
     <w:abstractNumId w:val="1"/>
+  </w:num>
+  <w:num w:numId="167" w16cid:durableId="139007736">
+    <w:abstractNumId w:val="63"/>
+  </w:num>
+  <w:num w:numId="168" w16cid:durableId="1106316643">
+    <w:abstractNumId w:val="101"/>
+  </w:num>
+  <w:num w:numId="169" w16cid:durableId="396438159">
+    <w:abstractNumId w:val="164"/>
+  </w:num>
+  <w:num w:numId="170" w16cid:durableId="824931713">
+    <w:abstractNumId w:val="166"/>
+  </w:num>
+  <w:num w:numId="171" w16cid:durableId="1830705377">
+    <w:abstractNumId w:val="141"/>
   </w:num>
 </w:numbering>
 </file>

</xml_diff>